<commit_message>
Rewrite extended paper, add assistant accuracy results, extend site
- Extended paper rewritten in plainer, more specific prose with the project's actual design decisions;
  captions, table titles and method text reworded; RQ5 assistant accuracy section added (10 pages).
  The original draft paper is unchanged.
- Assistant test run: generative path 25/26 answerable correct, 8/8 out-of-scope questions declined,
  no unsupported numbers; retrieval fallback 18/26 and 7/8. Hand-review notes stored with the results.
- Site: new How it works page with a worked attribution example and the architecture diagram;
  Research gains channel hand-off and conversion-rate charts, a weekend note and an Assistant
  accuracy tab; Paper page offers the full paper and the short draft; RQ5 marked answered.

Co-Authored-By: Claude Opus 5.5 <noreply@anthropic.com>
</commit_message>
<xml_diff>
--- a/paper/ChannelTrace_Paper_Extended.docx
+++ b/paper/ChannelTrace_Paper_Extended.docx
@@ -464,7 +464,7 @@
           <w:smallCaps w:val="0"/>
           <w:sz w:val="18"/>
         </w:rPr>
-        <w:t>Customers usually interact with several digital channels before buying, yet most businesses judge channels by last-click reports. We study multi-channel attribution and conversion using four public datasets, a known-answer simulation. In 16.5 million Criteo display impressions, only 54.2% of 435,810 conversions that followed a Criteo click were credited to Criteo under the advertiser's last-click rule. Credit was driven by recency: it fell from 87% when the purchase came within an hour of the click to 26% after 7 to 31 days (logistic odds ratio 0.61 per unit of log hours), while additional clicks barely mattered (odds ratio 1.04). In 10,022 real Google Analytics 360 journeys, 52% of buyers returned over several sessions but only 12% used more than one channel; within those, first and last touch disagreed sharply (Direct 42% against 1% of the credit). In 12,205 e-commerce sessions, new visitors converted at 24.9% against 14.1% for returning visitors, and early-session behaviour predicted purchase with ROC-AUC 0.78. A simulation with known channel effects showed that no attribution model is best everywhere: last touch was most accurate when advertising acts immediately (4.2 percentage points mean error) and time decay when it acts with carry-over (5.7 points), while first touch was worst in both. We release ChannelTrace, a free tool that applies seven attribution models to a business's own Google Ads, Meta Ads or journey data and explains the results through a grounded AI assistant.</w:t>
+        <w:t>Most small businesses decide which marketing channel is working by reading last-click reports, even though their customers often see several channels before buying. We tested how much that habit distorts the picture, using four public datasets, a simulation in which the right answer is known and a question-answering test of our own assistant. In 16.5 million Criteo display impressions, Criteo was credited with only 54.2% of the 435,810 conversions that came after one of its clicks. The deciding factor was time: a purchase made within an hour of the click was credited 87% of the time, one made 7 to 31 days later 26% (odds ratio 0.61 per unit of log hours), and extra clicks made almost no difference (odds ratio 1.04). Across 10,022 Google Analytics 360 purchase journeys, 52% took more than one visit but only 12% used more than one channel, and in those journeys first and last touch told opposite stories (Direct received 42% of the credit under one and 1% under the other). In 12,205 store sessions, new visitors bought more often than returning ones (24.9% against 14.1%), and browsing behaviour alone predicted a purchase with ROC-AUC 0.78. In the simulation, last touch was the most accurate model when ads work straight away (4.2 percentage points mean error) and time decay when their effect builds up over later visits (5.7 points); first touch was the worst in both cases. The methods are packaged in ChannelTrace, a free web tool that runs seven attribution models on a business's own Google Ads, Meta Ads or journey export. Its assistant answered 25 of 26 test questions correctly and turned down 8 of 8 that the data could not answer.</w:t>
       </w:r>
     </w:p>
     <w:p>
@@ -534,7 +534,7 @@
           <w:smallCaps w:val="0"/>
           <w:sz w:val="20"/>
         </w:rPr>
-        <w:t>A typical online purchase is preceded by several touchpoints: a social media advertisement, a search, an email, a direct return visit. The customer journey has replaced the linear purchase funnel as the way marketers describe this process [1], [2], and digital channels make each step of it measurable [3]. Attribution decides how much credit each channel receives for the resulting sale. Because budgets follow credit, the attribution rule shapes which channels are funded and which are cut.</w:t>
+        <w:t>Someone sees an Instagram ad on Monday, searches for the brand on Wednesday, gets an email on Friday and buys after typing the address in directly. Marketers now describe buying as a journey of this kind rather than a funnel [1], [2], and digital tools record most of its steps [3]. Attribution is the rule that splits the credit for the sale among those steps. It matters because next month's budget usually follows this month's credit.</w:t>
       </w:r>
     </w:p>
     <w:p>
@@ -551,7 +551,7 @@
           <w:smallCaps w:val="0"/>
           <w:sz w:val="20"/>
         </w:rPr>
-        <w:t>In practice most reports still use last-click attribution, which gives all credit to the final interaction. The rule is simple but it distorts incentives, rewarding channels that appear late in the journey [4]. Each advertising platform also reports from its own perspective, so several platforms can claim the same sale while channels that start journeys appear to contribute little. Google has retired the first-click, linear, time-decay and position-based models from Google Ads, leaving last click and its own data-driven model [5], whose workings an advertiser cannot inspect. The gold standard, a randomised experiment, is expensive and statistically demanding even for very large advertisers [6], [7], and is out of reach for a small business.</w:t>
+        <w:t>The rule most reports still use is last click: the final interaction gets everything. It is easy to explain, and it is also biased toward whatever channel tends to come last [4]. Each ad platform adds its own bias by reporting from its own side, so two platforms can both claim the same sale while the channel that first brought the customer in looks useless. The choice has also narrowed: Google Ads no longer offers first-click, linear, time-decay or position-based attribution, only last click and its own data-driven model [5], which an advertiser cannot inspect. Randomised experiments would settle the question, but they are costly and need very large samples even at the scale of major advertisers [6], [7]. A local shop cannot run one.</w:t>
       </w:r>
     </w:p>
     <w:p>
@@ -568,7 +568,7 @@
           <w:smallCaps w:val="0"/>
           <w:sz w:val="20"/>
         </w:rPr>
-        <w:t>Data-driven alternatives have been proposed for over a decade [8]-[11], but they are usually evaluated on proprietary data without ground truth, and they are rarely available to the small businesses, student teams and local marketers who most need simple, trustworthy guidance. This paper takes a practitioner's view of the problem and asks five research questions:</w:t>
+        <w:t>Researchers have proposed better models for more than a decade [8]-[11]. These models are mostly tested on private company data where nobody knows the true answer, and they rarely reach the people who could use them: small businesses, student teams, freelance marketers. We started this project as a practical question for that audience, and it became five research questions:</w:t>
       </w:r>
     </w:p>
     <w:p>
@@ -595,7 +595,7 @@
           <w:smallCaps w:val="0"/>
           <w:sz w:val="20"/>
         </w:rPr>
-        <w:t xml:space="preserve"> what channel journeys precede a conversion?</w:t>
+        <w:t xml:space="preserve"> which channel journeys come before a purchase?</w:t>
       </w:r>
     </w:p>
     <w:p>
@@ -622,7 +622,7 @@
           <w:smallCaps w:val="0"/>
           <w:sz w:val="20"/>
         </w:rPr>
-        <w:t xml:space="preserve"> how do converting and non-converting sessions differ?</w:t>
+        <w:t xml:space="preserve"> how do sessions that end in a purchase differ from those that do not?</w:t>
       </w:r>
     </w:p>
     <w:p>
@@ -649,7 +649,7 @@
           <w:smallCaps w:val="0"/>
           <w:sz w:val="20"/>
         </w:rPr>
-        <w:t xml:space="preserve"> does a channel's estimated importance change with the attribution model, and which model is most accurate?</w:t>
+        <w:t xml:space="preserve"> does a channel's importance change with the attribution model, and which model is closest to the truth?</w:t>
       </w:r>
     </w:p>
     <w:p>
@@ -676,7 +676,7 @@
           <w:smallCaps w:val="0"/>
           <w:sz w:val="20"/>
         </w:rPr>
-        <w:t xml:space="preserve"> which visitor and session characteristics are associated with conversion?</w:t>
+        <w:t xml:space="preserve"> which visitor and session traits go together with buying?</w:t>
       </w:r>
     </w:p>
     <w:p>
@@ -703,7 +703,7 @@
           <w:smallCaps w:val="0"/>
           <w:sz w:val="20"/>
         </w:rPr>
-        <w:t xml:space="preserve"> can these methods be packaged so that a small business obtains correct, usable insight from its own data?</w:t>
+        <w:t xml:space="preserve"> can the methods be packaged so that a small business gets correct, usable answers from its own data?</w:t>
       </w:r>
     </w:p>
     <w:p>
@@ -720,7 +720,7 @@
           <w:smallCaps w:val="0"/>
           <w:sz w:val="20"/>
         </w:rPr>
-        <w:t>Our contributions are: (i) evidence from 16.5 million real display impressions that last-click credit is governed mainly by recency; (ii) a cross-session analysis of real multi-channel journeys showing where attribution models disagree; (iii) a known-answer simulation showing that the most accurate attribution model depends on how advertising works, which argues for comparing models rather than choosing one; (iv) an analysis of session behaviour associated with purchase; and (v) ChannelTrace, an open, zero-cost tool that implements the methods for any business's data, with a grounded assistant that explains the results in plain language.</w:t>
+        <w:t>The paper makes five contributions. First, using 16.5 million real display impressions, we show that last-click credit depends mostly on how recently the customer clicked. Second, we follow real customers across visits and find where the models actually disagree. Third, a simulation with known channel effects shows that the best model depends on how the advertising works, so models should be compared rather than picked once. Fourth, we describe which session behaviours go with buying. Fifth, we release ChannelTrace, a free tool that does all of this on any business's export, with a tested assistant that explains the output.</w:t>
       </w:r>
     </w:p>
     <w:p>
@@ -737,7 +737,7 @@
           <w:smallCaps w:val="0"/>
           <w:sz w:val="20"/>
         </w:rPr>
-        <w:t>Section II reviews related work. Section III describes the data and Section IV the methods. Section V presents the ChannelTrace system and Section VI the results. Section VII discusses implications and threats to validity, Section VIII limitations and future work, and Section IX concludes.</w:t>
+        <w:t>Section II reviews earlier work, Sections III and IV cover the data and methods, Section V describes the tool and Section VI the results. Section VII discusses what the results mean and where they could be wrong, Section VIII lists limitations and next steps, and Section IX concludes.</w:t>
       </w:r>
     </w:p>
     <w:p>
@@ -788,7 +788,7 @@
           <w:smallCaps w:val="0"/>
           <w:sz w:val="20"/>
         </w:rPr>
-        <w:t>Lemon and Verhoef [2] reviewed the customer journey as a sequence of pre-purchase, purchase and post-purchase touchpoints, many of which the firm does not control. Kannan and Li [3] placed attribution within a broader research agenda for digital marketing and identified it as one of the field's open measurement problems. Wiesel et al. [12] linked online and offline marketing actions to funnel progression and profit, and Kireyev et al. [13] showed that display advertising raises later search activity, so a channel can create value that is credited to another. De Haan et al. [14] compared online advertising forms in a multiple-channel framework and found that last-click attribution undervalues content-integrated advertising.</w:t>
+        <w:t>Lemon and Verhoef [2] describe the journey in three stages, before, during and after purchase, and point out that the firm controls only some of the touchpoints. Kannan and Li [3] list attribution among the unsolved measurement problems of digital marketing. Two studies show why it is hard: Wiesel et al. [12] traced how online and offline activity moves customers through the funnel toward profit, and Kireyev et al. [13] found that display ads increase later searches, so the value one channel creates can be booked to another. De Haan et al. [14] reached a similar conclusion for content-integrated advertising, which last click undervalues.</w:t>
       </w:r>
     </w:p>
     <w:p>
@@ -822,7 +822,7 @@
           <w:smallCaps w:val="0"/>
           <w:sz w:val="20"/>
         </w:rPr>
-        <w:t>Shao and Li [9] proposed learning channel contributions from converting and non-converting histories and argued that a model should be judged on both accuracy and stability. Li and Kannan [8] modelled how customers consider and visit a firm's channels before converting, using individual-level data and a field experiment, and showed that channel contributions differ substantially from what last-click metrics suggest. Anderl et al. [10] represented journeys as Markov chains and measured each channel by its removal effect, finding that heuristic models misallocate credit. Xu et al. [15] modelled ad exposures and conversions as mutually exciting point processes, and Ji and Wang [16] used survival analysis with additive hazards so that the influence of an exposure decays over time. Berman [4] analysed last-touch attribution theoretically and showed how it can distort advertisers' incentives and spending.</w:t>
+        <w:t>Shao and Li [9] were among the first to learn credit from both buyers and non-buyers, and they argued that a model needs to be stable as well as accurate. Li and Kannan [8] modelled how customers consider and move between a firm's channels and checked the model with a field experiment; the credit it gave differed a lot from the last-click figures. Anderl et al. [10] treated journeys as Markov chains and scored each channel by how much conversion drops when it is removed, and they also found the simple rules misleading. Other approaches model exposures and purchases as point processes that excite each other [15], or use survival analysis so that an ad's influence fades over time [16]. On the theory side, Berman [4] showed that last-touch payment rules can push advertisers toward the wrong spending.</w:t>
       </w:r>
     </w:p>
     <w:p>
@@ -856,7 +856,7 @@
           <w:smallCaps w:val="0"/>
           <w:sz w:val="20"/>
         </w:rPr>
-        <w:t>The Shapley value [17] divides a joint payoff among players by averaging each player's marginal contribution over all coalitions. Dalessandro et al. [18] framed attribution causally and connected it to the Shapley value, and Zhao et al. [19] developed simplified Shapley methods for online advertising. Singal et al. [20] built an axiomatic framework for attribution, showed how common heuristics fail its axioms, and proposed a counterfactual adjusted Shapley value. The same idea underlies SHAP explanations of machine learning models [21].</w:t>
+        <w:t>The Shapley value [17] comes from cooperative game theory: each player's share is its average extra contribution across every possible team. Dalessandro et al. [18] linked it to a causal view of attribution, and Zhao et al. [19] gave simpler versions for advertising data. Singal et al. [20] wrote down the properties a fair attribution rule should have, showed that the common rules break them, and proposed an adjusted Shapley value. The same idea is behind SHAP, the popular way of explaining machine-learning predictions [21].</w:t>
       </w:r>
     </w:p>
     <w:p>
@@ -890,7 +890,7 @@
           <w:smallCaps w:val="0"/>
           <w:sz w:val="20"/>
         </w:rPr>
-        <w:t>Recent work learns attribution from sequences with neural networks. Li et al. [22] used attention over touchpoints with user controls; Ren et al. [23] proposed a dual-attention recurrent network that combines post-view and post-click effects; Du et al. [24] used a recurrent network with counterfactual reasoning to estimate incremental contributions; and Kumar et al. [25] added a causal correction for selection bias in channel exposure. Several of these models are evaluated on the Criteo attribution dataset [11], which we also use. Their accuracy is measured by conversion prediction, which does not directly test whether the credit is correct.</w:t>
+        <w:t>Newer models learn credit from touchpoint sequences with neural networks: attention with user controls [22], a dual-attention recurrent network that separates the effect of views and clicks [23], a recurrent network that asks what would have happened without each touch [24], and a causal correction for the fact that people are not shown ads at random [25]. Several are tested on the Criteo data [11] that we also use. Their success is judged by how well they predict conversions, and a model can predict well while still giving credit to the wrong channel.</w:t>
       </w:r>
     </w:p>
     <w:p>
@@ -924,7 +924,7 @@
           <w:smallCaps w:val="0"/>
           <w:sz w:val="20"/>
         </w:rPr>
-        <w:t>Field experiments measure what attribution can only approximate. Blake et al. [26] found that eBay's brand-keyword search advertising produced little incremental revenue, Johnson et al. [27] introduced "ghost ads" to make experiments cheaper, and Gordon et al. [7] showed in large Facebook experiments that observational methods often fail to recover experimental lift. Lewis and Rao [6] explained why even large experiments struggle to measure returns precisely. These results motivate a known-answer test of attribution models when experiments are not available.</w:t>
+        <w:t>Experiments measure what attribution tries to estimate. Blake et al. [26] switched off eBay's brand search ads and found that most of the sales they seemed to drive happened anyway. Johnson et al. [27] proposed "ghost ads" to make such tests cheaper, and Gordon et al. [7] compared large Facebook experiments with the observational methods advertisers normally use and found that the latter often missed. Lewis and Rao [6] explain why even large experiments give noisy answers. When an experiment is not possible, a simulation where the true effect is set in advance is the next best way to check a model.</w:t>
       </w:r>
     </w:p>
     <w:p>
@@ -958,7 +958,7 @@
           <w:smallCaps w:val="0"/>
           <w:sz w:val="20"/>
         </w:rPr>
-        <w:t>Moe and Fader [28] modelled how conversion probability evolves over repeated store visits, Montgomery et al. [29] predicted purchase from page-to-page browsing paths, and Bucklin and Sismeiro [30] reviewed clickstream analysis in marketing. Sakar et al. [31] predicted purchasing intention from session data and released the UCI Online Shoppers dataset used here.</w:t>
+        <w:t>Moe and Fader [28] showed that the chance of buying changes from one store visit to the next. Montgomery et al. [29] predicted purchase from the order in which pages were browsed, and Bucklin and Sismeiro [30] surveyed clickstream research in marketing. Sakar et al. [31] predicted purchase intent from session features and published the UCI Online Shoppers data we analyse.</w:t>
       </w:r>
     </w:p>
     <w:p>
@@ -1733,7 +1733,7 @@
           <w:smallCaps w:val="0"/>
           <w:sz w:val="20"/>
         </w:rPr>
-        <w:t>Table I shows the gap this work addresses. Most studies rely on proprietary data, evaluate a single proposed model and offer nothing a practitioner can run. We combine public data with a simulation in which the true contribution of each channel is known, compare models rather than champion one, and package the methods in a free tool whose assistant explains the results.</w:t>
+        <w:t>Table I puts the gap in one place. Most studies use data the reader cannot get, propose one model and test it, and leave nothing a practitioner can run. We work only with public data, add a simulation where the true answer is known, compare seven models side by side, and hand the whole method over as a free tool whose assistant we also tested.</w:t>
       </w:r>
     </w:p>
     <w:p>
@@ -1767,7 +1767,7 @@
           <w:smallCaps w:val="0"/>
           <w:sz w:val="20"/>
         </w:rPr>
-        <w:t>Each dataset is used only for the questions it can support; the datasets come from different populations and are never pooled (Table II).</w:t>
+        <w:t>We used each dataset only for the questions it can answer. They come from different businesses and periods, so we never combine them (Table II).</w:t>
       </w:r>
     </w:p>
     <w:p>
@@ -1801,7 +1801,7 @@
           <w:smallCaps/>
           <w:sz w:val="16"/>
         </w:rPr>
-        <w:t>Datasets and Their Role</w:t>
+        <w:t>The Datasets and What Each Is Used For</w:t>
       </w:r>
     </w:p>
     <w:tbl>
@@ -2157,7 +2157,7 @@
           </w:tcPr>
           <w:p>
             <w:pPr>
-              <w:keepNext w:val="0"/>
+              <w:keepNext/>
               <w:jc w:val="left"/>
             </w:pPr>
             <w:r/>
@@ -2177,7 +2177,7 @@
           </w:tcPr>
           <w:p>
             <w:pPr>
-              <w:keepNext w:val="0"/>
+              <w:keepNext/>
               <w:jc w:val="left"/>
             </w:pPr>
             <w:r/>
@@ -2197,6 +2197,31 @@
           </w:tcPr>
           <w:p>
             <w:pPr>
+              <w:keepNext/>
+              <w:jc w:val="left"/>
+            </w:pPr>
+            <w:r/>
+            <w:r>
+              <w:rPr>
+                <w:rFonts w:ascii="Times New Roman" w:hAnsi="Times New Roman"/>
+                <w:b w:val="0"/>
+                <w:sz w:val="16"/>
+              </w:rPr>
+              <w:t>RQ3 (model accuracy)</w:t>
+            </w:r>
+          </w:p>
+        </w:tc>
+      </w:tr>
+      <w:tr>
+        <w:trPr>
+          <w:cantSplit/>
+        </w:trPr>
+        <w:tc>
+          <w:tcPr>
+            <w:tcW w:type="dxa" w:w="1440"/>
+          </w:tcPr>
+          <w:p>
+            <w:pPr>
               <w:keepNext w:val="0"/>
               <w:jc w:val="left"/>
             </w:pPr>
@@ -2207,7 +2232,47 @@
                 <w:b w:val="0"/>
                 <w:sz w:val="16"/>
               </w:rPr>
-              <w:t>RQ3 (model accuracy)</w:t>
+              <w:t>Assistant test set</w:t>
+            </w:r>
+          </w:p>
+        </w:tc>
+        <w:tc>
+          <w:tcPr>
+            <w:tcW w:type="dxa" w:w="2376"/>
+          </w:tcPr>
+          <w:p>
+            <w:pPr>
+              <w:keepNext w:val="0"/>
+              <w:jc w:val="left"/>
+            </w:pPr>
+            <w:r/>
+            <w:r>
+              <w:rPr>
+                <w:rFonts w:ascii="Times New Roman" w:hAnsi="Times New Roman"/>
+                <w:b w:val="0"/>
+                <w:sz w:val="16"/>
+              </w:rPr>
+              <w:t>34 questions with known answers</w:t>
+            </w:r>
+          </w:p>
+        </w:tc>
+        <w:tc>
+          <w:tcPr>
+            <w:tcW w:type="dxa" w:w="1224"/>
+          </w:tcPr>
+          <w:p>
+            <w:pPr>
+              <w:keepNext w:val="0"/>
+              <w:jc w:val="left"/>
+            </w:pPr>
+            <w:r/>
+            <w:r>
+              <w:rPr>
+                <w:rFonts w:ascii="Times New Roman" w:hAnsi="Times New Roman"/>
+                <w:b w:val="0"/>
+                <w:sz w:val="16"/>
+              </w:rPr>
+              <w:t>RQ5 (assistant accuracy)</w:t>
             </w:r>
           </w:p>
         </w:tc>
@@ -2244,7 +2309,7 @@
           <w:smallCaps w:val="0"/>
           <w:sz w:val="20"/>
         </w:rPr>
-        <w:t xml:space="preserve"> Each row is one session on an online store over a year, with counts of and time on administrative, informational and product pages, bounce and exit rates, Google Analytics page value, the month, visitor type, weekend flag, anonymised traffic source and whether the session ended in a purchase. We removed 125 exact duplicate rows.</w:t>
+        <w:t xml:space="preserve"> One year of sessions from a single online shop. For each session the data gives how many account, information and product pages were opened and for how long, the bounce and exit rates, a page-value score from Google Analytics, the month, whether the visitor was new, whether it was a weekend, a traffic-source code and whether the session ended in a sale. 125 rows were exact copies of others and were dropped.</w:t>
       </w:r>
     </w:p>
     <w:p>
@@ -2271,7 +2336,7 @@
           <w:smallCaps w:val="0"/>
           <w:sz w:val="20"/>
         </w:rPr>
-        <w:t xml:space="preserve"> Each row is a display impression with a user, campaign, timestamp, click flag and, for converting users, the conversion time and a flag for whether the advertiser's last-click rule credited the conversion to Criteo. We grouped impressions into journeys ending at each conversion. A validity check shaped the design: 99.3% of conversions involve a single campaign, and all impressions in converting journeys are clicks because the public sample retains clicked impressions for converting users. Criteo therefore cannot compare channels or campaigns within a journey, nor clicked against viewed impressions; we use it for the last-click gap and its recency effect.</w:t>
+        <w:t xml:space="preserve"> Thirty days of display impressions, each with a user, campaign, time and click flag. For users who bought, it also gives the purchase time and whether the advertiser's last-click rule gave Criteo the credit. We grouped each user's impressions into a journey ending at the purchase. Our first plan was to compare campaigns inside a journey, but a check ruled that out: 99.3% of purchases involve only one campaign. The sample also keeps only clicked impressions for buyers, so clicks cannot be compared with views either. We therefore used Criteo for a narrower question that it answers well: how often last click credits the network, and what decides it.</w:t>
       </w:r>
     </w:p>
     <w:p>
@@ -2298,7 +2363,7 @@
           <w:smallCaps w:val="0"/>
           <w:sz w:val="20"/>
         </w:rPr>
-        <w:t xml:space="preserve"> The public BigQuery sample covers the Google Merchandise Store from August 2016 to August 2017. Each row is a session with a persistent visitor identifier, start time, Google's default channel grouping and the number of transactions. A journey is a visitor's sessions in time order up to and including the first session with a transaction; journeys without a purchase run to the visitor's last session. Converting journeys were downloaded individually; non-converting journeys were aggregated by channel path inside BigQuery, which is all the Markov model needs and keeps memory low.</w:t>
+        <w:t xml:space="preserve"> Google publishes a year of anonymised sessions from its own Merchandise Store, August 2016 to August 2017, in BigQuery. Each session has a visitor ID that persists across visits, a start time, Google's channel label and a transaction count. We defined a journey as a visitor's sessions in time order up to and including the first one with a purchase; for visitors who never bought it runs to their last session. We queried it through the free BigQuery sandbox. Our computer could not hold every journey in memory, so buyers' journeys were downloaded one by one and the rest were counted by channel path inside BigQuery, which is all the Markov model needs.</w:t>
       </w:r>
     </w:p>
     <w:p>
@@ -2325,7 +2390,7 @@
           <w:smallCaps w:val="0"/>
           <w:sz w:val="20"/>
         </w:rPr>
-        <w:t xml:space="preserve"> A public export of 1,143 ads with spend, impressions, clicks, total and approved conversions and the targeted age and gender. It serves as a realistic file for testing the tool. </w:t>
+        <w:t xml:space="preserve"> A public export of 1,143 ads with spend, impressions, clicks, conversions and the age and gender targeted. We used it as a realistic upload to test the tool. The </w:t>
       </w:r>
       <w:r>
         <w:rPr>
@@ -2335,7 +2400,7 @@
           <w:smallCaps w:val="0"/>
           <w:sz w:val="20"/>
         </w:rPr>
-        <w:t>Simulated journeys</w:t>
+        <w:t>simulated journeys</w:t>
       </w:r>
       <w:r>
         <w:rPr>
@@ -2416,7 +2481,7 @@
           <w:smallCaps w:val="0"/>
           <w:sz w:val="20"/>
         </w:rPr>
-        <w:t xml:space="preserve">A converting journey is a sequence of touchpoints </w:t>
+        <w:t xml:space="preserve">Write a converting journey as touchpoints </w:t>
       </w:r>
       <m:oMath xmlns:mml="http://www.w3.org/1998/Math/MathML">
         <m:r>
@@ -2515,7 +2580,7 @@
           <w:smallCaps w:val="0"/>
           <w:sz w:val="20"/>
         </w:rPr>
-        <w:t xml:space="preserve"> is a channel, </w:t>
+        <w:t xml:space="preserve"> is the channel and </w:t>
       </w:r>
       <m:oMath xmlns:mml="http://www.w3.org/1998/Math/MathML">
         <m:sSub>
@@ -2539,7 +2604,22 @@
           <w:smallCaps w:val="0"/>
           <w:sz w:val="20"/>
         </w:rPr>
-        <w:t xml:space="preserve"> a time and the purchase happens at time </w:t>
+        <w:t xml:space="preserve"> the time of touch </w:t>
+      </w:r>
+      <m:oMath xmlns:mml="http://www.w3.org/1998/Math/MathML">
+        <m:r>
+          <m:t>i</m:t>
+        </m:r>
+      </m:oMath>
+      <w:r>
+        <w:rPr>
+          <w:rFonts w:ascii="Times New Roman" w:hAnsi="Times New Roman"/>
+          <w:b w:val="0"/>
+          <w:i w:val="0"/>
+          <w:smallCaps w:val="0"/>
+          <w:sz w:val="20"/>
+        </w:rPr>
+        <w:t xml:space="preserve">, and the sale happens at time </w:t>
       </w:r>
       <m:oMath xmlns:mml="http://www.w3.org/1998/Math/MathML">
         <m:r>
@@ -2554,7 +2634,7 @@
           <w:smallCaps w:val="0"/>
           <w:sz w:val="20"/>
         </w:rPr>
-        <w:t xml:space="preserve"> after the last touch. An attribution model assigns each touch a weight </w:t>
+        <w:t xml:space="preserve">. A model gives each touch a weight </w:t>
       </w:r>
       <m:oMath xmlns:mml="http://www.w3.org/1998/Math/MathML">
         <m:sSub>
@@ -2578,7 +2658,7 @@
           <w:smallCaps w:val="0"/>
           <w:sz w:val="20"/>
         </w:rPr>
-        <w:t xml:space="preserve"> with </w:t>
+        <w:t xml:space="preserve">, with </w:t>
       </w:r>
       <m:oMath xmlns:mml="http://www.w3.org/1998/Math/MathML">
         <m:nary>
@@ -2622,22 +2702,7 @@
           <w:smallCaps w:val="0"/>
           <w:sz w:val="20"/>
         </w:rPr>
-        <w:t xml:space="preserve">, and the credit of channel </w:t>
-      </w:r>
-      <m:oMath xmlns:mml="http://www.w3.org/1998/Math/MathML">
-        <m:r>
-          <m:t>k</m:t>
-        </m:r>
-      </m:oMath>
-      <w:r>
-        <w:rPr>
-          <w:rFonts w:ascii="Times New Roman" w:hAnsi="Times New Roman"/>
-          <w:b w:val="0"/>
-          <w:i w:val="0"/>
-          <w:smallCaps w:val="0"/>
-          <w:sz w:val="20"/>
-        </w:rPr>
-        <w:t xml:space="preserve"> is the sum of the weights of its touches over all converting journeys:</w:t>
+        <w:t>. A channel's credit is the total weight of its touches over all converting journeys:</w:t>
       </w:r>
     </w:p>
     <w:p>
@@ -2753,7 +2818,7 @@
           <w:smallCaps w:val="0"/>
           <w:sz w:val="20"/>
         </w:rPr>
-        <w:t xml:space="preserve">First touch sets </w:t>
+        <w:t xml:space="preserve">First touch puts </w:t>
       </w:r>
       <m:oMath xmlns:mml="http://www.w3.org/1998/Math/MathML">
         <m:sSub>
@@ -2780,7 +2845,7 @@
           <w:smallCaps w:val="0"/>
           <w:sz w:val="20"/>
         </w:rPr>
-        <w:t xml:space="preserve">, last touch sets </w:t>
+        <w:t xml:space="preserve">, last touch </w:t>
       </w:r>
       <m:oMath xmlns:mml="http://www.w3.org/1998/Math/MathML">
         <m:sSub>
@@ -2807,7 +2872,7 @@
           <w:smallCaps w:val="0"/>
           <w:sz w:val="20"/>
         </w:rPr>
-        <w:t xml:space="preserve"> and linear sets </w:t>
+        <w:t xml:space="preserve">, and linear </w:t>
       </w:r>
       <m:oMath xmlns:mml="http://www.w3.org/1998/Math/MathML">
         <m:sSub>
@@ -2834,7 +2899,7 @@
           <w:smallCaps w:val="0"/>
           <w:sz w:val="20"/>
         </w:rPr>
-        <w:t xml:space="preserve">. Time decay halves a touch's weight for every </w:t>
+        <w:t xml:space="preserve">. Time decay halves the weight for every </w:t>
       </w:r>
       <m:oMath xmlns:mml="http://www.w3.org/1998/Math/MathML">
         <m:r>
@@ -2849,7 +2914,7 @@
           <w:smallCaps w:val="0"/>
           <w:sz w:val="20"/>
         </w:rPr>
-        <w:t xml:space="preserve"> days between it and the purchase:</w:t>
+        <w:t xml:space="preserve"> days between a touch and the sale:</w:t>
       </w:r>
     </w:p>
     <w:p>
@@ -2993,37 +3058,7 @@
           <w:smallCaps w:val="0"/>
           <w:sz w:val="20"/>
         </w:rPr>
-        <w:t xml:space="preserve">Position based gives 40% each to the first and last touch and shares the remaining 20% equally among the touches in between (half each when </w:t>
-      </w:r>
-      <m:oMath xmlns:mml="http://www.w3.org/1998/Math/MathML">
-        <m:r>
-          <m:t>n=2</m:t>
-        </m:r>
-      </m:oMath>
-      <w:r>
-        <w:rPr>
-          <w:rFonts w:ascii="Times New Roman" w:hAnsi="Times New Roman"/>
-          <w:b w:val="0"/>
-          <w:i w:val="0"/>
-          <w:smallCaps w:val="0"/>
-          <w:sz w:val="20"/>
-        </w:rPr>
-        <w:t xml:space="preserve">, all of it when </w:t>
-      </w:r>
-      <m:oMath xmlns:mml="http://www.w3.org/1998/Math/MathML">
-        <m:r>
-          <m:t>n=1</m:t>
-        </m:r>
-      </m:oMath>
-      <w:r>
-        <w:rPr>
-          <w:rFonts w:ascii="Times New Roman" w:hAnsi="Times New Roman"/>
-          <w:b w:val="0"/>
-          <w:i w:val="0"/>
-          <w:smallCaps w:val="0"/>
-          <w:sz w:val="20"/>
-        </w:rPr>
-        <w:t>).</w:t>
+        <w:t>Position based gives 40% to the first touch, 40% to the last and splits the other 20% evenly across the middle (with two touches each gets half; with one it gets everything).</w:t>
       </w:r>
     </w:p>
     <w:p>
@@ -3057,7 +3092,22 @@
           <w:smallCaps w:val="0"/>
           <w:sz w:val="20"/>
         </w:rPr>
-        <w:t xml:space="preserve">Following Anderl et al. [10], all journeys, converting and not, are treated as paths through the states start, the channels, conversion and null. The transition probability from state </w:t>
+        <w:t xml:space="preserve">We follow Anderl et al. [10] and treat every journey, with or without a sale, as a walk between states: a start state, one state per channel, and two end states, conversion and null. From the observed transition counts </w:t>
+      </w:r>
+      <m:oMath xmlns:mml="http://www.w3.org/1998/Math/MathML">
+        <m:r>
+          <m:t>N</m:t>
+        </m:r>
+      </m:oMath>
+      <w:r>
+        <w:rPr>
+          <w:rFonts w:ascii="Times New Roman" w:hAnsi="Times New Roman"/>
+          <w:b w:val="0"/>
+          <w:i w:val="0"/>
+          <w:smallCaps w:val="0"/>
+          <w:sz w:val="20"/>
+        </w:rPr>
+        <w:t xml:space="preserve">, the probability of moving from state </w:t>
       </w:r>
       <m:oMath xmlns:mml="http://www.w3.org/1998/Math/MathML">
         <m:r>
@@ -3087,22 +3137,7 @@
           <w:smallCaps w:val="0"/>
           <w:sz w:val="20"/>
         </w:rPr>
-        <w:t xml:space="preserve"> is estimated from the transition counts </w:t>
-      </w:r>
-      <m:oMath xmlns:mml="http://www.w3.org/1998/Math/MathML">
-        <m:r>
-          <m:t>N</m:t>
-        </m:r>
-      </m:oMath>
-      <w:r>
-        <w:rPr>
-          <w:rFonts w:ascii="Times New Roman" w:hAnsi="Times New Roman"/>
-          <w:b w:val="0"/>
-          <w:i w:val="0"/>
-          <w:smallCaps w:val="0"/>
-          <w:sz w:val="20"/>
-        </w:rPr>
-        <w:t>:</w:t>
+        <w:t xml:space="preserve"> is</w:t>
       </w:r>
     </w:p>
     <w:p>
@@ -3210,7 +3245,7 @@
           <w:smallCaps w:val="0"/>
           <w:sz w:val="20"/>
         </w:rPr>
-        <w:t xml:space="preserve">Conversion and null are absorbing states. Splitting the transition matrix into its transient part </w:t>
+        <w:t xml:space="preserve">Conversion and null are absorbing. If </w:t>
       </w:r>
       <m:oMath xmlns:mml="http://www.w3.org/1998/Math/MathML">
         <m:r>
@@ -3225,7 +3260,7 @@
           <w:smallCaps w:val="0"/>
           <w:sz w:val="20"/>
         </w:rPr>
-        <w:t xml:space="preserve"> and absorbing part </w:t>
+        <w:t xml:space="preserve"> holds the transitions between ordinary states and </w:t>
       </w:r>
       <m:oMath xmlns:mml="http://www.w3.org/1998/Math/MathML">
         <m:r>
@@ -3240,7 +3275,7 @@
           <w:smallCaps w:val="0"/>
           <w:sz w:val="20"/>
         </w:rPr>
-        <w:t xml:space="preserve">, the absorption probabilities are </w:t>
+        <w:t xml:space="preserve"> those into the two end states, the absorption probabilities are </w:t>
       </w:r>
       <m:oMath xmlns:mml="http://www.w3.org/1998/Math/MathML">
         <m:r>
@@ -3294,22 +3329,7 @@
           <w:smallCaps w:val="0"/>
           <w:sz w:val="20"/>
         </w:rPr>
-        <w:t xml:space="preserve"> is the entry of </w:t>
-      </w:r>
-      <m:oMath xmlns:mml="http://www.w3.org/1998/Math/MathML">
-        <m:r>
-          <m:t>B</m:t>
-        </m:r>
-      </m:oMath>
-      <w:r>
-        <w:rPr>
-          <w:rFonts w:ascii="Times New Roman" w:hAnsi="Times New Roman"/>
-          <w:b w:val="0"/>
-          <w:i w:val="0"/>
-          <w:smallCaps w:val="0"/>
-          <w:sz w:val="20"/>
-        </w:rPr>
-        <w:t xml:space="preserve"> for start and conversion. Removing channel </w:t>
+        <w:t xml:space="preserve"> is the chance of ending in conversion from start. To remove channel </w:t>
       </w:r>
       <m:oMath xmlns:mml="http://www.w3.org/1998/Math/MathML">
         <m:r>
@@ -3324,7 +3344,7 @@
           <w:smallCaps w:val="0"/>
           <w:sz w:val="20"/>
         </w:rPr>
-        <w:t xml:space="preserve"> redirects every transition into </w:t>
+        <w:t xml:space="preserve"> we send every step into </w:t>
       </w:r>
       <m:oMath xmlns:mml="http://www.w3.org/1998/Math/MathML">
         <m:r>
@@ -3339,7 +3359,7 @@
           <w:smallCaps w:val="0"/>
           <w:sz w:val="20"/>
         </w:rPr>
-        <w:t xml:space="preserve"> to the null state. Its removal effect and credit are</w:t>
+        <w:t xml:space="preserve"> to null instead. The removal effect and the resulting credit are</w:t>
       </w:r>
     </w:p>
     <w:p>
@@ -3503,7 +3523,7 @@
           <w:smallCaps w:val="0"/>
           <w:sz w:val="20"/>
         </w:rPr>
-        <w:t xml:space="preserve">where </w:t>
+        <w:t xml:space="preserve">with </w:t>
       </w:r>
       <m:oMath xmlns:mml="http://www.w3.org/1998/Math/MathML">
         <m:r>
@@ -3518,7 +3538,22 @@
           <w:smallCaps w:val="0"/>
           <w:sz w:val="20"/>
         </w:rPr>
-        <w:t xml:space="preserve"> is the number of conversions. For GA360, aggregated non-converting paths enter the count matrix with a weight equal to the number of journeys they represent; we verified that this gives results identical to the unweighted computation.</w:t>
+        <w:t xml:space="preserve"> the number of conversions. For GA360 each counted non-converting path enters </w:t>
+      </w:r>
+      <m:oMath xmlns:mml="http://www.w3.org/1998/Math/MathML">
+        <m:r>
+          <m:t>N</m:t>
+        </m:r>
+      </m:oMath>
+      <w:r>
+        <w:rPr>
+          <w:rFonts w:ascii="Times New Roman" w:hAnsi="Times New Roman"/>
+          <w:b w:val="0"/>
+          <w:i w:val="0"/>
+          <w:smallCaps w:val="0"/>
+          <w:sz w:val="20"/>
+        </w:rPr>
+        <w:t xml:space="preserve"> with a weight equal to the number of journeys it stands for. We checked on smaller data that this weighting gives exactly the same answer as counting journeys one by one.</w:t>
       </w:r>
     </w:p>
     <w:p>
@@ -3567,7 +3602,7 @@
           <w:smallCaps w:val="0"/>
           <w:sz w:val="20"/>
         </w:rPr>
-        <w:t xml:space="preserve"> be the set of channels and </w:t>
+        <w:t xml:space="preserve"> be the set of channels and let </w:t>
       </w:r>
       <m:oMath xmlns:mml="http://www.w3.org/1998/Math/MathML">
         <m:r>
@@ -3582,11 +3617,26 @@
           <w:smallCaps w:val="0"/>
           <w:sz w:val="20"/>
         </w:rPr>
-        <w:t xml:space="preserve"> the number of converting journeys whose channels all lie in the coalition </w:t>
+        <w:t xml:space="preserve">, the value of a group </w:t>
       </w:r>
       <m:oMath xmlns:mml="http://www.w3.org/1998/Math/MathML">
         <m:r>
           <m:t>S⊆K</m:t>
+        </m:r>
+      </m:oMath>
+      <w:r>
+        <w:rPr>
+          <w:rFonts w:ascii="Times New Roman" w:hAnsi="Times New Roman"/>
+          <w:b w:val="0"/>
+          <w:i w:val="0"/>
+          <w:smallCaps w:val="0"/>
+          <w:sz w:val="20"/>
+        </w:rPr>
+        <w:t xml:space="preserve">, be the number of converting journeys that use only channels in </w:t>
+      </w:r>
+      <m:oMath xmlns:mml="http://www.w3.org/1998/Math/MathML">
+        <m:r>
+          <m:t>S</m:t>
         </m:r>
       </m:oMath>
       <w:r>
@@ -3702,7 +3752,7 @@
           <w:smallCaps w:val="0"/>
           <w:sz w:val="20"/>
         </w:rPr>
-        <w:t xml:space="preserve">By the efficiency property </w:t>
+        <w:t xml:space="preserve">The shares add up to the whole, </w:t>
       </w:r>
       <m:oMath xmlns:mml="http://www.w3.org/1998/Math/MathML">
         <m:nary>
@@ -3734,7 +3784,7 @@
           <w:smallCaps w:val="0"/>
           <w:sz w:val="20"/>
         </w:rPr>
-        <w:t xml:space="preserve">, so, like the other models, it distributes exactly the observed conversions. Exact computation is exponential in </w:t>
+        <w:t xml:space="preserve">, so this model also hands out exactly the observed conversions. The exact sum grows exponentially with </w:t>
       </w:r>
       <m:oMath xmlns:mml="http://www.w3.org/1998/Math/MathML">
         <m:r>
@@ -3749,7 +3799,7 @@
           <w:smallCaps w:val="0"/>
           <w:sz w:val="20"/>
         </w:rPr>
-        <w:t xml:space="preserve"> and the implementation is limited to 12 channels, which covers every dataset here. Table III summarises the seven models.</w:t>
+        <w:t>; our implementation allows up to 12 channels, more than any dataset here has. Table III lists the seven models side by side.</w:t>
       </w:r>
     </w:p>
     <w:p>
@@ -4524,7 +4574,7 @@
           <w:smallCaps w:val="0"/>
           <w:sz w:val="20"/>
         </w:rPr>
-        <w:t xml:space="preserve">Observational data offers no ground truth for attribution, so we simulated journeys in which channel effects are set by design. In each random world, seven channels receive a lift </w:t>
+        <w:t xml:space="preserve">Real data never tells us how much credit a channel really deserves, so we built worlds where we set it ourselves. In each world the seven channels get a lift </w:t>
       </w:r>
       <m:oMath xmlns:mml="http://www.w3.org/1998/Math/MathML">
         <m:sSub>
@@ -4548,7 +4598,7 @@
           <w:smallCaps w:val="0"/>
           <w:sz w:val="20"/>
         </w:rPr>
-        <w:t xml:space="preserve"> drawn uniformly from </w:t>
+        <w:t xml:space="preserve"> drawn at random from </w:t>
       </w:r>
       <m:oMath xmlns:mml="http://www.w3.org/1998/Math/MathML">
         <m:r>
@@ -4563,22 +4613,7 @@
           <w:smallCaps w:val="0"/>
           <w:sz w:val="20"/>
         </w:rPr>
-        <w:t xml:space="preserve">, and the first channel and each subsequent channel are drawn from Dirichlet(2) distributions. A user makes up to eight visits; after visit </w:t>
-      </w:r>
-      <m:oMath xmlns:mml="http://www.w3.org/1998/Math/MathML">
-        <m:r>
-          <m:t>m</m:t>
-        </m:r>
-      </m:oMath>
-      <w:r>
-        <w:rPr>
-          <w:rFonts w:ascii="Times New Roman" w:hAnsi="Times New Roman"/>
-          <w:b w:val="0"/>
-          <w:i w:val="0"/>
-          <w:smallCaps w:val="0"/>
-          <w:sz w:val="20"/>
-        </w:rPr>
-        <w:t xml:space="preserve"> without a purchase the user leaves with probability 0.35, otherwise returns after an exponential gap with a mean of 60 hours. The purchase probability at visit </w:t>
+        <w:t xml:space="preserve">, and the first channel and each later channel are drawn from Dirichlet(2) distributions. A simulated user makes up to eight visits. After a visit without a purchase the user leaves for good with probability 0.35; otherwise they come back after a gap drawn from an exponential distribution with a mean of 60 hours. The chance of buying at visit </w:t>
       </w:r>
       <m:oMath xmlns:mml="http://www.w3.org/1998/Math/MathML">
         <m:r>
@@ -4713,7 +4748,7 @@
           <w:smallCaps w:val="0"/>
           <w:sz w:val="20"/>
         </w:rPr>
-        <w:t xml:space="preserve">where </w:t>
+        <w:t xml:space="preserve">with </w:t>
       </w:r>
       <m:oMath xmlns:mml="http://www.w3.org/1998/Math/MathML">
         <m:r>
@@ -4728,7 +4763,7 @@
           <w:smallCaps w:val="0"/>
           <w:sz w:val="20"/>
         </w:rPr>
-        <w:t xml:space="preserve"> is the logistic function, </w:t>
+        <w:t xml:space="preserve"> the logistic function, </w:t>
       </w:r>
       <m:oMath xmlns:mml="http://www.w3.org/1998/Math/MathML">
         <m:sSub>
@@ -4782,27 +4817,7 @@
           <w:smallCaps w:val="0"/>
           <w:sz w:val="20"/>
         </w:rPr>
-        <w:t xml:space="preserve"> for later visits. In the </w:t>
-      </w:r>
-      <w:r>
-        <w:rPr>
-          <w:rFonts w:ascii="Times New Roman" w:hAnsi="Times New Roman"/>
-          <w:b w:val="0"/>
-          <w:i/>
-          <w:smallCaps w:val="0"/>
-          <w:sz w:val="20"/>
-        </w:rPr>
-        <w:t>immediate</w:t>
-      </w:r>
-      <w:r>
-        <w:rPr>
-          <w:rFonts w:ascii="Times New Roman" w:hAnsi="Times New Roman"/>
-          <w:b w:val="0"/>
-          <w:i w:val="0"/>
-          <w:smallCaps w:val="0"/>
-          <w:sz w:val="20"/>
-        </w:rPr>
-        <w:t xml:space="preserve"> scenario </w:t>
+        <w:t xml:space="preserve"> after the first visit. Two scenarios differ only in </w:t>
       </w:r>
       <m:oMath xmlns:mml="http://www.w3.org/1998/Math/MathML">
         <m:r>
@@ -4817,7 +4832,27 @@
           <w:smallCaps w:val="0"/>
           <w:sz w:val="20"/>
         </w:rPr>
-        <w:t xml:space="preserve"> includes visit </w:t>
+        <w:t xml:space="preserve">. In the </w:t>
+      </w:r>
+      <w:r>
+        <w:rPr>
+          <w:rFonts w:ascii="Times New Roman" w:hAnsi="Times New Roman"/>
+          <w:b w:val="0"/>
+          <w:i/>
+          <w:smallCaps w:val="0"/>
+          <w:sz w:val="20"/>
+        </w:rPr>
+        <w:t>immediate</w:t>
+      </w:r>
+      <w:r>
+        <w:rPr>
+          <w:rFonts w:ascii="Times New Roman" w:hAnsi="Times New Roman"/>
+          <w:b w:val="0"/>
+          <w:i w:val="0"/>
+          <w:smallCaps w:val="0"/>
+          <w:sz w:val="20"/>
+        </w:rPr>
+        <w:t xml:space="preserve"> scenario it includes visit </w:t>
       </w:r>
       <m:oMath xmlns:mml="http://www.w3.org/1998/Math/MathML">
         <m:r>
@@ -4832,7 +4867,7 @@
           <w:smallCaps w:val="0"/>
           <w:sz w:val="20"/>
         </w:rPr>
-        <w:t xml:space="preserve">, so a touch can trigger a purchase in the same visit; in the </w:t>
+        <w:t xml:space="preserve"> itself, so an ad can trigger a sale on the spot. In the </w:t>
       </w:r>
       <w:r>
         <w:rPr>
@@ -4852,11 +4887,11 @@
           <w:smallCaps w:val="0"/>
           <w:sz w:val="20"/>
         </w:rPr>
-        <w:t xml:space="preserve"> scenario </w:t>
+        <w:t xml:space="preserve"> scenario it includes only earlier visits, the way awareness ads work. To get the truth for channel </w:t>
       </w:r>
       <m:oMath xmlns:mml="http://www.w3.org/1998/Math/MathML">
         <m:r>
-          <m:t>J(m)</m:t>
+          <m:t>k</m:t>
         </m:r>
       </m:oMath>
       <w:r>
@@ -4867,7 +4902,22 @@
           <w:smallCaps w:val="0"/>
           <w:sz w:val="20"/>
         </w:rPr>
-        <w:t xml:space="preserve"> includes only earlier visits, as with awareness advertising. A channel's true contribution is the number of conversions lost when its lift is switched off, computed with the same random numbers so that only that channel's effect changes. Its true share </w:t>
+        <w:t xml:space="preserve"> we rerun the same world, with the same random numbers, with </w:t>
+      </w:r>
+      <m:oMath xmlns:mml="http://www.w3.org/1998/Math/MathML">
+        <m:r>
+          <m:t>k</m:t>
+        </m:r>
+      </m:oMath>
+      <w:r>
+        <w:rPr>
+          <w:rFonts w:ascii="Times New Roman" w:hAnsi="Times New Roman"/>
+          <w:b w:val="0"/>
+          <w:i w:val="0"/>
+          <w:smallCaps w:val="0"/>
+          <w:sz w:val="20"/>
+        </w:rPr>
+        <w:t xml:space="preserve">'s lift set to zero, and count the sales that disappear. Its true share </w:t>
       </w:r>
       <m:oMath xmlns:mml="http://www.w3.org/1998/Math/MathML">
         <m:sSub>
@@ -4891,7 +4941,7 @@
           <w:smallCaps w:val="0"/>
           <w:sz w:val="20"/>
         </w:rPr>
-        <w:t xml:space="preserve"> is that loss divided by the sum of losses over all channels. Each model's credit shares </w:t>
+        <w:t xml:space="preserve"> is that loss over the sum of losses for all channels. A model's shares </w:t>
       </w:r>
       <m:oMath xmlns:mml="http://www.w3.org/1998/Math/MathML">
         <m:sSub>
@@ -5052,7 +5102,7 @@
           <w:smallCaps w:val="0"/>
           <w:sz w:val="20"/>
         </w:rPr>
-        <w:t>in percentage points, and by Spearman rank correlation [35] with the true shares. Six worlds of 3,000 users were generated per scenario. Stability was assessed with 200 bootstrap resamples of journeys [36] on a separate synthetic dataset in which Social and Display were designed to start journeys and Email and Paid Search to close them.</w:t>
+        <w:t>in percentage points, and by Spearman's rank correlation [35] with the true shares. We ran six worlds of 3,000 users for each scenario. To check how stable the credit is, we also drew 200 bootstrap resamples [36] of a separate synthetic set in which Social and Display were built to open journeys while Email and Paid Search were built to finish them.</w:t>
       </w:r>
     </w:p>
     <w:p>
@@ -5086,7 +5136,7 @@
           <w:smallCaps w:val="0"/>
           <w:sz w:val="20"/>
         </w:rPr>
-        <w:t xml:space="preserve">For each Criteo conversion </w:t>
+        <w:t xml:space="preserve">For each Criteo purchase </w:t>
       </w:r>
       <m:oMath xmlns:mml="http://www.w3.org/1998/Math/MathML">
         <m:r>
@@ -5101,7 +5151,7 @@
           <w:smallCaps w:val="0"/>
           <w:sz w:val="20"/>
         </w:rPr>
-        <w:t xml:space="preserve"> we record whether Criteo received last-click credit (</w:t>
+        <w:t xml:space="preserve"> we note whether Criteo got the last-click credit (</w:t>
       </w:r>
       <m:oMath xmlns:mml="http://www.w3.org/1998/Math/MathML">
         <m:sSub>
@@ -5176,7 +5226,7 @@
           <w:smallCaps w:val="0"/>
           <w:sz w:val="20"/>
         </w:rPr>
-        <w:t xml:space="preserve"> from the last click to the conversion. We test association with Pearson's chi-square test [37] over six time bands and with the logistic regression</w:t>
+        <w:t xml:space="preserve"> between the last click and the purchase. We test the link with Pearson's chi-square test [37] across six time bands and fit</w:t>
       </w:r>
     </w:p>
     <w:p>
@@ -5341,7 +5391,41 @@
           <w:smallCaps w:val="0"/>
           <w:sz w:val="20"/>
         </w:rPr>
-        <w:t>Converting and non-converting UCI sessions are compared with two-sided Mann-Whitney U tests [38] for numeric measures and chi-square tests for visitor type, month and weekend. Logistic regression, random forest [39] and gradient boosting [40] classifiers, implemented in scikit-learn [41], are trained on a stratified 75/25 split with class-balanced weights and evaluated by ROC-AUC [42]. Because the PageValues feature is computed from pages viewed before a transaction and partly encodes the outcome, every model is reported with and without it. Feature importance is measured by permutation on the test set.</w:t>
+        <w:t>Numeric session measures of buyers and non-buyers are compared with the Mann-Whitney U test [38] (two-sided), and the categorical ones, visitor type, month and weekend, with chi-square tests. For prediction we train logistic regression, random forest [39] and gradient boosting [40] models in scikit-learn [41] on three quarters of the sessions (stratified by outcome, classes reweighted to balance them) and score them by ROC-AUC [42] on the remaining quarter. One feature needed care. PageValues is calculated from the pages a visitor saw before a transaction, so it partly contains the answer, and we therefore report every model both with and without it. To see which inputs matter, we shuffle one feature at a time in the test data and record how far the AUC drops.</w:t>
+      </w:r>
+    </w:p>
+    <w:p>
+      <w:pPr>
+        <w:keepNext/>
+        <w:spacing w:after="40" w:before="80" w:line="240" w:lineRule="auto"/>
+        <w:jc w:val="left"/>
+      </w:pPr>
+      <w:r>
+        <w:rPr>
+          <w:rFonts w:ascii="Times New Roman" w:hAnsi="Times New Roman"/>
+          <w:b w:val="0"/>
+          <w:i/>
+          <w:smallCaps w:val="0"/>
+          <w:sz w:val="20"/>
+        </w:rPr>
+        <w:t>G. Assistant Evaluation</w:t>
+      </w:r>
+    </w:p>
+    <w:p>
+      <w:pPr>
+        <w:spacing w:after="0" w:before="0" w:line="240" w:lineRule="auto"/>
+        <w:ind w:firstLine="202"/>
+        <w:jc w:val="both"/>
+      </w:pPr>
+      <w:r>
+        <w:rPr>
+          <w:rFonts w:ascii="Times New Roman" w:hAnsi="Times New Roman"/>
+          <w:b w:val="0"/>
+          <w:i w:val="0"/>
+          <w:smallCaps w:val="0"/>
+          <w:sz w:val="20"/>
+        </w:rPr>
+        <w:t>Before running the test we wrote 34 questions. For 26 of them the answer is in the fact sheet; the other 8 cannot be answered from the data, for example the return on television advertising or next month's sales. Each question was sent once, with no earlier conversation, to both of the site's answer paths. An answerable question counts as correct if the reply contains every expected fact, allowing for rounding such as 54% for 54.2%. An unanswerable one counts as correct if the reply says the data does not cover it and gives no figure. We also pulled every number out of every reply and looked it up in the fact sheet; a number found nowhere counts as unsupported, which is a direct measure of made-up figures. We read all replies ourselves to check the automatic scores.</w:t>
       </w:r>
     </w:p>
     <w:p>
@@ -5432,7 +5516,7 @@
           <w:smallCaps w:val="0"/>
           <w:sz w:val="20"/>
         </w:rPr>
-        <w:t>ChannelTrace is a web application written in TypeScript with React and hosted on Vercel at no cost (Fig. 1). Its analysis runs entirely in the user's browser, so uploaded files are never sent to a server. An ad-performance module detects Google Ads, Meta Ads Manager and similar exports, maps their columns, computes click-through rate, cost per click, conversion rate, cost per acquisition (CPA) and return on ad spend, gives each campaign a verdict relative to the account average (scale candidate, on track, expensive, no conversions), measures spend with no return and breaks results down by audience and day. A journey module applies all seven attribution models and shows where last click over- or under-credits each channel. The browser implementation of the models was checked against the Python reference used for the research.</w:t>
+        <w:t>Our first prototype was a Streamlit dashboard in Python. We rebuilt it as a TypeScript and React web app hosted free on Vercel (Fig. 1) so that all analysis happens in the browser and an uploaded file never leaves the user's computer. The ad module recognises exports from Google Ads, Meta Ads Manager and similar tools, renames their columns to a common set, and works out click-through rate, cost per click, conversion rate, cost per acquisition (CPA) and return on ad spend. Every campaign is then labelled by comparing it with the account as a whole: worth scaling, on track, too expensive, or not converting at all. The module also shows money spent with nothing to show for it, and splits results by audience and by day. The journey module puts the seven attribution models next to each other, so a user can see which channels last click flatters and which it shortchanges. We checked the browser code against the Python version used for the research.</w:t>
       </w:r>
     </w:p>
     <w:p>
@@ -5449,7 +5533,7 @@
           <w:smallCaps w:val="0"/>
           <w:sz w:val="20"/>
         </w:rPr>
-        <w:t>Results are condensed into a fact sheet: short, labelled statements of computed figures, with suggested actions and caveats. The assistant answers questions only from this sheet, a form of retrieval grounding that reduces invented content [43], [44]. When the site has a key configured, an edge function sends the sheet and the question to a free generative model; because free model versions are retired and often overloaded, it tries several in turn within a fixed time budget. Otherwise a built-in model scores fact-sheet statements against the question with TF-IDF weighting [45] and quotes the most relevant ones, so the assistant works offline and can only repeat computed numbers.</w:t>
+        <w:t>All results are boiled down to a fact sheet of short, labelled statements, plus suggested actions and caveats. The assistant may only answer from this sheet, which limits how much it can invent [43], [44]. When a key is set, a small server function passes the sheet and the question to a free Gemini model. During development the model we started with was retired and the newer ones were often overloaded, so the function now tries several models in turn within a fixed time limit. Without a key, or if every model fails, a built-in fallback ranks the sheet's statements against the question by TF-IDF [45] and quotes the closest ones. That version works offline and can only repeat numbers we computed.</w:t>
       </w:r>
     </w:p>
     <w:p>
@@ -5500,7 +5584,7 @@
           <w:smallCaps w:val="0"/>
           <w:sz w:val="20"/>
         </w:rPr>
-        <w:t>All 435,810 Criteo conversions followed at least one Criteo click, yet only 54.2% were credited to Criteo by the advertiser's last-click rule; the remainder were claimed by other channels. Converting journeys were short (mean 1.85 clicks; 68% with one click; median 20.3 hours from the last click to purchase; median 3.8 days from first to last click in multi-click journeys). Fig. 2 shows that credit falls steadily with time since the last click (chi-square = 126,214, df = 5, p &lt; 0.001).</w:t>
+        <w:t>Each of the 435,810 Criteo purchases had a Criteo click somewhere before it. Even so, the advertiser's attribution system handed Criteo only 54.2% of them; the rest went to other channels. Journeys were short: 1.85 clicks on average, 68% with a single click, and typically 20.3 hours between the final click and the sale (median), and a median of 3.8 days between the first and last click when there was more than one. Fig. 2 shows credit falling steadily as the gap grows (chi-square = 126,214, df = 5, p &lt; 0.001).</w:t>
       </w:r>
     </w:p>
     <w:p>
@@ -5557,7 +5641,7 @@
           <w:smallCaps w:val="0"/>
           <w:sz w:val="16"/>
         </w:rPr>
-        <w:t>Fig. 2.  Share of conversions credited to Criteo under last click, by time from the last Criteo click to the conversion (number of conversions in brackets).</w:t>
+        <w:t>Fig. 2.  How often Criteo kept the last-click credit, grouped by the gap between its last click and the purchase (purchases per group in brackets).</w:t>
       </w:r>
     </w:p>
     <w:p>
@@ -5591,7 +5675,7 @@
           <w:smallCaps/>
           <w:sz w:val="16"/>
         </w:rPr>
-        <w:t>Logistic Regression of Last-Click Credit to Criteo (n = 433,745)</w:t>
+        <w:t>What Predicts Criteo Keeping the Credit (Logistic Regression, n = 433,745)</w:t>
       </w:r>
     </w:p>
     <w:tbl>
@@ -5890,7 +5974,7 @@
           <w:smallCaps w:val="0"/>
           <w:sz w:val="20"/>
         </w:rPr>
-        <w:t>Holding clicks constant, each unit increase in log(1 + hours) multiplies the odds of Criteo receiving credit by 0.61, whereas each additional click multiplies them by only 1.04 (pseudo R-squared 0.22; Table IV). Table V confirms this directly: the credit share hardly moves with the number of clicks.</w:t>
+        <w:t>With the number of clicks held fixed, each unit of log(1 + hours) multiplies the odds of Criteo getting credit by 0.61. Each extra click multiplies them by just 1.04 (pseudo R-squared 0.22; Table IV). Table V shows the same thing without a model: the credited share barely moves between one click and six.</w:t>
       </w:r>
     </w:p>
     <w:p>
@@ -6422,7 +6506,7 @@
           <w:smallCaps w:val="0"/>
           <w:sz w:val="20"/>
         </w:rPr>
-        <w:t>Under last click, which platform is paid for a sale depends far more on timing than on how much a channel was used. A customer who clicks a display ad and buys an hour later almost always credits it; one who buys a week later, after a search or an email, usually does not.</w:t>
+        <w:t>So under last click, whether a channel gets paid for a sale depends on timing far more than on effort. Click a display ad and buy within the hour, and the ad nearly always gets the credit. Wait a week, search for the product or open an email in between, and it usually does not.</w:t>
       </w:r>
     </w:p>
     <w:p>
@@ -6456,7 +6540,7 @@
           <w:smallCaps w:val="0"/>
           <w:sz w:val="20"/>
         </w:rPr>
-        <w:t>The Google Analytics 360 sample covers 714,167 visitors and 903,653 sessions. Following each visitor across sessions up to the first purchase gives 10,022 converting journeys (1.4% of all journeys). Buying took repeated visits: 52% of converting journeys spanned more than one session (mean 2.28 sessions, maximum 138, against 1.23 for journeys without a purchase), and multi-session buyers took a median of 4.7 days from first visit to purchase. Yet only 12% of converting journeys involved more than one channel. The most common converting paths were a single Referral session (1,755), a single Organic Search session (1,712) and Referral &gt; Referral (969).</w:t>
+        <w:t>The GA360 sample has 714,167 visitors and 903,653 sessions. Tracing each visitor up to their first purchase gives 10,022 converting journeys, 1.4% of all journeys. Most buyers needed more than one visit: 52% of converting journeys had two or more sessions (mean 2.28, maximum 138), against 1.23 sessions for journeys that ended without a sale. Repeat-visit buyers took a median of 4.7 days to decide. Surprisingly, only 12% of converting journeys used more than one channel. The most common paths were a single Referral visit (1,755), a single Organic Search visit (1,712) and Referral &gt; Referral (969).</w:t>
       </w:r>
     </w:p>
     <w:p>
@@ -7214,7 +7298,7 @@
           <w:smallCaps w:val="0"/>
           <w:sz w:val="20"/>
         </w:rPr>
-        <w:t>Channels differ widely in how often a session ends in a purchase (Table VI). Referral sessions converted at 5.1%, while Social, the second-largest source of traffic with 226,117 sessions, converted at 0.05%. Organic Search brought the most sessions but converted at 0.9%.</w:t>
+        <w:t>How often a visit ends in a sale varies a lot by channel (Table VI). Referral visits converted at 5.1%. Social brought the second-largest stream of visits, 226,117, but converted at only 0.05%. Organic Search brought the most visits and converted at 0.9%.</w:t>
       </w:r>
     </w:p>
     <w:p>
@@ -7248,7 +7332,7 @@
           <w:smallCaps/>
           <w:sz w:val="16"/>
         </w:rPr>
-        <w:t>Credit Share by Channel, All Converting Journeys (GA360)</w:t>
+        <w:t>GA360 Credit Share by Channel and Model, All Buying Journeys</w:t>
       </w:r>
     </w:p>
     <w:tbl>
@@ -8294,7 +8378,7 @@
           <w:smallCaps w:val="0"/>
           <w:sz w:val="20"/>
         </w:rPr>
-        <w:t>Because so few journeys mix channels, the seven models broadly agree on the whole sample (Table VII); the largest swing, for Referral, is from 39.9% to 45.5%. The disagreement is concentrated in the 1,189 multi-channel journeys (Fig. 3). There, first touch gives Direct 42% of the credit and last touch 1%, while Referral moves from 13% to 60%; the most common multi-channel paths were Direct &gt; Referral (134) and Organic Search &gt; Referral (94). For these customers the choice of model decides which channel is funded.</w:t>
+        <w:t>Since so few journeys mix channels, the seven models give similar answers for the store as a whole (Table VII). The biggest spread is for Referral, from 39.9% to 45.5%. The disagreement sits in the 1,189 journeys that did mix channels (Fig. 3). For those, first touch gives Direct 42% of the credit and last touch gives it 1%; Referral goes the other way, from 13% to 60%. The two most common mixed paths were Direct &gt; Referral (134) and Organic Search &gt; Referral (94). For these customers, the model decides which channel looks worth paying for.</w:t>
       </w:r>
     </w:p>
     <w:p>
@@ -8351,7 +8435,7 @@
           <w:smallCaps w:val="0"/>
           <w:sz w:val="16"/>
         </w:rPr>
-        <w:t>Fig. 3.  Credit share by channel within the 1,189 GA360 converting journeys that used more than one channel.</w:t>
+        <w:t>Fig. 3.  First-touch, linear and last-touch credit for the 1,189 GA360 buying journeys that mixed channels.</w:t>
       </w:r>
     </w:p>
     <w:p>
@@ -8368,7 +8452,7 @@
           <w:smallCaps w:val="0"/>
           <w:sz w:val="20"/>
         </w:rPr>
-        <w:t>Channels also differ in whether they hand journeys on. The share of converting journeys that ended in a different channel from the one they began with was Display 39%, Paid Search 23%, Direct 23%, Organic Search 10% and Referral 2% (channels starting at least 100 journeys). Journeys that start with Display, Paid Search or Direct are the ones most often closed by another channel, which is exactly where last click moves credit away from the channel that started them; a referral, by contrast, almost never hands on.</w:t>
+        <w:t>Channels also differ in how often they pass a customer on. The share of converting journeys that ended in a different channel from the one they started in was Display 39%, Paid Search 23%, Direct 23%, Organic Search 10% and Referral 2% (counting channels that started at least 100 journeys). Journeys that begin with Display, Paid Search or Direct are the ones most often finished by something else, and these are the cases where last click takes credit away from the channel that started them. A referral almost never hands over.</w:t>
       </w:r>
     </w:p>
     <w:p>
@@ -8385,7 +8469,7 @@
           <w:smallCaps w:val="0"/>
           <w:sz w:val="20"/>
         </w:rPr>
-        <w:t>Two properties of the data qualify these figures. Google Analytics labels a returning direct visit with the source of the visitor's previous campaign: 40,356 of the 104,838 Referral sessions are flagged in the data as direct visits. Direct can therefore rarely follow another channel, which mechanically lowers its last-touch share. And 97% of converting Referral sessions record no referring site, so Referral's large share cannot be read as the value of third-party sites.</w:t>
+        <w:t>Two quirks of the data matter here. When a visitor comes back directly, Google Analytics records the visit under the source of their previous campaign; in this sample 40,356 sessions labelled Referral (out of 104,838) carry the direct-visit flag. That makes it hard for Direct to appear after another channel, which pushes its last-touch share down. Also, 97% of converting Referral sessions have no referring site recorded, so Referral's large share says little about how valuable links from other websites are.</w:t>
       </w:r>
     </w:p>
     <w:p>
@@ -8459,7 +8543,7 @@
           <w:smallCaps w:val="0"/>
           <w:sz w:val="16"/>
         </w:rPr>
-        <w:t>Fig. 4.  Mean absolute error between model and true credit shares (percentage points; bars show the standard deviation over six worlds).</w:t>
+        <w:t>Fig. 4.  Average gap between each model's credit and the true shares, in percentage points; whiskers give the spread across the six simulated worlds.</w:t>
       </w:r>
     </w:p>
     <w:p>
@@ -8493,7 +8577,7 @@
           <w:smallCaps/>
           <w:sz w:val="16"/>
         </w:rPr>
-        <w:t>Accuracy of Attribution Models Against Known Channel Effects</w:t>
+        <w:t>Model Error Against the True Channel Shares</w:t>
       </w:r>
     </w:p>
     <w:tbl>
@@ -9378,7 +9462,7 @@
           <w:smallCaps w:val="0"/>
           <w:sz w:val="20"/>
         </w:rPr>
-        <w:t>When advertising acts immediately, last touch came closest to the truth (4.2 pp), with time decay close behind (4.7 pp). With carry-over effects, last-touch error rose to 7.3 pp and its rank agreement fell from 0.66 to 0.37, while time decay and linear became the most accurate (5.7 and 5.7 pp; Fig. 4, Table VIII). The highest rank agreement came from Shapley value under immediate effects (0.69) and linear under carry-over (0.60), with the Shapley value close behind in both (0.69 and 0.60). First touch was worst in both. The Markov removal effect was never the most accurate under these data-generating processes, a reminder that data-driven does not automatically mean correct.</w:t>
+        <w:t>With ads that work immediately, the smallest error belonged to last touch (4.2 pp), just ahead of time decay (4.7 pp). Once the effect carried over to later visits, the error of last touch climbed to 7.3 pp while its rank correlation slid from 0.66 to 0.37, and time decay and linear tied for the lowest error, 5.7 pp each (Fig. 4, Table VIII). On ranking the channels in the right order, Shapley value did best with immediate effects (0.69) and linear with carry-over (0.60), the Shapley value close behind both times (0.69 and 0.60). Neither scenario was kind to first touch, which had the largest error in both. The Markov model never came out on top in these worlds, so being data-driven did not by itself make it right.</w:t>
       </w:r>
     </w:p>
     <w:p>
@@ -9395,7 +9479,7 @@
           <w:smallCaps w:val="0"/>
           <w:sz w:val="20"/>
         </w:rPr>
-        <w:t>The pattern has a simple explanation. Under immediate effects the touch that triggers a purchase is usually the last one, so last touch is nearly right. Under carry-over the decisive touches come earlier and the purchase happens on a later visit, possibly through a weak channel, so any rule that concentrates credit at one end of the journey errs, and rules that spread credit do better.</w:t>
+        <w:t>The reason is simple. When an ad works on the spot, the touch that causes the sale is usually the final one, so last touch is close to the truth. When the effect builds up, the important touches come early and the sale can happen later through a weak channel. Any rule that piles the credit onto one end of the journey then gets it wrong, and rules that spread it do better.</w:t>
       </w:r>
     </w:p>
     <w:p>
@@ -9452,7 +9536,7 @@
           <w:smallCaps w:val="0"/>
           <w:sz w:val="16"/>
         </w:rPr>
-        <w:t>Fig. 5.  Last-touch and Markov credit shares with 95% bootstrap intervals on 4,000 synthetic journeys with designed channel roles.</w:t>
+        <w:t>Fig. 5.  Credit under last touch and under Markov for 4,000 synthetic journeys with built-in channel roles; whiskers are 95% bootstrap intervals.</w:t>
       </w:r>
     </w:p>
     <w:p>
@@ -9469,7 +9553,7 @@
           <w:smallCaps w:val="0"/>
           <w:sz w:val="20"/>
         </w:rPr>
-        <w:t>On the separate synthetic dataset in which Social and Display were designed to start journeys and Email and Paid Search to close them, the data-driven models recovered those roles (Fig. 5): last touch gave Display 6% of the credit against 11% under Markov, and Email 27% against 17%. The bootstrap intervals are narrow (about plus or minus one percentage point), so these differences are not sampling noise.</w:t>
+        <w:t>In the separate synthetic set where Social and Display open journeys and Email and Paid Search close them, the data-driven models picked up those roles (Fig. 5). Under last touch Display received 6%, while Markov gave it 11%; for Email the figures were 27% and 17%. The bootstrap intervals are about one percentage point either side, far smaller than these gaps.</w:t>
       </w:r>
     </w:p>
     <w:p>
@@ -9503,7 +9587,7 @@
           <w:smallCaps w:val="0"/>
           <w:sz w:val="20"/>
         </w:rPr>
-        <w:t>The overall conversion rate was 15.6%. New visitors converted at 24.9% against 14.1% for returning visitors, who made up 85% of sessions (chi-square p &lt; 0.001). Conversion peaked in Nov (25.5%) and was lowest in Feb (1.7%; Fig. 6). Weekend sessions converted at 17.5% against 15.1% on weekdays (chi-square p = 0.002), a small but significant difference.</w:t>
+        <w:t>15.6% of UCI sessions ended in a purchase. New visitors bought in 24.9% of sessions and returning visitors in 14.1%, even though returning visitors made up 85% of the traffic (chi-square p &lt; 0.001). The best month was Nov (25.5%) and the worst Feb (1.7%; Fig. 6). Weekend sessions converted slightly more often than weekday ones, 17.5% against 15.1% (chi-square p = 0.002).</w:t>
       </w:r>
     </w:p>
     <w:p>
@@ -9560,7 +9644,7 @@
           <w:smallCaps w:val="0"/>
           <w:sz w:val="16"/>
         </w:rPr>
-        <w:t>Fig. 6.  Conversion rate by month in the UCI Online Shoppers data (January and April are absent).</w:t>
+        <w:t>Fig. 6.  Share of UCI sessions ending in a purchase, by month. The data has no January or April.</w:t>
       </w:r>
     </w:p>
     <w:p>
@@ -9594,7 +9678,7 @@
           <w:smallCaps/>
           <w:sz w:val="16"/>
         </w:rPr>
-        <w:t>Session Behaviour of Buyers and Non-Buyers (Means; Mann-Whitney U)</w:t>
+        <w:t>How Buyers and Non-Buyers Browsed (Session Means)</w:t>
       </w:r>
     </w:p>
     <w:tbl>
@@ -10250,7 +10334,7 @@
           <w:smallCaps/>
           <w:sz w:val="16"/>
         </w:rPr>
-        <w:t>Purchase Prediction (ROC-AUC on Held-Out 25%)</w:t>
+        <w:t>Predicting a Purchase: ROC-AUC on the 25% Test Split</w:t>
       </w:r>
     </w:p>
     <w:tbl>
@@ -10553,7 +10637,7 @@
           <w:smallCaps w:val="0"/>
           <w:sz w:val="20"/>
         </w:rPr>
-        <w:t>All ten behavioural measures differed significantly. Buyers viewed a median of 29 product pages against 16 and bounced and exited far less (Table IX). With PageValues the best model reached ROC-AUC 0.932; without it, 0.775, which is the honest estimate of what early-session behaviour reveals (Table X). The strongest signals without PageValues, by permutation importance (drop in AUC), were time on product pages (0.047); exit rate (0.037); a November visit (0.032); product pages viewed (0.012); account/admin pages viewed (0.010). Time spent on product pages carries more information than the number of pages viewed.</w:t>
+        <w:t>All ten behaviour measures differed between buyers and non-buyers. A buyer typically opened 29 product pages, a non-buyer 16, and buyers bounced and left far less often (Table IX). Including PageValues lifted the random forest to an AUC of 0.932; leaving it out brought it down to 0.775, and that is the fair measure of what browsing alone tells a shop (Table X). Without PageValues, the most useful signals by permutation importance (drop in AUC) were time on product pages (0.047); exit rate (0.037); a November visit (0.032); product pages viewed (0.012); account/admin pages viewed (0.010). How long someone stays on product pages says more than how many they open.</w:t>
       </w:r>
     </w:p>
     <w:p>
@@ -10587,7 +10671,426 @@
           <w:smallCaps w:val="0"/>
           <w:sz w:val="20"/>
         </w:rPr>
-        <w:t>ChannelTrace was run on the real Facebook Ad Campaign data. It recognised the export format automatically and reproduced the campaign totals computed independently in Python to the cent (spend 58,705.23; cost per acquisition 54.41). It found that 10.0% of spend went to ad sets with no approved conversions, that the 30-34 age group had the lowest cost per acquisition (30.88 against 99.76 for ages 45-49), and that men converted more cheaply than women (41.44 against 69.70). The browser implementation of all seven attribution models matched the Python reference exactly on the synthetic journeys.</w:t>
+        <w:t>As a check on real advertising data, we loaded the public Facebook campaign export into ChannelTrace. It worked out the file format without help, and its totals agreed exactly with a separate Python calculation (total spend 58,705.23, cost per acquisition 54.41). Its report flagged a tenth of the budget (10.0%) as spent on ad sets that never produced an approved conversion. The cheapest age band was 30-34, at 30.88 per acquisition; the most expensive, 45-49, cost 99.76. Male audiences converted for 41.44 each and female audiences for 69.70. On the synthetic journeys, the browser version of all seven models gave exactly the same credit as the Python version.</w:t>
+      </w:r>
+    </w:p>
+    <w:p>
+      <w:pPr>
+        <w:keepNext/>
+        <w:spacing w:after="40" w:before="80" w:line="240" w:lineRule="auto"/>
+        <w:jc w:val="left"/>
+      </w:pPr>
+      <w:r>
+        <w:rPr>
+          <w:rFonts w:ascii="Times New Roman" w:hAnsi="Times New Roman"/>
+          <w:b w:val="0"/>
+          <w:i/>
+          <w:smallCaps w:val="0"/>
+          <w:sz w:val="20"/>
+        </w:rPr>
+        <w:t>F. Assistant Accuracy (RQ5)</w:t>
+      </w:r>
+    </w:p>
+    <w:p>
+      <w:pPr>
+        <w:keepNext/>
+        <w:spacing w:after="0" w:before="120" w:line="240" w:lineRule="auto"/>
+        <w:jc w:val="center"/>
+      </w:pPr>
+      <w:r>
+        <w:rPr>
+          <w:rFonts w:ascii="Times New Roman" w:hAnsi="Times New Roman"/>
+          <w:b w:val="0"/>
+          <w:i w:val="0"/>
+          <w:smallCaps/>
+          <w:sz w:val="16"/>
+        </w:rPr>
+        <w:t>Table XI</w:t>
+      </w:r>
+    </w:p>
+    <w:p>
+      <w:pPr>
+        <w:keepNext/>
+        <w:spacing w:after="60" w:before="0" w:line="240" w:lineRule="auto"/>
+        <w:jc w:val="center"/>
+      </w:pPr>
+      <w:r>
+        <w:rPr>
+          <w:rFonts w:ascii="Times New Roman" w:hAnsi="Times New Roman"/>
+          <w:b w:val="0"/>
+          <w:i w:val="0"/>
+          <w:smallCaps/>
+          <w:sz w:val="16"/>
+        </w:rPr>
+        <w:t>Assistant Accuracy on the Fixed Question Set</w:t>
+      </w:r>
+    </w:p>
+    <w:tbl>
+      <w:tblPr>
+        <w:tblW w:type="auto" w:w="0"/>
+        <w:jc w:val="center"/>
+        <w:tblLayout w:type="fixed"/>
+        <w:tblLook w:firstColumn="1" w:firstRow="1" w:lastColumn="0" w:lastRow="0" w:noHBand="0" w:noVBand="1" w:val="04A0"/>
+        <w:tblBorders>
+          <w:top w:val="single" w:sz="8" w:color="000000"/>
+          <w:bottom w:val="single" w:sz="8" w:color="000000"/>
+          <w:insideH w:val="single" w:sz="2" w:color="000000"/>
+        </w:tblBorders>
+      </w:tblPr>
+      <w:tblGrid>
+        <w:gridCol w:w="3480"/>
+        <w:gridCol w:w="3480"/>
+        <w:gridCol w:w="3480"/>
+      </w:tblGrid>
+      <w:tr>
+        <w:trPr>
+          <w:cantSplit/>
+          <w:tblHeader/>
+        </w:trPr>
+        <w:tc>
+          <w:tcPr>
+            <w:tcW w:type="dxa" w:w="2304"/>
+          </w:tcPr>
+          <w:p>
+            <w:pPr>
+              <w:keepNext/>
+              <w:jc w:val="left"/>
+            </w:pPr>
+            <w:r/>
+            <w:r>
+              <w:rPr>
+                <w:rFonts w:ascii="Times New Roman" w:hAnsi="Times New Roman"/>
+                <w:b/>
+                <w:sz w:val="16"/>
+              </w:rPr>
+              <w:t>Measure</w:t>
+            </w:r>
+          </w:p>
+        </w:tc>
+        <w:tc>
+          <w:tcPr>
+            <w:tcW w:type="dxa" w:w="1224"/>
+          </w:tcPr>
+          <w:p>
+            <w:pPr>
+              <w:keepNext/>
+              <w:jc w:val="right"/>
+            </w:pPr>
+            <w:r/>
+            <w:r>
+              <w:rPr>
+                <w:rFonts w:ascii="Times New Roman" w:hAnsi="Times New Roman"/>
+                <w:b/>
+                <w:sz w:val="16"/>
+              </w:rPr>
+              <w:t>Generative</w:t>
+            </w:r>
+          </w:p>
+        </w:tc>
+        <w:tc>
+          <w:tcPr>
+            <w:tcW w:type="dxa" w:w="1224"/>
+          </w:tcPr>
+          <w:p>
+            <w:pPr>
+              <w:keepNext/>
+              <w:jc w:val="right"/>
+            </w:pPr>
+            <w:r/>
+            <w:r>
+              <w:rPr>
+                <w:rFonts w:ascii="Times New Roman" w:hAnsi="Times New Roman"/>
+                <w:b/>
+                <w:sz w:val="16"/>
+              </w:rPr>
+              <w:t>Built-in</w:t>
+            </w:r>
+          </w:p>
+        </w:tc>
+      </w:tr>
+      <w:tr>
+        <w:trPr>
+          <w:cantSplit/>
+        </w:trPr>
+        <w:tc>
+          <w:tcPr>
+            <w:tcW w:type="dxa" w:w="2304"/>
+          </w:tcPr>
+          <w:p>
+            <w:pPr>
+              <w:keepNext/>
+              <w:jc w:val="left"/>
+            </w:pPr>
+            <w:r/>
+            <w:r>
+              <w:rPr>
+                <w:rFonts w:ascii="Times New Roman" w:hAnsi="Times New Roman"/>
+                <w:b w:val="0"/>
+                <w:sz w:val="16"/>
+              </w:rPr>
+              <w:t>Answerable, correct</w:t>
+            </w:r>
+          </w:p>
+        </w:tc>
+        <w:tc>
+          <w:tcPr>
+            <w:tcW w:type="dxa" w:w="1224"/>
+          </w:tcPr>
+          <w:p>
+            <w:pPr>
+              <w:keepNext/>
+              <w:jc w:val="right"/>
+            </w:pPr>
+            <w:r/>
+            <w:r>
+              <w:rPr>
+                <w:rFonts w:ascii="Times New Roman" w:hAnsi="Times New Roman"/>
+                <w:b w:val="0"/>
+                <w:sz w:val="16"/>
+              </w:rPr>
+              <w:t>25 / 26</w:t>
+            </w:r>
+          </w:p>
+        </w:tc>
+        <w:tc>
+          <w:tcPr>
+            <w:tcW w:type="dxa" w:w="1224"/>
+          </w:tcPr>
+          <w:p>
+            <w:pPr>
+              <w:keepNext/>
+              <w:jc w:val="right"/>
+            </w:pPr>
+            <w:r/>
+            <w:r>
+              <w:rPr>
+                <w:rFonts w:ascii="Times New Roman" w:hAnsi="Times New Roman"/>
+                <w:b w:val="0"/>
+                <w:sz w:val="16"/>
+              </w:rPr>
+              <w:t>18 / 26</w:t>
+            </w:r>
+          </w:p>
+        </w:tc>
+      </w:tr>
+      <w:tr>
+        <w:trPr>
+          <w:cantSplit/>
+        </w:trPr>
+        <w:tc>
+          <w:tcPr>
+            <w:tcW w:type="dxa" w:w="2304"/>
+          </w:tcPr>
+          <w:p>
+            <w:pPr>
+              <w:keepNext/>
+              <w:jc w:val="left"/>
+            </w:pPr>
+            <w:r/>
+            <w:r>
+              <w:rPr>
+                <w:rFonts w:ascii="Times New Roman" w:hAnsi="Times New Roman"/>
+                <w:b w:val="0"/>
+                <w:sz w:val="16"/>
+              </w:rPr>
+              <w:t>Unanswerable, declined</w:t>
+            </w:r>
+          </w:p>
+        </w:tc>
+        <w:tc>
+          <w:tcPr>
+            <w:tcW w:type="dxa" w:w="1224"/>
+          </w:tcPr>
+          <w:p>
+            <w:pPr>
+              <w:keepNext/>
+              <w:jc w:val="right"/>
+            </w:pPr>
+            <w:r/>
+            <w:r>
+              <w:rPr>
+                <w:rFonts w:ascii="Times New Roman" w:hAnsi="Times New Roman"/>
+                <w:b w:val="0"/>
+                <w:sz w:val="16"/>
+              </w:rPr>
+              <w:t>8 / 8</w:t>
+            </w:r>
+          </w:p>
+        </w:tc>
+        <w:tc>
+          <w:tcPr>
+            <w:tcW w:type="dxa" w:w="1224"/>
+          </w:tcPr>
+          <w:p>
+            <w:pPr>
+              <w:keepNext/>
+              <w:jc w:val="right"/>
+            </w:pPr>
+            <w:r/>
+            <w:r>
+              <w:rPr>
+                <w:rFonts w:ascii="Times New Roman" w:hAnsi="Times New Roman"/>
+                <w:b w:val="0"/>
+                <w:sz w:val="16"/>
+              </w:rPr>
+              <w:t>7 / 8</w:t>
+            </w:r>
+          </w:p>
+        </w:tc>
+      </w:tr>
+      <w:tr>
+        <w:trPr>
+          <w:cantSplit/>
+        </w:trPr>
+        <w:tc>
+          <w:tcPr>
+            <w:tcW w:type="dxa" w:w="2304"/>
+          </w:tcPr>
+          <w:p>
+            <w:pPr>
+              <w:keepNext/>
+              <w:jc w:val="left"/>
+            </w:pPr>
+            <w:r/>
+            <w:r>
+              <w:rPr>
+                <w:rFonts w:ascii="Times New Roman" w:hAnsi="Times New Roman"/>
+                <w:b w:val="0"/>
+                <w:sz w:val="16"/>
+              </w:rPr>
+              <w:t>Overall accuracy</w:t>
+            </w:r>
+          </w:p>
+        </w:tc>
+        <w:tc>
+          <w:tcPr>
+            <w:tcW w:type="dxa" w:w="1224"/>
+          </w:tcPr>
+          <w:p>
+            <w:pPr>
+              <w:keepNext/>
+              <w:jc w:val="right"/>
+            </w:pPr>
+            <w:r/>
+            <w:r>
+              <w:rPr>
+                <w:rFonts w:ascii="Times New Roman" w:hAnsi="Times New Roman"/>
+                <w:b w:val="0"/>
+                <w:sz w:val="16"/>
+              </w:rPr>
+              <w:t>97%</w:t>
+            </w:r>
+          </w:p>
+        </w:tc>
+        <w:tc>
+          <w:tcPr>
+            <w:tcW w:type="dxa" w:w="1224"/>
+          </w:tcPr>
+          <w:p>
+            <w:pPr>
+              <w:keepNext/>
+              <w:jc w:val="right"/>
+            </w:pPr>
+            <w:r/>
+            <w:r>
+              <w:rPr>
+                <w:rFonts w:ascii="Times New Roman" w:hAnsi="Times New Roman"/>
+                <w:b w:val="0"/>
+                <w:sz w:val="16"/>
+              </w:rPr>
+              <w:t>74%</w:t>
+            </w:r>
+          </w:p>
+        </w:tc>
+      </w:tr>
+      <w:tr>
+        <w:trPr>
+          <w:cantSplit/>
+        </w:trPr>
+        <w:tc>
+          <w:tcPr>
+            <w:tcW w:type="dxa" w:w="2304"/>
+          </w:tcPr>
+          <w:p>
+            <w:pPr>
+              <w:keepNext w:val="0"/>
+              <w:jc w:val="left"/>
+            </w:pPr>
+            <w:r/>
+            <w:r>
+              <w:rPr>
+                <w:rFonts w:ascii="Times New Roman" w:hAnsi="Times New Roman"/>
+                <w:b w:val="0"/>
+                <w:sz w:val="16"/>
+              </w:rPr>
+              <w:t>Replies with unsupported numbers</w:t>
+            </w:r>
+          </w:p>
+        </w:tc>
+        <w:tc>
+          <w:tcPr>
+            <w:tcW w:type="dxa" w:w="1224"/>
+          </w:tcPr>
+          <w:p>
+            <w:pPr>
+              <w:keepNext w:val="0"/>
+              <w:jc w:val="right"/>
+            </w:pPr>
+            <w:r/>
+            <w:r>
+              <w:rPr>
+                <w:rFonts w:ascii="Times New Roman" w:hAnsi="Times New Roman"/>
+                <w:b w:val="0"/>
+                <w:sz w:val="16"/>
+              </w:rPr>
+              <w:t>0 / 34</w:t>
+            </w:r>
+          </w:p>
+        </w:tc>
+        <w:tc>
+          <w:tcPr>
+            <w:tcW w:type="dxa" w:w="1224"/>
+          </w:tcPr>
+          <w:p>
+            <w:pPr>
+              <w:keepNext w:val="0"/>
+              <w:jc w:val="right"/>
+            </w:pPr>
+            <w:r/>
+            <w:r>
+              <w:rPr>
+                <w:rFonts w:ascii="Times New Roman" w:hAnsi="Times New Roman"/>
+                <w:b w:val="0"/>
+                <w:sz w:val="16"/>
+              </w:rPr>
+              <w:t>0 / 34</w:t>
+            </w:r>
+          </w:p>
+        </w:tc>
+      </w:tr>
+    </w:tbl>
+    <w:p>
+      <w:pPr>
+        <w:spacing w:after="80" w:before="0" w:line="240" w:lineRule="auto"/>
+        <w:ind w:firstLine="202"/>
+        <w:jc w:val="both"/>
+      </w:pPr>
+    </w:p>
+    <w:p>
+      <w:pPr>
+        <w:spacing w:after="0" w:before="0" w:line="240" w:lineRule="auto"/>
+        <w:ind w:firstLine="202"/>
+        <w:jc w:val="both"/>
+      </w:pPr>
+      <w:r>
+        <w:rPr>
+          <w:rFonts w:ascii="Times New Roman" w:hAnsi="Times New Roman"/>
+          <w:b w:val="0"/>
+          <w:i w:val="0"/>
+          <w:smallCaps w:val="0"/>
+          <w:sz w:val="20"/>
+        </w:rPr>
+        <w:t>The generative path got 25 of the 26 answerable questions right and declined 8 of the 8 it could not answer (Table XI). None of its 34 replies contained a number that is not in the fact sheet. The automatic check marked “What are the strongest early signals of a purchase?” as wrong. Reading every reply ourselves, we would not change the total: the reply to the signals question was right in substance but used a different wording from the one the check looked for (and called medians averages), while the reply on the Markov model's carry-over error, marked right, gave the correct 7.5 pp after first saying, wrongly, that the facts did not contain it. The built-in retrieval model got 18 of 26 right. It can only quote computed statements, so it never makes up a figure, but it recognised only 7 of the 8 questions outside the data; for the rest it returned the nearest related facts, which a reader could take for an answer. The two paths therefore cover each other's weak spot: the generative model is better at saying what the data cannot show, and the fallback guarantees that every number it shows was computed. The test ran on 2026-10-23 on the free Gemini tier (gemini-3.5-flash-lite, gemini-flash-lite-latest).</w:t>
       </w:r>
     </w:p>
     <w:p>
@@ -10638,7 +11141,7 @@
           <w:smallCaps w:val="0"/>
           <w:sz w:val="20"/>
         </w:rPr>
-        <w:t>The Criteo results show concretely why platforms disagree about who made a sale. A display network whose clicks precede every one of these conversions is credited for barely half of them, and its share depends mainly on how long the customer waited before buying. A business that reads last-click reports at face value will therefore undervalue channels whose influence is delayed, such as awareness advertising, and overvalue whichever channel happens to be last, consistent with the incentive problems described by Berman [4] and the search spill-overs found by Kireyev et al. [13].</w:t>
+        <w:t>The Criteo numbers explain why ad platforms rarely agree on who made a sale. Here was a network whose click came before every single purchase, and it got credit for about half, mostly depending on how long the buyer waited. A business that takes last-click reports at face value will underrate channels that work slowly, such as awareness campaigns, and overrate whatever happens to come last. This fits Berman's argument [4] and the display-to-search spill-over found by Kireyev et al. [13].</w:t>
       </w:r>
     </w:p>
     <w:p>
@@ -10655,7 +11158,7 @@
           <w:smallCaps w:val="0"/>
           <w:sz w:val="20"/>
         </w:rPr>
-        <w:t>The simulation explains why the remedy is not simply to switch to a single data-driven model. Model accuracy depended on how advertising works: last touch was competitive when effects were immediate but degraded sharply with carry-over, while linear, time decay and the Shapley value were more robust. Since a business rarely knows its true mechanism, comparing several models, and treating channels whose credit swings strongly between them as uncertain, is the safer practice. ChannelTrace is built around that comparison.</w:t>
+        <w:t>The simulation shows why swapping last click for one data-driven model is not the fix. Which model was right depended on how the ads worked. Last touch was fine for ads that act immediately and poor for ads whose effect builds up; linear, time decay and the Shapley value held up better in both. A business rarely knows which kind of advertising it is running, so it is safer to run several models and treat any channel whose credit jumps around between them as uncertain. ChannelTrace is designed around exactly that comparison.</w:t>
       </w:r>
     </w:p>
     <w:p>
@@ -10672,7 +11175,7 @@
           <w:smallCaps w:val="0"/>
           <w:sz w:val="20"/>
         </w:rPr>
-        <w:t>The GA360 journeys add a practical nuance. For most of this store's customers the attribution model hardly matters, because they return through the same channel; it matters a great deal for the minority who move between channels, typically arriving directly or through search and buying later through a referral link. A business can check this cheaply: if few of its converting journeys mix channels, last-click reports are roughly adequate; if many do, the models must be compared before budgets are moved.</w:t>
+        <w:t>The GA360 store shows that the comparison does not always change the answer. Most of its buyers came back through the channel that first brought them, and for them the model barely matters. It matters a lot for the minority who switch: typically people who first arrive by typing the address or searching, then complete the purchase after following a referral link. Any business can check this for itself: if few converting journeys mix channels, last click is roughly good enough; if many do, compare the models before moving money.</w:t>
       </w:r>
     </w:p>
     <w:p>
@@ -10689,7 +11192,7 @@
           <w:smallCaps w:val="0"/>
           <w:sz w:val="20"/>
         </w:rPr>
-        <w:t>For marketers the session results suggest three practical actions: re-engage returning visitors, who are most of the traffic but convert least; concentrate budget before the seasonal peak; and send paid traffic directly to product pages, where time spent is the strongest early signal of purchase intent. These are suggestions to test, not proven effects; where budgets allow, a holdout experiment [7], [27] is the way to confirm them.</w:t>
+        <w:t>The session data points to three things a shop could try. Returning visitors make up the bulk of traffic yet buy least, so they are worth winning back. Budget is best raised in the weeks leading up to the seasonal peak. And paid traffic should land directly on product pages, where time spent is the clearest early sign of intent. These are ideas to test, not proven effects. Where the budget allows, a holdout test [7], [27] is how to confirm them.</w:t>
       </w:r>
     </w:p>
     <w:p>
@@ -10723,7 +11226,7 @@
           <w:smallCaps w:val="0"/>
           <w:sz w:val="20"/>
         </w:rPr>
-        <w:t>Attribution models are usually compared by how well they predict conversion. Our simulation shows that a model can rank well on that criterion and still distribute credit wrongly, because prediction and credit are different targets. Known-answer simulations, though stylised, give a direct test of credit and are cheap to extend to new mechanisms, and we encourage their use alongside experimental benchmarks. Public journey data with named channels remains scarce; the GA360 sample is one of the few sources and shows how strongly a platform's own channel definitions shape the result.</w:t>
+        <w:t>Attribution models are usually ranked by how well they predict conversion. In our simulation a model could predict reasonably and still hand credit to the wrong channels, because predicting a sale and dividing credit for it are different tasks. Simulations with a known answer are simplified, but they test the credit directly and are cheap to extend, and we think they belong next to experimental benchmarks. Public journey data with named channels is still hard to find. GA360 is one of the few sources, and its relabelling of direct visits shows how much a platform's own definitions can shape the result.</w:t>
       </w:r>
     </w:p>
     <w:p>
@@ -10767,7 +11270,7 @@
           <w:smallCaps w:val="0"/>
           <w:sz w:val="20"/>
         </w:rPr>
-        <w:t xml:space="preserve"> Credit is not causal contribution: every model here, including the data-driven ones, assigns observed conversions and none measures what would have happened without a channel. The simulation's true shares are causal by construction, which is why it is used to judge the models. </w:t>
+        <w:t xml:space="preserve"> Credit is not the same as causal effect. Every model here, including the data-driven ones, shares out sales that happened; none of them says what would have happened without a channel. That is why we judge the models in a simulation whose true shares are causal by design. </w:t>
       </w:r>
       <w:r>
         <w:rPr>
@@ -10787,7 +11290,7 @@
           <w:smallCaps w:val="0"/>
           <w:sz w:val="20"/>
         </w:rPr>
-        <w:t xml:space="preserve"> The Criteo credit flag is the advertiser's own last-click decision and the other channels are not observed, so the recency effect describes how credit was assigned, not why. GA360 journeys depend on a cookie-based visitor identifier and on Google's channel rules, including the relabelling of direct visits. </w:t>
+        <w:t xml:space="preserve"> The Criteo credit flag is the advertiser's own last-click decision, and the competing channels are not in the data, so the recency result describes how credit was given, not why customers bought. GA360 journeys rely on a cookie-based visitor ID and on Google's channel rules, including the relabelling of direct visits. </w:t>
       </w:r>
       <w:r>
         <w:rPr>
@@ -10807,7 +11310,7 @@
           <w:smallCaps w:val="0"/>
           <w:sz w:val="20"/>
         </w:rPr>
-        <w:t xml:space="preserve"> Each dataset represents one store, network or advertiser, mostly from mature markets; results for Indian small businesses may differ and should be checked on their own data, which the tool allows. </w:t>
+        <w:t xml:space="preserve"> Each dataset comes from a single store, network or advertiser, mostly in mature markets. Indian small businesses may behave differently, and the tool lets them check on their own data. </w:t>
       </w:r>
       <w:r>
         <w:rPr>
@@ -10827,7 +11330,7 @@
           <w:smallCaps w:val="0"/>
           <w:sz w:val="20"/>
         </w:rPr>
-        <w:t xml:space="preserve"> With hundreds of thousands of observations almost any difference is significant, so we report effect sizes (credit shares, odds ratios, AUC and error in percentage points) alongside p-values.</w:t>
+        <w:t xml:space="preserve"> With hundreds of thousands of rows almost every difference is significant, so we report sizes (credit shares, odds ratios, AUC, error in percentage points) next to every p-value.</w:t>
       </w:r>
     </w:p>
     <w:p>
@@ -10861,7 +11364,7 @@
           <w:smallCaps w:val="0"/>
           <w:sz w:val="20"/>
         </w:rPr>
-        <w:t>All datasets are public and anonymised, and no personal data was collected. ChannelTrace processes uploaded files in the browser and sends only the aggregated fact sheet, never raw rows, to the generative model. The assistant is instructed to label recommendations as suggestions and to state that the data shows associations, not proof of cause, so that users are not led to over-trust its advice.</w:t>
+        <w:t>Every dataset is public and anonymised, and we collected no personal data. ChannelTrace processes uploads in the browser and sends only the summary fact sheet, never raw rows, to the language model. The assistant is told to mark recommendations as suggestions and to say that the data shows associations rather than causes, so that people do not trust its advice more than the data allows.</w:t>
       </w:r>
     </w:p>
     <w:p>
@@ -10895,7 +11398,7 @@
           <w:smallCaps w:val="0"/>
           <w:sz w:val="20"/>
         </w:rPr>
-        <w:t>All findings are associations. The Criteo sample covers one channel and retains only clicked impressions for converting users, so view-through effects cannot be studied. The UCI traffic sources are anonymised. The simulation uses two stylised mechanisms and six worlds each; other mechanisms, such as diminishing returns or interactions between channels, may favour other models. The GA360 sample is one store, uses Google Analytics' own channel definitions and splits journeys across devices. The accuracy of the assistant has not yet been measured.</w:t>
+        <w:t>Everything we report is an association. The Criteo sample covers one channel and keeps only clicked impressions for buyers, which leaves the effect of ads that were seen but not clicked out of reach. In the UCI data the traffic sources are numbered codes without names. The simulation uses two simplified mechanisms with six worlds each, and others, such as diminishing returns or channels that boost each other, could favour different models. GA360 is one store, uses Google's own channel labels and splits a person who switches devices into two journeys. The assistant was tested once, on questions we wrote ourselves, and the free models behind it keep changing.</w:t>
       </w:r>
     </w:p>
     <w:p>
@@ -10912,7 +11415,7 @@
           <w:smallCaps w:val="0"/>
           <w:sz w:val="20"/>
         </w:rPr>
-        <w:t>Future work has five parts: an accuracy test of the assistant on a fixed question set with known answers; a usability study of the tool with small-business users using the System Usability Scale [46]; a business-intelligence dashboard (Power BI or Looker Studio) on the same data; simulations with further mechanisms and comparison with the neural models of Section II-D [23], [25]; and, with a partner business, a holdout experiment to compare attribution credit with measured incremental lift.</w:t>
+        <w:t>We see four next steps: a usability study with small-business owners using the System Usability Scale [46]; a Power BI or Looker Studio dashboard on the same data; more simulated mechanisms and a comparison with the neural models of Section II-D [23], [25]; and, with a partner business, a holdout experiment to compare attribution credit with measured lift.</w:t>
       </w:r>
     </w:p>
     <w:p>
@@ -10946,7 +11449,7 @@
           <w:smallCaps w:val="0"/>
           <w:sz w:val="20"/>
         </w:rPr>
-        <w:t>Using public data at scale and a simulation with known answers, we found that last-click credit is governed mainly by recency, that attribution models disagree mainly on the customers who move between channels, and that the most accurate attribution model depends on how advertising works. Businesses should therefore compare attribution models rather than trust any single report. ChannelTrace makes that comparison free and accessible, and its grounded assistant explains the results in plain language from computed figures only.</w:t>
+        <w:t>Using large public datasets and a simulation where the answer is known, we found three things. Last-click credit depends mostly on how recently the customer clicked. Attribution models disagree mainly about customers who move between channels. And the most accurate model depends on how the advertising works. A business should therefore compare models instead of trusting any single report. ChannelTrace lets anyone do that for free, and its assistant explains the results in plain language using only the figures the tool computed.</w:t>
       </w:r>
     </w:p>
     <w:p>
@@ -10980,7 +11483,7 @@
           <w:smallCaps w:val="0"/>
           <w:sz w:val="20"/>
         </w:rPr>
-        <w:t>This work was carried out for the MDM Digital Marketing Capstone (BCE27MD06) at Pimpri Chinchwad College of Engineering, Pune, under the guidance of Mrs. Minal Shahakar.</w:t>
+        <w:t>We carried out this project as our MDM Digital Marketing Capstone (course code BCE27MD06) at PCCoE, Pune. We thank our guide, Mrs. Minal Shahakar, for her guidance.</w:t>
       </w:r>
     </w:p>
     <w:p>

</xml_diff>

<commit_message>
Shorten extended paper to 8 pages
Drops figures and tables whose numbers the text already gives (bootstrap and month figures; credit-by-clicks,
behaviour-means, model-summary and channel-rate tables), merges the experiments and clickstream subsections,
folds research implications and ethics into shorter paragraphs, and tightens the assistant results.
The SHAP aside and its reference are removed (45 references). The original draft is unchanged.

Co-Authored-By: Claude Opus 5.5 <noreply@anthropic.com>
</commit_message>
<xml_diff>
--- a/paper/ChannelTrace_Paper_Extended.docx
+++ b/paper/ChannelTrace_Paper_Extended.docx
@@ -725,23 +725,6 @@
     </w:p>
     <w:p>
       <w:pPr>
-        <w:spacing w:after="0" w:before="0" w:line="240" w:lineRule="auto"/>
-        <w:ind w:firstLine="202"/>
-        <w:jc w:val="both"/>
-      </w:pPr>
-      <w:r>
-        <w:rPr>
-          <w:rFonts w:ascii="Times New Roman" w:hAnsi="Times New Roman"/>
-          <w:b w:val="0"/>
-          <w:i w:val="0"/>
-          <w:smallCaps w:val="0"/>
-          <w:sz w:val="20"/>
-        </w:rPr>
-        <w:t>Section II reviews earlier work, Sections III and IV cover the data and methods, Section V describes the tool and Section VI the results. Section VII discusses what the results mean and where they could be wrong, Section VIII lists limitations and next steps, and Section IX concludes.</w:t>
-      </w:r>
-    </w:p>
-    <w:p>
-      <w:pPr>
         <w:keepNext/>
         <w:spacing w:after="60" w:before="160" w:line="240" w:lineRule="auto"/>
         <w:jc w:val="center"/>
@@ -856,7 +839,7 @@
           <w:smallCaps w:val="0"/>
           <w:sz w:val="20"/>
         </w:rPr>
-        <w:t>The Shapley value [17] comes from cooperative game theory: each player's share is its average extra contribution across every possible team. Dalessandro et al. [18] linked it to a causal view of attribution, and Zhao et al. [19] gave simpler versions for advertising data. Singal et al. [20] wrote down the properties a fair attribution rule should have, showed that the common rules break them, and proposed an adjusted Shapley value. The same idea is behind SHAP, the popular way of explaining machine-learning predictions [21].</w:t>
+        <w:t>The Shapley value [17] comes from cooperative game theory: each player's share is its average extra contribution across every possible team. Dalessandro et al. [18] linked it to a causal view of attribution, and Zhao et al. [19] gave simpler versions for advertising data. Singal et al. [20] wrote down the properties a fair attribution rule should have, showed that the common rules break them, and proposed an adjusted Shapley value.</w:t>
       </w:r>
     </w:p>
     <w:p>
@@ -890,7 +873,7 @@
           <w:smallCaps w:val="0"/>
           <w:sz w:val="20"/>
         </w:rPr>
-        <w:t>Newer models learn credit from touchpoint sequences with neural networks: attention with user controls [22], a dual-attention recurrent network that separates the effect of views and clicks [23], a recurrent network that asks what would have happened without each touch [24], and a causal correction for the fact that people are not shown ads at random [25]. Several are tested on the Criteo data [11] that we also use. Their success is judged by how well they predict conversions, and a model can predict well while still giving credit to the wrong channel.</w:t>
+        <w:t>Newer models learn credit from touchpoint sequences with neural networks: attention with user controls [21], a dual-attention recurrent network that separates the effect of views and clicks [22], a recurrent network that asks what would have happened without each touch [23], and a causal correction for the fact that people are not shown ads at random [24]. Several are tested on the Criteo data [11] that we also use. Their success is judged by how well they predict conversions, and a model can predict well while still giving credit to the wrong channel.</w:t>
       </w:r>
     </w:p>
     <w:p>
@@ -907,7 +890,7 @@
           <w:smallCaps w:val="0"/>
           <w:sz w:val="20"/>
         </w:rPr>
-        <w:t>E. Experiments and Incrementality</w:t>
+        <w:t>E. Experiments and Clickstream Prediction</w:t>
       </w:r>
     </w:p>
     <w:p>
@@ -924,7 +907,7 @@
           <w:smallCaps w:val="0"/>
           <w:sz w:val="20"/>
         </w:rPr>
-        <w:t>Experiments measure what attribution tries to estimate. Blake et al. [26] switched off eBay's brand search ads and found that most of the sales they seemed to drive happened anyway. Johnson et al. [27] proposed "ghost ads" to make such tests cheaper, and Gordon et al. [7] compared large Facebook experiments with the observational methods advertisers normally use and found that the latter often missed. Lewis and Rao [6] explain why even large experiments give noisy answers. When an experiment is not possible, a simulation where the true effect is set in advance is the next best way to check a model.</w:t>
+        <w:t>Experiments measure what attribution tries to estimate. Blake et al. [25] switched off eBay's brand search ads and found that most of the sales they seemed to drive happened anyway. Johnson et al. [26] proposed "ghost ads" to make such tests cheaper, and Gordon et al. [7] compared large Facebook experiments with the observational methods advertisers normally use and found that the latter often missed. Lewis and Rao [6] explain why even large experiments give noisy answers. On the conversion side, Moe and Fader [27] showed that the chance of buying changes from one store visit to the next. Montgomery et al. [28] predicted purchase from the order in which pages were browsed, and Bucklin and Sismeiro [29] surveyed clickstream research in marketing. Sakar et al. [30] predicted purchase intent from session features and published the UCI Online Shoppers data we analyse.</w:t>
       </w:r>
     </w:p>
     <w:p>
@@ -941,41 +924,7 @@
           <w:smallCaps w:val="0"/>
           <w:sz w:val="20"/>
         </w:rPr>
-        <w:t>F. Clickstream Conversion Prediction</w:t>
-      </w:r>
-    </w:p>
-    <w:p>
-      <w:pPr>
-        <w:spacing w:after="0" w:before="0" w:line="240" w:lineRule="auto"/>
-        <w:ind w:firstLine="202"/>
-        <w:jc w:val="both"/>
-      </w:pPr>
-      <w:r>
-        <w:rPr>
-          <w:rFonts w:ascii="Times New Roman" w:hAnsi="Times New Roman"/>
-          <w:b w:val="0"/>
-          <w:i w:val="0"/>
-          <w:smallCaps w:val="0"/>
-          <w:sz w:val="20"/>
-        </w:rPr>
-        <w:t>Moe and Fader [28] showed that the chance of buying changes from one store visit to the next. Montgomery et al. [29] predicted purchase from the order in which pages were browsed, and Bucklin and Sismeiro [30] surveyed clickstream research in marketing. Sakar et al. [31] predicted purchase intent from session features and published the UCI Online Shoppers data we analyse.</w:t>
-      </w:r>
-    </w:p>
-    <w:p>
-      <w:pPr>
-        <w:keepNext/>
-        <w:spacing w:after="40" w:before="80" w:line="240" w:lineRule="auto"/>
-        <w:jc w:val="left"/>
-      </w:pPr>
-      <w:r>
-        <w:rPr>
-          <w:rFonts w:ascii="Times New Roman" w:hAnsi="Times New Roman"/>
-          <w:b w:val="0"/>
-          <w:i/>
-          <w:smallCaps w:val="0"/>
-          <w:sz w:val="20"/>
-        </w:rPr>
-        <w:t>G. Research Gap</w:t>
+        <w:t>F. Research Gap</w:t>
       </w:r>
     </w:p>
     <w:p>
@@ -1391,7 +1340,7 @@
                 <w:b w:val="0"/>
                 <w:sz w:val="16"/>
               </w:rPr>
-              <w:t>Ren et al. [23]</w:t>
+              <w:t>Ren et al. [22]</w:t>
             </w:r>
           </w:p>
         </w:tc>
@@ -1476,7 +1425,7 @@
                 <w:b w:val="0"/>
                 <w:sz w:val="16"/>
               </w:rPr>
-              <w:t>Kumar et al. [25]</w:t>
+              <w:t>Kumar et al. [24]</w:t>
             </w:r>
           </w:p>
         </w:tc>
@@ -1907,7 +1856,7 @@
                 <w:b w:val="0"/>
                 <w:sz w:val="16"/>
               </w:rPr>
-              <w:t>UCI Online Shoppers [31]</w:t>
+              <w:t>UCI Online Shoppers [30]</w:t>
             </w:r>
           </w:p>
         </w:tc>
@@ -2037,7 +1986,7 @@
                 <w:b w:val="0"/>
                 <w:sz w:val="16"/>
               </w:rPr>
-              <w:t>Google Analytics 360 sample [32]</w:t>
+              <w:t>Google Analytics 360 sample [31]</w:t>
             </w:r>
           </w:p>
         </w:tc>
@@ -2102,7 +2051,7 @@
                 <w:b w:val="0"/>
                 <w:sz w:val="16"/>
               </w:rPr>
-              <w:t>Facebook Ad Campaign [33]</w:t>
+              <w:t>Facebook Ad Campaign [32]</w:t>
             </w:r>
           </w:p>
         </w:tc>
@@ -2299,7 +2248,7 @@
           <w:smallCaps w:val="0"/>
           <w:sz w:val="20"/>
         </w:rPr>
-        <w:t>UCI Online Shoppers.</w:t>
+        <w:t>UCI Online Shoppers</w:t>
       </w:r>
       <w:r>
         <w:rPr>
@@ -2309,7 +2258,7 @@
           <w:smallCaps w:val="0"/>
           <w:sz w:val="20"/>
         </w:rPr>
-        <w:t xml:space="preserve"> One year of sessions from a single online shop. For each session the data gives how many account, information and product pages were opened and for how long, the bounce and exit rates, a page-value score from Google Analytics, the month, whether the visitor was new, whether it was a weekend, a traffic-source code and whether the session ended in a sale. 125 rows were exact copies of others and were dropped.</w:t>
+        <w:t xml:space="preserve"> covers one year of sessions in one shop: page counts and time by page type, bounce and exit rates, a page-value score, month, visitor type, weekend and whether the session ended in a sale.</w:t>
       </w:r>
     </w:p>
     <w:p>
@@ -2364,73 +2313,6 @@
           <w:sz w:val="20"/>
         </w:rPr>
         <w:t xml:space="preserve"> Google publishes a year of anonymised sessions from its own Merchandise Store, August 2016 to August 2017, in BigQuery. Each session has a visitor ID that persists across visits, a start time, Google's channel label and a transaction count. We defined a journey as a visitor's sessions in time order up to and including the first one with a purchase; for visitors who never bought it runs to their last session. We queried it through the free BigQuery sandbox. Our computer could not hold every journey in memory, so buyers' journeys were downloaded one by one and the rest were counted by channel path inside BigQuery, which is all the Markov model needs.</w:t>
-      </w:r>
-    </w:p>
-    <w:p>
-      <w:pPr>
-        <w:spacing w:after="0" w:before="0" w:line="240" w:lineRule="auto"/>
-        <w:ind w:firstLine="202"/>
-        <w:jc w:val="both"/>
-      </w:pPr>
-      <w:r>
-        <w:rPr>
-          <w:rFonts w:ascii="Times New Roman" w:hAnsi="Times New Roman"/>
-          <w:b w:val="0"/>
-          <w:i/>
-          <w:smallCaps w:val="0"/>
-          <w:sz w:val="20"/>
-        </w:rPr>
-        <w:t>Facebook Ad Campaign.</w:t>
-      </w:r>
-      <w:r>
-        <w:rPr>
-          <w:rFonts w:ascii="Times New Roman" w:hAnsi="Times New Roman"/>
-          <w:b w:val="0"/>
-          <w:i w:val="0"/>
-          <w:smallCaps w:val="0"/>
-          <w:sz w:val="20"/>
-        </w:rPr>
-        <w:t xml:space="preserve"> A public export of 1,143 ads with spend, impressions, clicks, conversions and the age and gender targeted. We used it as a realistic upload to test the tool. The </w:t>
-      </w:r>
-      <w:r>
-        <w:rPr>
-          <w:rFonts w:ascii="Times New Roman" w:hAnsi="Times New Roman"/>
-          <w:b w:val="0"/>
-          <w:i/>
-          <w:smallCaps w:val="0"/>
-          <w:sz w:val="20"/>
-        </w:rPr>
-        <w:t>simulated journeys</w:t>
-      </w:r>
-      <w:r>
-        <w:rPr>
-          <w:rFonts w:ascii="Times New Roman" w:hAnsi="Times New Roman"/>
-          <w:b w:val="0"/>
-          <w:i w:val="0"/>
-          <w:smallCaps w:val="0"/>
-          <w:sz w:val="20"/>
-        </w:rPr>
-        <w:t xml:space="preserve"> and the </w:t>
-      </w:r>
-      <w:r>
-        <w:rPr>
-          <w:rFonts w:ascii="Times New Roman" w:hAnsi="Times New Roman"/>
-          <w:b w:val="0"/>
-          <w:i/>
-          <w:smallCaps w:val="0"/>
-          <w:sz w:val="20"/>
-        </w:rPr>
-        <w:t>assistant test set</w:t>
-      </w:r>
-      <w:r>
-        <w:rPr>
-          <w:rFonts w:ascii="Times New Roman" w:hAnsi="Times New Roman"/>
-          <w:b w:val="0"/>
-          <w:i w:val="0"/>
-          <w:smallCaps w:val="0"/>
-          <w:sz w:val="20"/>
-        </w:rPr>
-        <w:t xml:space="preserve"> are described in Section IV.</w:t>
       </w:r>
     </w:p>
     <w:p>
@@ -3305,7 +3187,7 @@
           <w:smallCaps w:val="0"/>
           <w:sz w:val="20"/>
         </w:rPr>
-        <w:t xml:space="preserve"> [34], and </w:t>
+        <w:t xml:space="preserve"> [33], and </w:t>
       </w:r>
       <m:oMath xmlns:mml="http://www.w3.org/1998/Math/MathML">
         <m:r>
@@ -3799,749 +3681,8 @@
           <w:smallCaps w:val="0"/>
           <w:sz w:val="20"/>
         </w:rPr>
-        <w:t>; our implementation allows up to 12 channels, more than any dataset here has. Table III lists the seven models side by side.</w:t>
-      </w:r>
-    </w:p>
-    <w:p>
-      <w:pPr>
-        <w:keepNext/>
-        <w:spacing w:after="0" w:before="120" w:line="240" w:lineRule="auto"/>
-        <w:jc w:val="center"/>
-      </w:pPr>
-      <w:r>
-        <w:rPr>
-          <w:rFonts w:ascii="Times New Roman" w:hAnsi="Times New Roman"/>
-          <w:b w:val="0"/>
-          <w:i w:val="0"/>
-          <w:smallCaps/>
-          <w:sz w:val="16"/>
-        </w:rPr>
-        <w:t>Table III</w:t>
-      </w:r>
-    </w:p>
-    <w:p>
-      <w:pPr>
-        <w:keepNext/>
-        <w:spacing w:after="60" w:before="0" w:line="240" w:lineRule="auto"/>
-        <w:jc w:val="center"/>
-      </w:pPr>
-      <w:r>
-        <w:rPr>
-          <w:rFonts w:ascii="Times New Roman" w:hAnsi="Times New Roman"/>
-          <w:b w:val="0"/>
-          <w:i w:val="0"/>
-          <w:smallCaps/>
-          <w:sz w:val="16"/>
-        </w:rPr>
-        <w:t>Attribution Models Compared</w:t>
-      </w:r>
-    </w:p>
-    <w:tbl>
-      <w:tblPr>
-        <w:tblW w:type="auto" w:w="0"/>
-        <w:jc w:val="center"/>
-        <w:tblLayout w:type="fixed"/>
-        <w:tblLook w:firstColumn="1" w:firstRow="1" w:lastColumn="0" w:lastRow="0" w:noHBand="0" w:noVBand="1" w:val="04A0"/>
-        <w:tblBorders>
-          <w:top w:val="single" w:sz="8" w:color="000000"/>
-          <w:bottom w:val="single" w:sz="8" w:color="000000"/>
-          <w:insideH w:val="single" w:sz="2" w:color="000000"/>
-        </w:tblBorders>
-      </w:tblPr>
-      <w:tblGrid>
-        <w:gridCol w:w="2610"/>
-        <w:gridCol w:w="2610"/>
-        <w:gridCol w:w="2610"/>
-        <w:gridCol w:w="2610"/>
-      </w:tblGrid>
-      <w:tr>
-        <w:trPr>
-          <w:cantSplit/>
-          <w:tblHeader/>
-        </w:trPr>
-        <w:tc>
-          <w:tcPr>
-            <w:tcW w:type="dxa" w:w="1080"/>
-          </w:tcPr>
-          <w:p>
-            <w:pPr>
-              <w:keepNext/>
-              <w:jc w:val="left"/>
-            </w:pPr>
-            <w:r/>
-            <w:r>
-              <w:rPr>
-                <w:rFonts w:ascii="Times New Roman" w:hAnsi="Times New Roman"/>
-                <w:b/>
-                <w:sz w:val="16"/>
-              </w:rPr>
-              <w:t>Model</w:t>
-            </w:r>
-          </w:p>
-        </w:tc>
-        <w:tc>
-          <w:tcPr>
-            <w:tcW w:type="dxa" w:w="1368"/>
-          </w:tcPr>
-          <w:p>
-            <w:pPr>
-              <w:keepNext/>
-              <w:jc w:val="left"/>
-            </w:pPr>
-            <w:r/>
-            <w:r>
-              <w:rPr>
-                <w:rFonts w:ascii="Times New Roman" w:hAnsi="Times New Roman"/>
-                <w:b/>
-                <w:sz w:val="16"/>
-              </w:rPr>
-              <w:t>Credit rule</w:t>
-            </w:r>
-          </w:p>
-        </w:tc>
-        <w:tc>
-          <w:tcPr>
-            <w:tcW w:type="dxa" w:w="792"/>
-          </w:tcPr>
-          <w:p>
-            <w:pPr>
-              <w:keepNext/>
-              <w:jc w:val="left"/>
-            </w:pPr>
-            <w:r/>
-            <w:r>
-              <w:rPr>
-                <w:rFonts w:ascii="Times New Roman" w:hAnsi="Times New Roman"/>
-                <w:b/>
-                <w:sz w:val="16"/>
-              </w:rPr>
-              <w:t>Uses non-buyers</w:t>
-            </w:r>
-          </w:p>
-        </w:tc>
-        <w:tc>
-          <w:tcPr>
-            <w:tcW w:type="dxa" w:w="1800"/>
-          </w:tcPr>
-          <w:p>
-            <w:pPr>
-              <w:keepNext/>
-              <w:jc w:val="left"/>
-            </w:pPr>
-            <w:r/>
-            <w:r>
-              <w:rPr>
-                <w:rFonts w:ascii="Times New Roman" w:hAnsi="Times New Roman"/>
-                <w:b/>
-                <w:sz w:val="16"/>
-              </w:rPr>
-              <w:t>Implicit assumption</w:t>
-            </w:r>
-          </w:p>
-        </w:tc>
-      </w:tr>
-      <w:tr>
-        <w:trPr>
-          <w:cantSplit/>
-        </w:trPr>
-        <w:tc>
-          <w:tcPr>
-            <w:tcW w:type="dxa" w:w="1080"/>
-          </w:tcPr>
-          <w:p>
-            <w:pPr>
-              <w:keepNext/>
-              <w:jc w:val="left"/>
-            </w:pPr>
-            <w:r/>
-            <w:r>
-              <w:rPr>
-                <w:rFonts w:ascii="Times New Roman" w:hAnsi="Times New Roman"/>
-                <w:b w:val="0"/>
-                <w:sz w:val="16"/>
-              </w:rPr>
-              <w:t>First touch</w:t>
-            </w:r>
-          </w:p>
-        </w:tc>
-        <w:tc>
-          <w:tcPr>
-            <w:tcW w:type="dxa" w:w="1368"/>
-          </w:tcPr>
-          <w:p>
-            <w:pPr>
-              <w:keepNext/>
-              <w:jc w:val="left"/>
-            </w:pPr>
-            <w:r/>
-            <w:r>
-              <w:rPr>
-                <w:rFonts w:ascii="Times New Roman" w:hAnsi="Times New Roman"/>
-                <w:b w:val="0"/>
-                <w:sz w:val="16"/>
-              </w:rPr>
-              <w:t>All to first touch</w:t>
-            </w:r>
-          </w:p>
-        </w:tc>
-        <w:tc>
-          <w:tcPr>
-            <w:tcW w:type="dxa" w:w="792"/>
-          </w:tcPr>
-          <w:p>
-            <w:pPr>
-              <w:keepNext/>
-              <w:jc w:val="left"/>
-            </w:pPr>
-            <w:r/>
-            <w:r>
-              <w:rPr>
-                <w:rFonts w:ascii="Times New Roman" w:hAnsi="Times New Roman"/>
-                <w:b w:val="0"/>
-                <w:sz w:val="16"/>
-              </w:rPr>
-              <w:t>No</w:t>
-            </w:r>
-          </w:p>
-        </w:tc>
-        <w:tc>
-          <w:tcPr>
-            <w:tcW w:type="dxa" w:w="1800"/>
-          </w:tcPr>
-          <w:p>
-            <w:pPr>
-              <w:keepNext/>
-              <w:jc w:val="left"/>
-            </w:pPr>
-            <w:r/>
-            <w:r>
-              <w:rPr>
-                <w:rFonts w:ascii="Times New Roman" w:hAnsi="Times New Roman"/>
-                <w:b w:val="0"/>
-                <w:sz w:val="16"/>
-              </w:rPr>
-              <w:t>Discovery drives sales</w:t>
-            </w:r>
-          </w:p>
-        </w:tc>
-      </w:tr>
-      <w:tr>
-        <w:trPr>
-          <w:cantSplit/>
-        </w:trPr>
-        <w:tc>
-          <w:tcPr>
-            <w:tcW w:type="dxa" w:w="1080"/>
-          </w:tcPr>
-          <w:p>
-            <w:pPr>
-              <w:keepNext/>
-              <w:jc w:val="left"/>
-            </w:pPr>
-            <w:r/>
-            <w:r>
-              <w:rPr>
-                <w:rFonts w:ascii="Times New Roman" w:hAnsi="Times New Roman"/>
-                <w:b w:val="0"/>
-                <w:sz w:val="16"/>
-              </w:rPr>
-              <w:t>Last touch</w:t>
-            </w:r>
-          </w:p>
-        </w:tc>
-        <w:tc>
-          <w:tcPr>
-            <w:tcW w:type="dxa" w:w="1368"/>
-          </w:tcPr>
-          <w:p>
-            <w:pPr>
-              <w:keepNext/>
-              <w:jc w:val="left"/>
-            </w:pPr>
-            <w:r/>
-            <w:r>
-              <w:rPr>
-                <w:rFonts w:ascii="Times New Roman" w:hAnsi="Times New Roman"/>
-                <w:b w:val="0"/>
-                <w:sz w:val="16"/>
-              </w:rPr>
-              <w:t>All to last touch</w:t>
-            </w:r>
-          </w:p>
-        </w:tc>
-        <w:tc>
-          <w:tcPr>
-            <w:tcW w:type="dxa" w:w="792"/>
-          </w:tcPr>
-          <w:p>
-            <w:pPr>
-              <w:keepNext/>
-              <w:jc w:val="left"/>
-            </w:pPr>
-            <w:r/>
-            <w:r>
-              <w:rPr>
-                <w:rFonts w:ascii="Times New Roman" w:hAnsi="Times New Roman"/>
-                <w:b w:val="0"/>
-                <w:sz w:val="16"/>
-              </w:rPr>
-              <w:t>No</w:t>
-            </w:r>
-          </w:p>
-        </w:tc>
-        <w:tc>
-          <w:tcPr>
-            <w:tcW w:type="dxa" w:w="1800"/>
-          </w:tcPr>
-          <w:p>
-            <w:pPr>
-              <w:keepNext/>
-              <w:jc w:val="left"/>
-            </w:pPr>
-            <w:r/>
-            <w:r>
-              <w:rPr>
-                <w:rFonts w:ascii="Times New Roman" w:hAnsi="Times New Roman"/>
-                <w:b w:val="0"/>
-                <w:sz w:val="16"/>
-              </w:rPr>
-              <w:t>Closing drives sales</w:t>
-            </w:r>
-          </w:p>
-        </w:tc>
-      </w:tr>
-      <w:tr>
-        <w:trPr>
-          <w:cantSplit/>
-        </w:trPr>
-        <w:tc>
-          <w:tcPr>
-            <w:tcW w:type="dxa" w:w="1080"/>
-          </w:tcPr>
-          <w:p>
-            <w:pPr>
-              <w:keepNext/>
-              <w:jc w:val="left"/>
-            </w:pPr>
-            <w:r/>
-            <w:r>
-              <w:rPr>
-                <w:rFonts w:ascii="Times New Roman" w:hAnsi="Times New Roman"/>
-                <w:b w:val="0"/>
-                <w:sz w:val="16"/>
-              </w:rPr>
-              <w:t>Linear</w:t>
-            </w:r>
-          </w:p>
-        </w:tc>
-        <w:tc>
-          <w:tcPr>
-            <w:tcW w:type="dxa" w:w="1368"/>
-          </w:tcPr>
-          <w:p>
-            <w:pPr>
-              <w:keepNext/>
-              <w:jc w:val="left"/>
-            </w:pPr>
-            <w:r/>
-            <w:r>
-              <w:rPr>
-                <w:rFonts w:ascii="Times New Roman" w:hAnsi="Times New Roman"/>
-                <w:b w:val="0"/>
-                <w:sz w:val="16"/>
-              </w:rPr>
-              <w:t>1/n to each touch</w:t>
-            </w:r>
-          </w:p>
-        </w:tc>
-        <w:tc>
-          <w:tcPr>
-            <w:tcW w:type="dxa" w:w="792"/>
-          </w:tcPr>
-          <w:p>
-            <w:pPr>
-              <w:keepNext/>
-              <w:jc w:val="left"/>
-            </w:pPr>
-            <w:r/>
-            <w:r>
-              <w:rPr>
-                <w:rFonts w:ascii="Times New Roman" w:hAnsi="Times New Roman"/>
-                <w:b w:val="0"/>
-                <w:sz w:val="16"/>
-              </w:rPr>
-              <w:t>No</w:t>
-            </w:r>
-          </w:p>
-        </w:tc>
-        <w:tc>
-          <w:tcPr>
-            <w:tcW w:type="dxa" w:w="1800"/>
-          </w:tcPr>
-          <w:p>
-            <w:pPr>
-              <w:keepNext/>
-              <w:jc w:val="left"/>
-            </w:pPr>
-            <w:r/>
-            <w:r>
-              <w:rPr>
-                <w:rFonts w:ascii="Times New Roman" w:hAnsi="Times New Roman"/>
-                <w:b w:val="0"/>
-                <w:sz w:val="16"/>
-              </w:rPr>
-              <w:t>All touches equal</w:t>
-            </w:r>
-          </w:p>
-        </w:tc>
-      </w:tr>
-      <w:tr>
-        <w:trPr>
-          <w:cantSplit/>
-        </w:trPr>
-        <w:tc>
-          <w:tcPr>
-            <w:tcW w:type="dxa" w:w="1080"/>
-          </w:tcPr>
-          <w:p>
-            <w:pPr>
-              <w:keepNext/>
-              <w:jc w:val="left"/>
-            </w:pPr>
-            <w:r/>
-            <w:r>
-              <w:rPr>
-                <w:rFonts w:ascii="Times New Roman" w:hAnsi="Times New Roman"/>
-                <w:b w:val="0"/>
-                <w:sz w:val="16"/>
-              </w:rPr>
-              <w:t>Time decay</w:t>
-            </w:r>
-          </w:p>
-        </w:tc>
-        <w:tc>
-          <w:tcPr>
-            <w:tcW w:type="dxa" w:w="1368"/>
-          </w:tcPr>
-          <w:p>
-            <w:pPr>
-              <w:keepNext/>
-              <w:jc w:val="left"/>
-            </w:pPr>
-            <w:r/>
-            <w:r>
-              <w:rPr>
-                <w:rFonts w:ascii="Times New Roman" w:hAnsi="Times New Roman"/>
-                <w:b w:val="0"/>
-                <w:sz w:val="16"/>
-              </w:rPr>
-              <w:t>Halves every 7 days</w:t>
-            </w:r>
-          </w:p>
-        </w:tc>
-        <w:tc>
-          <w:tcPr>
-            <w:tcW w:type="dxa" w:w="792"/>
-          </w:tcPr>
-          <w:p>
-            <w:pPr>
-              <w:keepNext/>
-              <w:jc w:val="left"/>
-            </w:pPr>
-            <w:r/>
-            <w:r>
-              <w:rPr>
-                <w:rFonts w:ascii="Times New Roman" w:hAnsi="Times New Roman"/>
-                <w:b w:val="0"/>
-                <w:sz w:val="16"/>
-              </w:rPr>
-              <w:t>No</w:t>
-            </w:r>
-          </w:p>
-        </w:tc>
-        <w:tc>
-          <w:tcPr>
-            <w:tcW w:type="dxa" w:w="1800"/>
-          </w:tcPr>
-          <w:p>
-            <w:pPr>
-              <w:keepNext/>
-              <w:jc w:val="left"/>
-            </w:pPr>
-            <w:r/>
-            <w:r>
-              <w:rPr>
-                <w:rFonts w:ascii="Times New Roman" w:hAnsi="Times New Roman"/>
-                <w:b w:val="0"/>
-                <w:sz w:val="16"/>
-              </w:rPr>
-              <w:t>Recent touches matter more</w:t>
-            </w:r>
-          </w:p>
-        </w:tc>
-      </w:tr>
-      <w:tr>
-        <w:trPr>
-          <w:cantSplit/>
-        </w:trPr>
-        <w:tc>
-          <w:tcPr>
-            <w:tcW w:type="dxa" w:w="1080"/>
-          </w:tcPr>
-          <w:p>
-            <w:pPr>
-              <w:keepNext/>
-              <w:jc w:val="left"/>
-            </w:pPr>
-            <w:r/>
-            <w:r>
-              <w:rPr>
-                <w:rFonts w:ascii="Times New Roman" w:hAnsi="Times New Roman"/>
-                <w:b w:val="0"/>
-                <w:sz w:val="16"/>
-              </w:rPr>
-              <w:t>Position based</w:t>
-            </w:r>
-          </w:p>
-        </w:tc>
-        <w:tc>
-          <w:tcPr>
-            <w:tcW w:type="dxa" w:w="1368"/>
-          </w:tcPr>
-          <w:p>
-            <w:pPr>
-              <w:keepNext/>
-              <w:jc w:val="left"/>
-            </w:pPr>
-            <w:r/>
-            <w:r>
-              <w:rPr>
-                <w:rFonts w:ascii="Times New Roman" w:hAnsi="Times New Roman"/>
-                <w:b w:val="0"/>
-                <w:sz w:val="16"/>
-              </w:rPr>
-              <w:t>40/20/40</w:t>
-            </w:r>
-          </w:p>
-        </w:tc>
-        <w:tc>
-          <w:tcPr>
-            <w:tcW w:type="dxa" w:w="792"/>
-          </w:tcPr>
-          <w:p>
-            <w:pPr>
-              <w:keepNext/>
-              <w:jc w:val="left"/>
-            </w:pPr>
-            <w:r/>
-            <w:r>
-              <w:rPr>
-                <w:rFonts w:ascii="Times New Roman" w:hAnsi="Times New Roman"/>
-                <w:b w:val="0"/>
-                <w:sz w:val="16"/>
-              </w:rPr>
-              <w:t>No</w:t>
-            </w:r>
-          </w:p>
-        </w:tc>
-        <w:tc>
-          <w:tcPr>
-            <w:tcW w:type="dxa" w:w="1800"/>
-          </w:tcPr>
-          <w:p>
-            <w:pPr>
-              <w:keepNext/>
-              <w:jc w:val="left"/>
-            </w:pPr>
-            <w:r/>
-            <w:r>
-              <w:rPr>
-                <w:rFonts w:ascii="Times New Roman" w:hAnsi="Times New Roman"/>
-                <w:b w:val="0"/>
-                <w:sz w:val="16"/>
-              </w:rPr>
-              <w:t>Opening and closing matter</w:t>
-            </w:r>
-          </w:p>
-        </w:tc>
-      </w:tr>
-      <w:tr>
-        <w:trPr>
-          <w:cantSplit/>
-        </w:trPr>
-        <w:tc>
-          <w:tcPr>
-            <w:tcW w:type="dxa" w:w="1080"/>
-          </w:tcPr>
-          <w:p>
-            <w:pPr>
-              <w:keepNext/>
-              <w:jc w:val="left"/>
-            </w:pPr>
-            <w:r/>
-            <w:r>
-              <w:rPr>
-                <w:rFonts w:ascii="Times New Roman" w:hAnsi="Times New Roman"/>
-                <w:b w:val="0"/>
-                <w:sz w:val="16"/>
-              </w:rPr>
-              <w:t>Markov chain</w:t>
-            </w:r>
-          </w:p>
-        </w:tc>
-        <w:tc>
-          <w:tcPr>
-            <w:tcW w:type="dxa" w:w="1368"/>
-          </w:tcPr>
-          <w:p>
-            <w:pPr>
-              <w:keepNext/>
-              <w:jc w:val="left"/>
-            </w:pPr>
-            <w:r/>
-            <w:r>
-              <w:rPr>
-                <w:rFonts w:ascii="Times New Roman" w:hAnsi="Times New Roman"/>
-                <w:b w:val="0"/>
-                <w:sz w:val="16"/>
-              </w:rPr>
-              <w:t>Removal effect (4)-(5)</w:t>
-            </w:r>
-          </w:p>
-        </w:tc>
-        <w:tc>
-          <w:tcPr>
-            <w:tcW w:type="dxa" w:w="792"/>
-          </w:tcPr>
-          <w:p>
-            <w:pPr>
-              <w:keepNext/>
-              <w:jc w:val="left"/>
-            </w:pPr>
-            <w:r/>
-            <w:r>
-              <w:rPr>
-                <w:rFonts w:ascii="Times New Roman" w:hAnsi="Times New Roman"/>
-                <w:b w:val="0"/>
-                <w:sz w:val="16"/>
-              </w:rPr>
-              <w:t>Yes</w:t>
-            </w:r>
-          </w:p>
-        </w:tc>
-        <w:tc>
-          <w:tcPr>
-            <w:tcW w:type="dxa" w:w="1800"/>
-          </w:tcPr>
-          <w:p>
-            <w:pPr>
-              <w:keepNext/>
-              <w:jc w:val="left"/>
-            </w:pPr>
-            <w:r/>
-            <w:r>
-              <w:rPr>
-                <w:rFonts w:ascii="Times New Roman" w:hAnsi="Times New Roman"/>
-                <w:b w:val="0"/>
-                <w:sz w:val="16"/>
-              </w:rPr>
-              <w:t>Next step depends on current channel</w:t>
-            </w:r>
-          </w:p>
-        </w:tc>
-      </w:tr>
-      <w:tr>
-        <w:trPr>
-          <w:cantSplit/>
-        </w:trPr>
-        <w:tc>
-          <w:tcPr>
-            <w:tcW w:type="dxa" w:w="1080"/>
-          </w:tcPr>
-          <w:p>
-            <w:pPr>
-              <w:keepNext w:val="0"/>
-              <w:jc w:val="left"/>
-            </w:pPr>
-            <w:r/>
-            <w:r>
-              <w:rPr>
-                <w:rFonts w:ascii="Times New Roman" w:hAnsi="Times New Roman"/>
-                <w:b w:val="0"/>
-                <w:sz w:val="16"/>
-              </w:rPr>
-              <w:t>Shapley value</w:t>
-            </w:r>
-          </w:p>
-        </w:tc>
-        <w:tc>
-          <w:tcPr>
-            <w:tcW w:type="dxa" w:w="1368"/>
-          </w:tcPr>
-          <w:p>
-            <w:pPr>
-              <w:keepNext w:val="0"/>
-              <w:jc w:val="left"/>
-            </w:pPr>
-            <w:r/>
-            <w:r>
-              <w:rPr>
-                <w:rFonts w:ascii="Times New Roman" w:hAnsi="Times New Roman"/>
-                <w:b w:val="0"/>
-                <w:sz w:val="16"/>
-              </w:rPr>
-              <w:t>Marginal contribution (6)</w:t>
-            </w:r>
-          </w:p>
-        </w:tc>
-        <w:tc>
-          <w:tcPr>
-            <w:tcW w:type="dxa" w:w="792"/>
-          </w:tcPr>
-          <w:p>
-            <w:pPr>
-              <w:keepNext w:val="0"/>
-              <w:jc w:val="left"/>
-            </w:pPr>
-            <w:r/>
-            <w:r>
-              <w:rPr>
-                <w:rFonts w:ascii="Times New Roman" w:hAnsi="Times New Roman"/>
-                <w:b w:val="0"/>
-                <w:sz w:val="16"/>
-              </w:rPr>
-              <w:t>No</w:t>
-            </w:r>
-          </w:p>
-        </w:tc>
-        <w:tc>
-          <w:tcPr>
-            <w:tcW w:type="dxa" w:w="1800"/>
-          </w:tcPr>
-          <w:p>
-            <w:pPr>
-              <w:keepNext w:val="0"/>
-              <w:jc w:val="left"/>
-            </w:pPr>
-            <w:r/>
-            <w:r>
-              <w:rPr>
-                <w:rFonts w:ascii="Times New Roman" w:hAnsi="Times New Roman"/>
-                <w:b w:val="0"/>
-                <w:sz w:val="16"/>
-              </w:rPr>
-              <w:t>Channels cooperate as a coalition</w:t>
-            </w:r>
-          </w:p>
-        </w:tc>
-      </w:tr>
-    </w:tbl>
-    <w:p>
-      <w:pPr>
-        <w:spacing w:after="80" w:before="0" w:line="240" w:lineRule="auto"/>
-        <w:ind w:firstLine="202"/>
-        <w:jc w:val="both"/>
-      </w:pPr>
+        <w:t>; our implementation allows up to 12 channels, more than any dataset here has.</w:t>
+      </w:r>
     </w:p>
     <w:p>
       <w:pPr>
@@ -5102,7 +4243,7 @@
           <w:smallCaps w:val="0"/>
           <w:sz w:val="20"/>
         </w:rPr>
-        <w:t>in percentage points, and by Spearman's rank correlation [35] with the true shares. We ran six worlds of 3,000 users for each scenario. To check how stable the credit is, we also drew 200 bootstrap resamples [36] of a separate synthetic set in which Social and Display were built to open journeys while Email and Paid Search were built to finish them.</w:t>
+        <w:t>in percentage points, and by Spearman's rank correlation [34] with the true shares. We ran six worlds of 3,000 users for each scenario. To check how stable the credit is, we also drew 200 bootstrap resamples [35] of a separate synthetic set in which Social and Display were built to open journeys while Email and Paid Search were built to finish them.</w:t>
       </w:r>
     </w:p>
     <w:p>
@@ -5226,7 +4367,7 @@
           <w:smallCaps w:val="0"/>
           <w:sz w:val="20"/>
         </w:rPr>
-        <w:t xml:space="preserve"> between the last click and the purchase. We test the link with Pearson's chi-square test [37] across six time bands and fit</w:t>
+        <w:t xml:space="preserve"> between the last click and the purchase. We test the link with Pearson's chi-square test [36] across six time bands and fit</w:t>
       </w:r>
     </w:p>
     <w:p>
@@ -5391,7 +4532,7 @@
           <w:smallCaps w:val="0"/>
           <w:sz w:val="20"/>
         </w:rPr>
-        <w:t>Numeric session measures of buyers and non-buyers are compared with the Mann-Whitney U test [38] (two-sided), and the categorical ones, visitor type, month and weekend, with chi-square tests. For prediction we train logistic regression, random forest [39] and gradient boosting [40] models in scikit-learn [41] on three quarters of the sessions (stratified by outcome, classes reweighted to balance them) and score them by ROC-AUC [42] on the remaining quarter. One feature needed care. PageValues is calculated from the pages a visitor saw before a transaction, so it partly contains the answer, and we therefore report every model both with and without it. To see which inputs matter, we shuffle one feature at a time in the test data and record how far the AUC drops.</w:t>
+        <w:t>Numeric session measures of buyers and non-buyers are compared with the Mann-Whitney U test [37] (two-sided), and the categorical ones, visitor type, month and weekend, with chi-square tests. For prediction we train logistic regression, random forest [38] and gradient boosting [39] models in scikit-learn [40] on three quarters of the sessions (stratified by outcome, classes reweighted to balance them) and score them by ROC-AUC [41] on the remaining quarter. One feature needed care. PageValues is calculated from the pages a visitor saw before a transaction, so it partly contains the answer, and we therefore report every model both with and without it. To see which inputs matter, we shuffle one feature at a time in the test data and record how far the AUC drops.</w:t>
       </w:r>
     </w:p>
     <w:p>
@@ -5454,7 +4595,7 @@
       <w:r>
         <w:drawing>
           <wp:inline xmlns:a="http://schemas.openxmlformats.org/drawingml/2006/main" xmlns:pic="http://schemas.openxmlformats.org/drawingml/2006/picture">
-            <wp:extent cx="3200400" cy="2651760"/>
+            <wp:extent cx="2743200" cy="2272937"/>
             <wp:docPr id="1" name="Picture 1"/>
             <wp:cNvGraphicFramePr>
               <a:graphicFrameLocks noChangeAspect="1"/>
@@ -5475,7 +4616,7 @@
                   <pic:spPr>
                     <a:xfrm>
                       <a:off x="0" y="0"/>
-                      <a:ext cx="3200400" cy="2651760"/>
+                      <a:ext cx="2743200" cy="2272937"/>
                     </a:xfrm>
                     <a:prstGeom prst="rect"/>
                   </pic:spPr>
@@ -5533,7 +4674,7 @@
           <w:smallCaps w:val="0"/>
           <w:sz w:val="20"/>
         </w:rPr>
-        <w:t>All results are boiled down to a fact sheet of short, labelled statements, plus suggested actions and caveats. The assistant may only answer from this sheet, which limits how much it can invent [43], [44]. When a key is set, a small server function passes the sheet and the question to a free Gemini model. During development the model we started with was retired and the newer ones were often overloaded, so the function now tries several models in turn within a fixed time limit. Without a key, or if every model fails, a built-in fallback ranks the sheet's statements against the question by TF-IDF [45] and quotes the closest ones. That version works offline and can only repeat numbers we computed.</w:t>
+        <w:t>All results are boiled down to a fact sheet of short, labelled statements, plus suggested actions and caveats. The assistant may only answer from this sheet, which limits how much it can invent [42], [43]. When a key is set, a small server function passes the sheet and the question to a free Gemini model. During development the model we started with was retired and the newer ones were often overloaded, so the function now tries several models in turn within a fixed time limit. Without a key, or if every model fails, a built-in fallback ranks the sheet's statements against the question by TF-IDF [44] and quotes the closest ones. That version works offline and can only repeat numbers we computed.</w:t>
       </w:r>
     </w:p>
     <w:p>
@@ -5596,7 +4737,7 @@
       <w:r>
         <w:drawing>
           <wp:inline xmlns:a="http://schemas.openxmlformats.org/drawingml/2006/main" xmlns:pic="http://schemas.openxmlformats.org/drawingml/2006/picture">
-            <wp:extent cx="3200400" cy="2103120"/>
+            <wp:extent cx="3200400" cy="1828800"/>
             <wp:docPr id="2" name="Picture 2"/>
             <wp:cNvGraphicFramePr>
               <a:graphicFrameLocks noChangeAspect="1"/>
@@ -5617,7 +4758,7 @@
                   <pic:spPr>
                     <a:xfrm>
                       <a:off x="0" y="0"/>
-                      <a:ext cx="3200400" cy="2103120"/>
+                      <a:ext cx="3200400" cy="1828800"/>
                     </a:xfrm>
                     <a:prstGeom prst="rect"/>
                   </pic:spPr>
@@ -5658,7 +4799,7 @@
           <w:smallCaps/>
           <w:sz w:val="16"/>
         </w:rPr>
-        <w:t>Table IV</w:t>
+        <w:t>Table III</w:t>
       </w:r>
     </w:p>
     <w:p>
@@ -5974,7 +5115,75 @@
           <w:smallCaps w:val="0"/>
           <w:sz w:val="20"/>
         </w:rPr>
-        <w:t>With the number of clicks held fixed, each unit of log(1 + hours) multiplies the odds of Criteo getting credit by 0.61. Each extra click multiplies them by just 1.04 (pseudo R-squared 0.22; Table IV). Table V shows the same thing without a model: the credited share barely moves between one click and six.</w:t>
+        <w:t>With the number of clicks held fixed, each unit of log(1 + hours) multiplies the odds of Criteo getting credit by 0.61. Each extra click multiplies them by just 1.04 (pseudo R-squared 0.22; Table III). Without any model the picture is the same: Criteo kept the credit for 54% of one-click journeys and 58% of those with six or more clicks.</w:t>
+      </w:r>
+    </w:p>
+    <w:p>
+      <w:pPr>
+        <w:spacing w:after="0" w:before="0" w:line="240" w:lineRule="auto"/>
+        <w:ind w:firstLine="202"/>
+        <w:jc w:val="both"/>
+      </w:pPr>
+      <w:r>
+        <w:rPr>
+          <w:rFonts w:ascii="Times New Roman" w:hAnsi="Times New Roman"/>
+          <w:b w:val="0"/>
+          <w:i w:val="0"/>
+          <w:smallCaps w:val="0"/>
+          <w:sz w:val="20"/>
+        </w:rPr>
+        <w:t>So under last click, whether a channel gets paid for a sale depends on timing far more than on effort. Click a display ad and buy within the hour, and the ad nearly always gets the credit. Wait a week, search for the product or open an email in between, and it usually does not.</w:t>
+      </w:r>
+    </w:p>
+    <w:p>
+      <w:pPr>
+        <w:keepNext/>
+        <w:spacing w:after="40" w:before="80" w:line="240" w:lineRule="auto"/>
+        <w:jc w:val="left"/>
+      </w:pPr>
+      <w:r>
+        <w:rPr>
+          <w:rFonts w:ascii="Times New Roman" w:hAnsi="Times New Roman"/>
+          <w:b w:val="0"/>
+          <w:i/>
+          <w:smallCaps w:val="0"/>
+          <w:sz w:val="20"/>
+        </w:rPr>
+        <w:t>B. Real Multi-Channel Journeys (RQ1, RQ3)</w:t>
+      </w:r>
+    </w:p>
+    <w:p>
+      <w:pPr>
+        <w:spacing w:after="0" w:before="0" w:line="240" w:lineRule="auto"/>
+        <w:ind w:firstLine="202"/>
+        <w:jc w:val="both"/>
+      </w:pPr>
+      <w:r>
+        <w:rPr>
+          <w:rFonts w:ascii="Times New Roman" w:hAnsi="Times New Roman"/>
+          <w:b w:val="0"/>
+          <w:i w:val="0"/>
+          <w:smallCaps w:val="0"/>
+          <w:sz w:val="20"/>
+        </w:rPr>
+        <w:t>The GA360 sample has 714,167 visitors and 903,653 sessions. Tracing each visitor up to their first purchase gives 10,022 converting journeys, 1.4% of all journeys. Most buyers needed more than one visit: 52% of converting journeys had two or more sessions (mean 2.28, maximum 138), against 1.23 sessions for journeys that ended without a sale. Repeat-visit buyers took a median of 4.7 days to decide. Surprisingly, only 12% of converting journeys used more than one channel. The most common paths were a single Referral visit (1,755), a single Organic Search visit (1,712) and Referral &gt; Referral (969).</w:t>
+      </w:r>
+    </w:p>
+    <w:p>
+      <w:pPr>
+        <w:spacing w:after="0" w:before="0" w:line="240" w:lineRule="auto"/>
+        <w:ind w:firstLine="202"/>
+        <w:jc w:val="both"/>
+      </w:pPr>
+      <w:r>
+        <w:rPr>
+          <w:rFonts w:ascii="Times New Roman" w:hAnsi="Times New Roman"/>
+          <w:b w:val="0"/>
+          <w:i w:val="0"/>
+          <w:smallCaps w:val="0"/>
+          <w:sz w:val="20"/>
+        </w:rPr>
+        <w:t>How often a visit ends in a sale varies a lot by channel. Referral visits converted at 5.1%. Social brought the second-largest stream of visits, 226,117, but converted at only 0.05%. Organic Search brought the most visits and converted at 0.9%.</w:t>
       </w:r>
     </w:p>
     <w:p>
@@ -5991,1331 +5200,7 @@
           <w:smallCaps/>
           <w:sz w:val="16"/>
         </w:rPr>
-        <w:t>Table V</w:t>
-      </w:r>
-    </w:p>
-    <w:p>
-      <w:pPr>
-        <w:keepNext/>
-        <w:spacing w:after="60" w:before="0" w:line="240" w:lineRule="auto"/>
-        <w:jc w:val="center"/>
-      </w:pPr>
-      <w:r>
-        <w:rPr>
-          <w:rFonts w:ascii="Times New Roman" w:hAnsi="Times New Roman"/>
-          <w:b w:val="0"/>
-          <w:i w:val="0"/>
-          <w:smallCaps/>
-          <w:sz w:val="16"/>
-        </w:rPr>
-        <w:t>Last-Click Credit to Criteo by Number of Criteo Clicks</w:t>
-      </w:r>
-    </w:p>
-    <w:tbl>
-      <w:tblPr>
-        <w:tblW w:type="auto" w:w="0"/>
-        <w:jc w:val="center"/>
-        <w:tblLayout w:type="fixed"/>
-        <w:tblLook w:firstColumn="1" w:firstRow="1" w:lastColumn="0" w:lastRow="0" w:noHBand="0" w:noVBand="1" w:val="04A0"/>
-        <w:tblBorders>
-          <w:top w:val="single" w:sz="8" w:color="000000"/>
-          <w:bottom w:val="single" w:sz="8" w:color="000000"/>
-          <w:insideH w:val="single" w:sz="2" w:color="000000"/>
-        </w:tblBorders>
-      </w:tblPr>
-      <w:tblGrid>
-        <w:gridCol w:w="3480"/>
-        <w:gridCol w:w="3480"/>
-        <w:gridCol w:w="3480"/>
-      </w:tblGrid>
-      <w:tr>
-        <w:trPr>
-          <w:cantSplit/>
-          <w:tblHeader/>
-        </w:trPr>
-        <w:tc>
-          <w:tcPr>
-            <w:tcW w:type="dxa" w:w="1584"/>
-          </w:tcPr>
-          <w:p>
-            <w:pPr>
-              <w:keepNext/>
-              <w:jc w:val="left"/>
-            </w:pPr>
-            <w:r/>
-            <w:r>
-              <w:rPr>
-                <w:rFonts w:ascii="Times New Roman" w:hAnsi="Times New Roman"/>
-                <w:b/>
-                <w:sz w:val="16"/>
-              </w:rPr>
-              <w:t>Clicks in journey</w:t>
-            </w:r>
-          </w:p>
-        </w:tc>
-        <w:tc>
-          <w:tcPr>
-            <w:tcW w:type="dxa" w:w="1440"/>
-          </w:tcPr>
-          <w:p>
-            <w:pPr>
-              <w:keepNext/>
-              <w:jc w:val="right"/>
-            </w:pPr>
-            <w:r/>
-            <w:r>
-              <w:rPr>
-                <w:rFonts w:ascii="Times New Roman" w:hAnsi="Times New Roman"/>
-                <w:b/>
-                <w:sz w:val="16"/>
-              </w:rPr>
-              <w:t>Conversions</w:t>
-            </w:r>
-          </w:p>
-        </w:tc>
-        <w:tc>
-          <w:tcPr>
-            <w:tcW w:type="dxa" w:w="1584"/>
-          </w:tcPr>
-          <w:p>
-            <w:pPr>
-              <w:keepNext/>
-              <w:jc w:val="right"/>
-            </w:pPr>
-            <w:r/>
-            <w:r>
-              <w:rPr>
-                <w:rFonts w:ascii="Times New Roman" w:hAnsi="Times New Roman"/>
-                <w:b/>
-                <w:sz w:val="16"/>
-              </w:rPr>
-              <w:t>Credited to Criteo</w:t>
-            </w:r>
-          </w:p>
-        </w:tc>
-      </w:tr>
-      <w:tr>
-        <w:trPr>
-          <w:cantSplit/>
-        </w:trPr>
-        <w:tc>
-          <w:tcPr>
-            <w:tcW w:type="dxa" w:w="1584"/>
-          </w:tcPr>
-          <w:p>
-            <w:pPr>
-              <w:keepNext/>
-              <w:jc w:val="left"/>
-            </w:pPr>
-            <w:r/>
-            <w:r>
-              <w:rPr>
-                <w:rFonts w:ascii="Times New Roman" w:hAnsi="Times New Roman"/>
-                <w:b w:val="0"/>
-                <w:sz w:val="16"/>
-              </w:rPr>
-              <w:t>1</w:t>
-            </w:r>
-          </w:p>
-        </w:tc>
-        <w:tc>
-          <w:tcPr>
-            <w:tcW w:type="dxa" w:w="1440"/>
-          </w:tcPr>
-          <w:p>
-            <w:pPr>
-              <w:keepNext/>
-              <w:jc w:val="right"/>
-            </w:pPr>
-            <w:r/>
-            <w:r>
-              <w:rPr>
-                <w:rFonts w:ascii="Times New Roman" w:hAnsi="Times New Roman"/>
-                <w:b w:val="0"/>
-                <w:sz w:val="16"/>
-              </w:rPr>
-              <w:t>294,992</w:t>
-            </w:r>
-          </w:p>
-        </w:tc>
-        <w:tc>
-          <w:tcPr>
-            <w:tcW w:type="dxa" w:w="1584"/>
-          </w:tcPr>
-          <w:p>
-            <w:pPr>
-              <w:keepNext/>
-              <w:jc w:val="right"/>
-            </w:pPr>
-            <w:r/>
-            <w:r>
-              <w:rPr>
-                <w:rFonts w:ascii="Times New Roman" w:hAnsi="Times New Roman"/>
-                <w:b w:val="0"/>
-                <w:sz w:val="16"/>
-              </w:rPr>
-              <w:t>54.2%</w:t>
-            </w:r>
-          </w:p>
-        </w:tc>
-      </w:tr>
-      <w:tr>
-        <w:trPr>
-          <w:cantSplit/>
-        </w:trPr>
-        <w:tc>
-          <w:tcPr>
-            <w:tcW w:type="dxa" w:w="1584"/>
-          </w:tcPr>
-          <w:p>
-            <w:pPr>
-              <w:keepNext/>
-              <w:jc w:val="left"/>
-            </w:pPr>
-            <w:r/>
-            <w:r>
-              <w:rPr>
-                <w:rFonts w:ascii="Times New Roman" w:hAnsi="Times New Roman"/>
-                <w:b w:val="0"/>
-                <w:sz w:val="16"/>
-              </w:rPr>
-              <w:t>2</w:t>
-            </w:r>
-          </w:p>
-        </w:tc>
-        <w:tc>
-          <w:tcPr>
-            <w:tcW w:type="dxa" w:w="1440"/>
-          </w:tcPr>
-          <w:p>
-            <w:pPr>
-              <w:keepNext/>
-              <w:jc w:val="right"/>
-            </w:pPr>
-            <w:r/>
-            <w:r>
-              <w:rPr>
-                <w:rFonts w:ascii="Times New Roman" w:hAnsi="Times New Roman"/>
-                <w:b w:val="0"/>
-                <w:sz w:val="16"/>
-              </w:rPr>
-              <w:t>70,816</w:t>
-            </w:r>
-          </w:p>
-        </w:tc>
-        <w:tc>
-          <w:tcPr>
-            <w:tcW w:type="dxa" w:w="1584"/>
-          </w:tcPr>
-          <w:p>
-            <w:pPr>
-              <w:keepNext/>
-              <w:jc w:val="right"/>
-            </w:pPr>
-            <w:r/>
-            <w:r>
-              <w:rPr>
-                <w:rFonts w:ascii="Times New Roman" w:hAnsi="Times New Roman"/>
-                <w:b w:val="0"/>
-                <w:sz w:val="16"/>
-              </w:rPr>
-              <w:t>53.3%</w:t>
-            </w:r>
-          </w:p>
-        </w:tc>
-      </w:tr>
-      <w:tr>
-        <w:trPr>
-          <w:cantSplit/>
-        </w:trPr>
-        <w:tc>
-          <w:tcPr>
-            <w:tcW w:type="dxa" w:w="1584"/>
-          </w:tcPr>
-          <w:p>
-            <w:pPr>
-              <w:keepNext/>
-              <w:jc w:val="left"/>
-            </w:pPr>
-            <w:r/>
-            <w:r>
-              <w:rPr>
-                <w:rFonts w:ascii="Times New Roman" w:hAnsi="Times New Roman"/>
-                <w:b w:val="0"/>
-                <w:sz w:val="16"/>
-              </w:rPr>
-              <w:t>3</w:t>
-            </w:r>
-          </w:p>
-        </w:tc>
-        <w:tc>
-          <w:tcPr>
-            <w:tcW w:type="dxa" w:w="1440"/>
-          </w:tcPr>
-          <w:p>
-            <w:pPr>
-              <w:keepNext/>
-              <w:jc w:val="right"/>
-            </w:pPr>
-            <w:r/>
-            <w:r>
-              <w:rPr>
-                <w:rFonts w:ascii="Times New Roman" w:hAnsi="Times New Roman"/>
-                <w:b w:val="0"/>
-                <w:sz w:val="16"/>
-              </w:rPr>
-              <w:t>28,813</w:t>
-            </w:r>
-          </w:p>
-        </w:tc>
-        <w:tc>
-          <w:tcPr>
-            <w:tcW w:type="dxa" w:w="1584"/>
-          </w:tcPr>
-          <w:p>
-            <w:pPr>
-              <w:keepNext/>
-              <w:jc w:val="right"/>
-            </w:pPr>
-            <w:r/>
-            <w:r>
-              <w:rPr>
-                <w:rFonts w:ascii="Times New Roman" w:hAnsi="Times New Roman"/>
-                <w:b w:val="0"/>
-                <w:sz w:val="16"/>
-              </w:rPr>
-              <w:t>53.7%</w:t>
-            </w:r>
-          </w:p>
-        </w:tc>
-      </w:tr>
-      <w:tr>
-        <w:trPr>
-          <w:cantSplit/>
-        </w:trPr>
-        <w:tc>
-          <w:tcPr>
-            <w:tcW w:type="dxa" w:w="1584"/>
-          </w:tcPr>
-          <w:p>
-            <w:pPr>
-              <w:keepNext/>
-              <w:jc w:val="left"/>
-            </w:pPr>
-            <w:r/>
-            <w:r>
-              <w:rPr>
-                <w:rFonts w:ascii="Times New Roman" w:hAnsi="Times New Roman"/>
-                <w:b w:val="0"/>
-                <w:sz w:val="16"/>
-              </w:rPr>
-              <w:t>4</w:t>
-            </w:r>
-          </w:p>
-        </w:tc>
-        <w:tc>
-          <w:tcPr>
-            <w:tcW w:type="dxa" w:w="1440"/>
-          </w:tcPr>
-          <w:p>
-            <w:pPr>
-              <w:keepNext/>
-              <w:jc w:val="right"/>
-            </w:pPr>
-            <w:r/>
-            <w:r>
-              <w:rPr>
-                <w:rFonts w:ascii="Times New Roman" w:hAnsi="Times New Roman"/>
-                <w:b w:val="0"/>
-                <w:sz w:val="16"/>
-              </w:rPr>
-              <w:t>14,292</w:t>
-            </w:r>
-          </w:p>
-        </w:tc>
-        <w:tc>
-          <w:tcPr>
-            <w:tcW w:type="dxa" w:w="1584"/>
-          </w:tcPr>
-          <w:p>
-            <w:pPr>
-              <w:keepNext/>
-              <w:jc w:val="right"/>
-            </w:pPr>
-            <w:r/>
-            <w:r>
-              <w:rPr>
-                <w:rFonts w:ascii="Times New Roman" w:hAnsi="Times New Roman"/>
-                <w:b w:val="0"/>
-                <w:sz w:val="16"/>
-              </w:rPr>
-              <w:t>54.6%</w:t>
-            </w:r>
-          </w:p>
-        </w:tc>
-      </w:tr>
-      <w:tr>
-        <w:trPr>
-          <w:cantSplit/>
-        </w:trPr>
-        <w:tc>
-          <w:tcPr>
-            <w:tcW w:type="dxa" w:w="1584"/>
-          </w:tcPr>
-          <w:p>
-            <w:pPr>
-              <w:keepNext/>
-              <w:jc w:val="left"/>
-            </w:pPr>
-            <w:r/>
-            <w:r>
-              <w:rPr>
-                <w:rFonts w:ascii="Times New Roman" w:hAnsi="Times New Roman"/>
-                <w:b w:val="0"/>
-                <w:sz w:val="16"/>
-              </w:rPr>
-              <w:t>5</w:t>
-            </w:r>
-          </w:p>
-        </w:tc>
-        <w:tc>
-          <w:tcPr>
-            <w:tcW w:type="dxa" w:w="1440"/>
-          </w:tcPr>
-          <w:p>
-            <w:pPr>
-              <w:keepNext/>
-              <w:jc w:val="right"/>
-            </w:pPr>
-            <w:r/>
-            <w:r>
-              <w:rPr>
-                <w:rFonts w:ascii="Times New Roman" w:hAnsi="Times New Roman"/>
-                <w:b w:val="0"/>
-                <w:sz w:val="16"/>
-              </w:rPr>
-              <w:t>8,154</w:t>
-            </w:r>
-          </w:p>
-        </w:tc>
-        <w:tc>
-          <w:tcPr>
-            <w:tcW w:type="dxa" w:w="1584"/>
-          </w:tcPr>
-          <w:p>
-            <w:pPr>
-              <w:keepNext/>
-              <w:jc w:val="right"/>
-            </w:pPr>
-            <w:r/>
-            <w:r>
-              <w:rPr>
-                <w:rFonts w:ascii="Times New Roman" w:hAnsi="Times New Roman"/>
-                <w:b w:val="0"/>
-                <w:sz w:val="16"/>
-              </w:rPr>
-              <w:t>55.3%</w:t>
-            </w:r>
-          </w:p>
-        </w:tc>
-      </w:tr>
-      <w:tr>
-        <w:trPr>
-          <w:cantSplit/>
-        </w:trPr>
-        <w:tc>
-          <w:tcPr>
-            <w:tcW w:type="dxa" w:w="1584"/>
-          </w:tcPr>
-          <w:p>
-            <w:pPr>
-              <w:keepNext w:val="0"/>
-              <w:jc w:val="left"/>
-            </w:pPr>
-            <w:r/>
-            <w:r>
-              <w:rPr>
-                <w:rFonts w:ascii="Times New Roman" w:hAnsi="Times New Roman"/>
-                <w:b w:val="0"/>
-                <w:sz w:val="16"/>
-              </w:rPr>
-              <w:t>6 or more</w:t>
-            </w:r>
-          </w:p>
-        </w:tc>
-        <w:tc>
-          <w:tcPr>
-            <w:tcW w:type="dxa" w:w="1440"/>
-          </w:tcPr>
-          <w:p>
-            <w:pPr>
-              <w:keepNext w:val="0"/>
-              <w:jc w:val="right"/>
-            </w:pPr>
-            <w:r/>
-            <w:r>
-              <w:rPr>
-                <w:rFonts w:ascii="Times New Roman" w:hAnsi="Times New Roman"/>
-                <w:b w:val="0"/>
-                <w:sz w:val="16"/>
-              </w:rPr>
-              <w:t>18,743</w:t>
-            </w:r>
-          </w:p>
-        </w:tc>
-        <w:tc>
-          <w:tcPr>
-            <w:tcW w:type="dxa" w:w="1584"/>
-          </w:tcPr>
-          <w:p>
-            <w:pPr>
-              <w:keepNext w:val="0"/>
-              <w:jc w:val="right"/>
-            </w:pPr>
-            <w:r/>
-            <w:r>
-              <w:rPr>
-                <w:rFonts w:ascii="Times New Roman" w:hAnsi="Times New Roman"/>
-                <w:b w:val="0"/>
-                <w:sz w:val="16"/>
-              </w:rPr>
-              <w:t>57.8%</w:t>
-            </w:r>
-          </w:p>
-        </w:tc>
-      </w:tr>
-    </w:tbl>
-    <w:p>
-      <w:pPr>
-        <w:spacing w:after="80" w:before="0" w:line="240" w:lineRule="auto"/>
-        <w:ind w:firstLine="202"/>
-        <w:jc w:val="both"/>
-      </w:pPr>
-    </w:p>
-    <w:p>
-      <w:pPr>
-        <w:spacing w:after="0" w:before="0" w:line="240" w:lineRule="auto"/>
-        <w:ind w:firstLine="202"/>
-        <w:jc w:val="both"/>
-      </w:pPr>
-      <w:r>
-        <w:rPr>
-          <w:rFonts w:ascii="Times New Roman" w:hAnsi="Times New Roman"/>
-          <w:b w:val="0"/>
-          <w:i w:val="0"/>
-          <w:smallCaps w:val="0"/>
-          <w:sz w:val="20"/>
-        </w:rPr>
-        <w:t>So under last click, whether a channel gets paid for a sale depends on timing far more than on effort. Click a display ad and buy within the hour, and the ad nearly always gets the credit. Wait a week, search for the product or open an email in between, and it usually does not.</w:t>
-      </w:r>
-    </w:p>
-    <w:p>
-      <w:pPr>
-        <w:keepNext/>
-        <w:spacing w:after="40" w:before="80" w:line="240" w:lineRule="auto"/>
-        <w:jc w:val="left"/>
-      </w:pPr>
-      <w:r>
-        <w:rPr>
-          <w:rFonts w:ascii="Times New Roman" w:hAnsi="Times New Roman"/>
-          <w:b w:val="0"/>
-          <w:i/>
-          <w:smallCaps w:val="0"/>
-          <w:sz w:val="20"/>
-        </w:rPr>
-        <w:t>B. Real Multi-Channel Journeys (RQ1, RQ3)</w:t>
-      </w:r>
-    </w:p>
-    <w:p>
-      <w:pPr>
-        <w:spacing w:after="0" w:before="0" w:line="240" w:lineRule="auto"/>
-        <w:ind w:firstLine="202"/>
-        <w:jc w:val="both"/>
-      </w:pPr>
-      <w:r>
-        <w:rPr>
-          <w:rFonts w:ascii="Times New Roman" w:hAnsi="Times New Roman"/>
-          <w:b w:val="0"/>
-          <w:i w:val="0"/>
-          <w:smallCaps w:val="0"/>
-          <w:sz w:val="20"/>
-        </w:rPr>
-        <w:t>The GA360 sample has 714,167 visitors and 903,653 sessions. Tracing each visitor up to their first purchase gives 10,022 converting journeys, 1.4% of all journeys. Most buyers needed more than one visit: 52% of converting journeys had two or more sessions (mean 2.28, maximum 138), against 1.23 sessions for journeys that ended without a sale. Repeat-visit buyers took a median of 4.7 days to decide. Surprisingly, only 12% of converting journeys used more than one channel. The most common paths were a single Referral visit (1,755), a single Organic Search visit (1,712) and Referral &gt; Referral (969).</w:t>
-      </w:r>
-    </w:p>
-    <w:p>
-      <w:pPr>
-        <w:keepNext/>
-        <w:spacing w:after="0" w:before="120" w:line="240" w:lineRule="auto"/>
-        <w:jc w:val="center"/>
-      </w:pPr>
-      <w:r>
-        <w:rPr>
-          <w:rFonts w:ascii="Times New Roman" w:hAnsi="Times New Roman"/>
-          <w:b w:val="0"/>
-          <w:i w:val="0"/>
-          <w:smallCaps/>
-          <w:sz w:val="16"/>
-        </w:rPr>
-        <w:t>Table VI</w:t>
-      </w:r>
-    </w:p>
-    <w:p>
-      <w:pPr>
-        <w:keepNext/>
-        <w:spacing w:after="60" w:before="0" w:line="240" w:lineRule="auto"/>
-        <w:jc w:val="center"/>
-      </w:pPr>
-      <w:r>
-        <w:rPr>
-          <w:rFonts w:ascii="Times New Roman" w:hAnsi="Times New Roman"/>
-          <w:b w:val="0"/>
-          <w:i w:val="0"/>
-          <w:smallCaps/>
-          <w:sz w:val="16"/>
-        </w:rPr>
-        <w:t>Sessions and Converting Sessions by Channel (GA360)</w:t>
-      </w:r>
-    </w:p>
-    <w:tbl>
-      <w:tblPr>
-        <w:tblW w:type="auto" w:w="0"/>
-        <w:jc w:val="center"/>
-        <w:tblLayout w:type="fixed"/>
-        <w:tblLook w:firstColumn="1" w:firstRow="1" w:lastColumn="0" w:lastRow="0" w:noHBand="0" w:noVBand="1" w:val="04A0"/>
-        <w:tblBorders>
-          <w:top w:val="single" w:sz="8" w:color="000000"/>
-          <w:bottom w:val="single" w:sz="8" w:color="000000"/>
-          <w:insideH w:val="single" w:sz="2" w:color="000000"/>
-        </w:tblBorders>
-      </w:tblPr>
-      <w:tblGrid>
-        <w:gridCol w:w="2610"/>
-        <w:gridCol w:w="2610"/>
-        <w:gridCol w:w="2610"/>
-        <w:gridCol w:w="2610"/>
-      </w:tblGrid>
-      <w:tr>
-        <w:trPr>
-          <w:cantSplit/>
-          <w:tblHeader/>
-        </w:trPr>
-        <w:tc>
-          <w:tcPr>
-            <w:tcW w:type="dxa" w:w="1584"/>
-          </w:tcPr>
-          <w:p>
-            <w:pPr>
-              <w:keepNext/>
-              <w:jc w:val="left"/>
-            </w:pPr>
-            <w:r/>
-            <w:r>
-              <w:rPr>
-                <w:rFonts w:ascii="Times New Roman" w:hAnsi="Times New Roman"/>
-                <w:b/>
-                <w:sz w:val="16"/>
-              </w:rPr>
-              <w:t>Channel</w:t>
-            </w:r>
-          </w:p>
-        </w:tc>
-        <w:tc>
-          <w:tcPr>
-            <w:tcW w:type="dxa" w:w="1152"/>
-          </w:tcPr>
-          <w:p>
-            <w:pPr>
-              <w:keepNext/>
-              <w:jc w:val="right"/>
-            </w:pPr>
-            <w:r/>
-            <w:r>
-              <w:rPr>
-                <w:rFonts w:ascii="Times New Roman" w:hAnsi="Times New Roman"/>
-                <w:b/>
-                <w:sz w:val="16"/>
-              </w:rPr>
-              <w:t>Sessions</w:t>
-            </w:r>
-          </w:p>
-        </w:tc>
-        <w:tc>
-          <w:tcPr>
-            <w:tcW w:type="dxa" w:w="1152"/>
-          </w:tcPr>
-          <w:p>
-            <w:pPr>
-              <w:keepNext/>
-              <w:jc w:val="right"/>
-            </w:pPr>
-            <w:r/>
-            <w:r>
-              <w:rPr>
-                <w:rFonts w:ascii="Times New Roman" w:hAnsi="Times New Roman"/>
-                <w:b/>
-                <w:sz w:val="16"/>
-              </w:rPr>
-              <w:t>Converting</w:t>
-            </w:r>
-          </w:p>
-        </w:tc>
-        <w:tc>
-          <w:tcPr>
-            <w:tcW w:type="dxa" w:w="1008"/>
-          </w:tcPr>
-          <w:p>
-            <w:pPr>
-              <w:keepNext/>
-              <w:jc w:val="right"/>
-            </w:pPr>
-            <w:r/>
-            <w:r>
-              <w:rPr>
-                <w:rFonts w:ascii="Times New Roman" w:hAnsi="Times New Roman"/>
-                <w:b/>
-                <w:sz w:val="16"/>
-              </w:rPr>
-              <w:t>Rate</w:t>
-            </w:r>
-          </w:p>
-        </w:tc>
-      </w:tr>
-      <w:tr>
-        <w:trPr>
-          <w:cantSplit/>
-        </w:trPr>
-        <w:tc>
-          <w:tcPr>
-            <w:tcW w:type="dxa" w:w="1584"/>
-          </w:tcPr>
-          <w:p>
-            <w:pPr>
-              <w:keepNext/>
-              <w:jc w:val="left"/>
-            </w:pPr>
-            <w:r/>
-            <w:r>
-              <w:rPr>
-                <w:rFonts w:ascii="Times New Roman" w:hAnsi="Times New Roman"/>
-                <w:b w:val="0"/>
-                <w:sz w:val="16"/>
-              </w:rPr>
-              <w:t>Referral</w:t>
-            </w:r>
-          </w:p>
-        </w:tc>
-        <w:tc>
-          <w:tcPr>
-            <w:tcW w:type="dxa" w:w="1152"/>
-          </w:tcPr>
-          <w:p>
-            <w:pPr>
-              <w:keepNext/>
-              <w:jc w:val="right"/>
-            </w:pPr>
-            <w:r/>
-            <w:r>
-              <w:rPr>
-                <w:rFonts w:ascii="Times New Roman" w:hAnsi="Times New Roman"/>
-                <w:b w:val="0"/>
-                <w:sz w:val="16"/>
-              </w:rPr>
-              <w:t>104,838</w:t>
-            </w:r>
-          </w:p>
-        </w:tc>
-        <w:tc>
-          <w:tcPr>
-            <w:tcW w:type="dxa" w:w="1152"/>
-          </w:tcPr>
-          <w:p>
-            <w:pPr>
-              <w:keepNext/>
-              <w:jc w:val="right"/>
-            </w:pPr>
-            <w:r/>
-            <w:r>
-              <w:rPr>
-                <w:rFonts w:ascii="Times New Roman" w:hAnsi="Times New Roman"/>
-                <w:b w:val="0"/>
-                <w:sz w:val="16"/>
-              </w:rPr>
-              <w:t>5,322</w:t>
-            </w:r>
-          </w:p>
-        </w:tc>
-        <w:tc>
-          <w:tcPr>
-            <w:tcW w:type="dxa" w:w="1008"/>
-          </w:tcPr>
-          <w:p>
-            <w:pPr>
-              <w:keepNext/>
-              <w:jc w:val="right"/>
-            </w:pPr>
-            <w:r/>
-            <w:r>
-              <w:rPr>
-                <w:rFonts w:ascii="Times New Roman" w:hAnsi="Times New Roman"/>
-                <w:b w:val="0"/>
-                <w:sz w:val="16"/>
-              </w:rPr>
-              <w:t>5.08%</w:t>
-            </w:r>
-          </w:p>
-        </w:tc>
-      </w:tr>
-      <w:tr>
-        <w:trPr>
-          <w:cantSplit/>
-        </w:trPr>
-        <w:tc>
-          <w:tcPr>
-            <w:tcW w:type="dxa" w:w="1584"/>
-          </w:tcPr>
-          <w:p>
-            <w:pPr>
-              <w:keepNext/>
-              <w:jc w:val="left"/>
-            </w:pPr>
-            <w:r/>
-            <w:r>
-              <w:rPr>
-                <w:rFonts w:ascii="Times New Roman" w:hAnsi="Times New Roman"/>
-                <w:b w:val="0"/>
-                <w:sz w:val="16"/>
-              </w:rPr>
-              <w:t>Display</w:t>
-            </w:r>
-          </w:p>
-        </w:tc>
-        <w:tc>
-          <w:tcPr>
-            <w:tcW w:type="dxa" w:w="1152"/>
-          </w:tcPr>
-          <w:p>
-            <w:pPr>
-              <w:keepNext/>
-              <w:jc w:val="right"/>
-            </w:pPr>
-            <w:r/>
-            <w:r>
-              <w:rPr>
-                <w:rFonts w:ascii="Times New Roman" w:hAnsi="Times New Roman"/>
-                <w:b w:val="0"/>
-                <w:sz w:val="16"/>
-              </w:rPr>
-              <w:t>6,262</w:t>
-            </w:r>
-          </w:p>
-        </w:tc>
-        <w:tc>
-          <w:tcPr>
-            <w:tcW w:type="dxa" w:w="1152"/>
-          </w:tcPr>
-          <w:p>
-            <w:pPr>
-              <w:keepNext/>
-              <w:jc w:val="right"/>
-            </w:pPr>
-            <w:r/>
-            <w:r>
-              <w:rPr>
-                <w:rFonts w:ascii="Times New Roman" w:hAnsi="Times New Roman"/>
-                <w:b w:val="0"/>
-                <w:sz w:val="16"/>
-              </w:rPr>
-              <w:t>143</w:t>
-            </w:r>
-          </w:p>
-        </w:tc>
-        <w:tc>
-          <w:tcPr>
-            <w:tcW w:type="dxa" w:w="1008"/>
-          </w:tcPr>
-          <w:p>
-            <w:pPr>
-              <w:keepNext/>
-              <w:jc w:val="right"/>
-            </w:pPr>
-            <w:r/>
-            <w:r>
-              <w:rPr>
-                <w:rFonts w:ascii="Times New Roman" w:hAnsi="Times New Roman"/>
-                <w:b w:val="0"/>
-                <w:sz w:val="16"/>
-              </w:rPr>
-              <w:t>2.28%</w:t>
-            </w:r>
-          </w:p>
-        </w:tc>
-      </w:tr>
-      <w:tr>
-        <w:trPr>
-          <w:cantSplit/>
-        </w:trPr>
-        <w:tc>
-          <w:tcPr>
-            <w:tcW w:type="dxa" w:w="1584"/>
-          </w:tcPr>
-          <w:p>
-            <w:pPr>
-              <w:keepNext/>
-              <w:jc w:val="left"/>
-            </w:pPr>
-            <w:r/>
-            <w:r>
-              <w:rPr>
-                <w:rFonts w:ascii="Times New Roman" w:hAnsi="Times New Roman"/>
-                <w:b w:val="0"/>
-                <w:sz w:val="16"/>
-              </w:rPr>
-              <w:t>Paid Search</w:t>
-            </w:r>
-          </w:p>
-        </w:tc>
-        <w:tc>
-          <w:tcPr>
-            <w:tcW w:type="dxa" w:w="1152"/>
-          </w:tcPr>
-          <w:p>
-            <w:pPr>
-              <w:keepNext/>
-              <w:jc w:val="right"/>
-            </w:pPr>
-            <w:r/>
-            <w:r>
-              <w:rPr>
-                <w:rFonts w:ascii="Times New Roman" w:hAnsi="Times New Roman"/>
-                <w:b w:val="0"/>
-                <w:sz w:val="16"/>
-              </w:rPr>
-              <w:t>25,326</w:t>
-            </w:r>
-          </w:p>
-        </w:tc>
-        <w:tc>
-          <w:tcPr>
-            <w:tcW w:type="dxa" w:w="1152"/>
-          </w:tcPr>
-          <w:p>
-            <w:pPr>
-              <w:keepNext/>
-              <w:jc w:val="right"/>
-            </w:pPr>
-            <w:r/>
-            <w:r>
-              <w:rPr>
-                <w:rFonts w:ascii="Times New Roman" w:hAnsi="Times New Roman"/>
-                <w:b w:val="0"/>
-                <w:sz w:val="16"/>
-              </w:rPr>
-              <w:t>469</w:t>
-            </w:r>
-          </w:p>
-        </w:tc>
-        <w:tc>
-          <w:tcPr>
-            <w:tcW w:type="dxa" w:w="1008"/>
-          </w:tcPr>
-          <w:p>
-            <w:pPr>
-              <w:keepNext/>
-              <w:jc w:val="right"/>
-            </w:pPr>
-            <w:r/>
-            <w:r>
-              <w:rPr>
-                <w:rFonts w:ascii="Times New Roman" w:hAnsi="Times New Roman"/>
-                <w:b w:val="0"/>
-                <w:sz w:val="16"/>
-              </w:rPr>
-              <w:t>1.85%</w:t>
-            </w:r>
-          </w:p>
-        </w:tc>
-      </w:tr>
-      <w:tr>
-        <w:trPr>
-          <w:cantSplit/>
-        </w:trPr>
-        <w:tc>
-          <w:tcPr>
-            <w:tcW w:type="dxa" w:w="1584"/>
-          </w:tcPr>
-          <w:p>
-            <w:pPr>
-              <w:keepNext/>
-              <w:jc w:val="left"/>
-            </w:pPr>
-            <w:r/>
-            <w:r>
-              <w:rPr>
-                <w:rFonts w:ascii="Times New Roman" w:hAnsi="Times New Roman"/>
-                <w:b w:val="0"/>
-                <w:sz w:val="16"/>
-              </w:rPr>
-              <w:t>Direct</w:t>
-            </w:r>
-          </w:p>
-        </w:tc>
-        <w:tc>
-          <w:tcPr>
-            <w:tcW w:type="dxa" w:w="1152"/>
-          </w:tcPr>
-          <w:p>
-            <w:pPr>
-              <w:keepNext/>
-              <w:jc w:val="right"/>
-            </w:pPr>
-            <w:r/>
-            <w:r>
-              <w:rPr>
-                <w:rFonts w:ascii="Times New Roman" w:hAnsi="Times New Roman"/>
-                <w:b w:val="0"/>
-                <w:sz w:val="16"/>
-              </w:rPr>
-              <w:t>143,026</w:t>
-            </w:r>
-          </w:p>
-        </w:tc>
-        <w:tc>
-          <w:tcPr>
-            <w:tcW w:type="dxa" w:w="1152"/>
-          </w:tcPr>
-          <w:p>
-            <w:pPr>
-              <w:keepNext/>
-              <w:jc w:val="right"/>
-            </w:pPr>
-            <w:r/>
-            <w:r>
-              <w:rPr>
-                <w:rFonts w:ascii="Times New Roman" w:hAnsi="Times New Roman"/>
-                <w:b w:val="0"/>
-                <w:sz w:val="16"/>
-              </w:rPr>
-              <w:t>2,061</w:t>
-            </w:r>
-          </w:p>
-        </w:tc>
-        <w:tc>
-          <w:tcPr>
-            <w:tcW w:type="dxa" w:w="1008"/>
-          </w:tcPr>
-          <w:p>
-            <w:pPr>
-              <w:keepNext/>
-              <w:jc w:val="right"/>
-            </w:pPr>
-            <w:r/>
-            <w:r>
-              <w:rPr>
-                <w:rFonts w:ascii="Times New Roman" w:hAnsi="Times New Roman"/>
-                <w:b w:val="0"/>
-                <w:sz w:val="16"/>
-              </w:rPr>
-              <w:t>1.44%</w:t>
-            </w:r>
-          </w:p>
-        </w:tc>
-      </w:tr>
-      <w:tr>
-        <w:trPr>
-          <w:cantSplit/>
-        </w:trPr>
-        <w:tc>
-          <w:tcPr>
-            <w:tcW w:type="dxa" w:w="1584"/>
-          </w:tcPr>
-          <w:p>
-            <w:pPr>
-              <w:keepNext/>
-              <w:jc w:val="left"/>
-            </w:pPr>
-            <w:r/>
-            <w:r>
-              <w:rPr>
-                <w:rFonts w:ascii="Times New Roman" w:hAnsi="Times New Roman"/>
-                <w:b w:val="0"/>
-                <w:sz w:val="16"/>
-              </w:rPr>
-              <w:t>Organic Search</w:t>
-            </w:r>
-          </w:p>
-        </w:tc>
-        <w:tc>
-          <w:tcPr>
-            <w:tcW w:type="dxa" w:w="1152"/>
-          </w:tcPr>
-          <w:p>
-            <w:pPr>
-              <w:keepNext/>
-              <w:jc w:val="right"/>
-            </w:pPr>
-            <w:r/>
-            <w:r>
-              <w:rPr>
-                <w:rFonts w:ascii="Times New Roman" w:hAnsi="Times New Roman"/>
-                <w:b w:val="0"/>
-                <w:sz w:val="16"/>
-              </w:rPr>
-              <w:t>381,561</w:t>
-            </w:r>
-          </w:p>
-        </w:tc>
-        <w:tc>
-          <w:tcPr>
-            <w:tcW w:type="dxa" w:w="1152"/>
-          </w:tcPr>
-          <w:p>
-            <w:pPr>
-              <w:keepNext/>
-              <w:jc w:val="right"/>
-            </w:pPr>
-            <w:r/>
-            <w:r>
-              <w:rPr>
-                <w:rFonts w:ascii="Times New Roman" w:hAnsi="Times New Roman"/>
-                <w:b w:val="0"/>
-                <w:sz w:val="16"/>
-              </w:rPr>
-              <w:t>3,443</w:t>
-            </w:r>
-          </w:p>
-        </w:tc>
-        <w:tc>
-          <w:tcPr>
-            <w:tcW w:type="dxa" w:w="1008"/>
-          </w:tcPr>
-          <w:p>
-            <w:pPr>
-              <w:keepNext/>
-              <w:jc w:val="right"/>
-            </w:pPr>
-            <w:r/>
-            <w:r>
-              <w:rPr>
-                <w:rFonts w:ascii="Times New Roman" w:hAnsi="Times New Roman"/>
-                <w:b w:val="0"/>
-                <w:sz w:val="16"/>
-              </w:rPr>
-              <w:t>0.90%</w:t>
-            </w:r>
-          </w:p>
-        </w:tc>
-      </w:tr>
-      <w:tr>
-        <w:trPr>
-          <w:cantSplit/>
-        </w:trPr>
-        <w:tc>
-          <w:tcPr>
-            <w:tcW w:type="dxa" w:w="1584"/>
-          </w:tcPr>
-          <w:p>
-            <w:pPr>
-              <w:keepNext/>
-              <w:jc w:val="left"/>
-            </w:pPr>
-            <w:r/>
-            <w:r>
-              <w:rPr>
-                <w:rFonts w:ascii="Times New Roman" w:hAnsi="Times New Roman"/>
-                <w:b w:val="0"/>
-                <w:sz w:val="16"/>
-              </w:rPr>
-              <w:t>Affiliates</w:t>
-            </w:r>
-          </w:p>
-        </w:tc>
-        <w:tc>
-          <w:tcPr>
-            <w:tcW w:type="dxa" w:w="1152"/>
-          </w:tcPr>
-          <w:p>
-            <w:pPr>
-              <w:keepNext/>
-              <w:jc w:val="right"/>
-            </w:pPr>
-            <w:r/>
-            <w:r>
-              <w:rPr>
-                <w:rFonts w:ascii="Times New Roman" w:hAnsi="Times New Roman"/>
-                <w:b w:val="0"/>
-                <w:sz w:val="16"/>
-              </w:rPr>
-              <w:t>16,403</w:t>
-            </w:r>
-          </w:p>
-        </w:tc>
-        <w:tc>
-          <w:tcPr>
-            <w:tcW w:type="dxa" w:w="1152"/>
-          </w:tcPr>
-          <w:p>
-            <w:pPr>
-              <w:keepNext/>
-              <w:jc w:val="right"/>
-            </w:pPr>
-            <w:r/>
-            <w:r>
-              <w:rPr>
-                <w:rFonts w:ascii="Times New Roman" w:hAnsi="Times New Roman"/>
-                <w:b w:val="0"/>
-                <w:sz w:val="16"/>
-              </w:rPr>
-              <w:t>9</w:t>
-            </w:r>
-          </w:p>
-        </w:tc>
-        <w:tc>
-          <w:tcPr>
-            <w:tcW w:type="dxa" w:w="1008"/>
-          </w:tcPr>
-          <w:p>
-            <w:pPr>
-              <w:keepNext/>
-              <w:jc w:val="right"/>
-            </w:pPr>
-            <w:r/>
-            <w:r>
-              <w:rPr>
-                <w:rFonts w:ascii="Times New Roman" w:hAnsi="Times New Roman"/>
-                <w:b w:val="0"/>
-                <w:sz w:val="16"/>
-              </w:rPr>
-              <w:t>0.05%</w:t>
-            </w:r>
-          </w:p>
-        </w:tc>
-      </w:tr>
-      <w:tr>
-        <w:trPr>
-          <w:cantSplit/>
-        </w:trPr>
-        <w:tc>
-          <w:tcPr>
-            <w:tcW w:type="dxa" w:w="1584"/>
-          </w:tcPr>
-          <w:p>
-            <w:pPr>
-              <w:keepNext w:val="0"/>
-              <w:jc w:val="left"/>
-            </w:pPr>
-            <w:r/>
-            <w:r>
-              <w:rPr>
-                <w:rFonts w:ascii="Times New Roman" w:hAnsi="Times New Roman"/>
-                <w:b w:val="0"/>
-                <w:sz w:val="16"/>
-              </w:rPr>
-              <w:t>Social</w:t>
-            </w:r>
-          </w:p>
-        </w:tc>
-        <w:tc>
-          <w:tcPr>
-            <w:tcW w:type="dxa" w:w="1152"/>
-          </w:tcPr>
-          <w:p>
-            <w:pPr>
-              <w:keepNext w:val="0"/>
-              <w:jc w:val="right"/>
-            </w:pPr>
-            <w:r/>
-            <w:r>
-              <w:rPr>
-                <w:rFonts w:ascii="Times New Roman" w:hAnsi="Times New Roman"/>
-                <w:b w:val="0"/>
-                <w:sz w:val="16"/>
-              </w:rPr>
-              <w:t>226,117</w:t>
-            </w:r>
-          </w:p>
-        </w:tc>
-        <w:tc>
-          <w:tcPr>
-            <w:tcW w:type="dxa" w:w="1152"/>
-          </w:tcPr>
-          <w:p>
-            <w:pPr>
-              <w:keepNext w:val="0"/>
-              <w:jc w:val="right"/>
-            </w:pPr>
-            <w:r/>
-            <w:r>
-              <w:rPr>
-                <w:rFonts w:ascii="Times New Roman" w:hAnsi="Times New Roman"/>
-                <w:b w:val="0"/>
-                <w:sz w:val="16"/>
-              </w:rPr>
-              <w:t>104</w:t>
-            </w:r>
-          </w:p>
-        </w:tc>
-        <w:tc>
-          <w:tcPr>
-            <w:tcW w:type="dxa" w:w="1008"/>
-          </w:tcPr>
-          <w:p>
-            <w:pPr>
-              <w:keepNext w:val="0"/>
-              <w:jc w:val="right"/>
-            </w:pPr>
-            <w:r/>
-            <w:r>
-              <w:rPr>
-                <w:rFonts w:ascii="Times New Roman" w:hAnsi="Times New Roman"/>
-                <w:b w:val="0"/>
-                <w:sz w:val="16"/>
-              </w:rPr>
-              <w:t>0.05%</w:t>
-            </w:r>
-          </w:p>
-        </w:tc>
-      </w:tr>
-    </w:tbl>
-    <w:p>
-      <w:pPr>
-        <w:spacing w:after="80" w:before="0" w:line="240" w:lineRule="auto"/>
-        <w:ind w:firstLine="202"/>
-        <w:jc w:val="both"/>
-      </w:pPr>
-    </w:p>
-    <w:p>
-      <w:pPr>
-        <w:spacing w:after="0" w:before="0" w:line="240" w:lineRule="auto"/>
-        <w:ind w:firstLine="202"/>
-        <w:jc w:val="both"/>
-      </w:pPr>
-      <w:r>
-        <w:rPr>
-          <w:rFonts w:ascii="Times New Roman" w:hAnsi="Times New Roman"/>
-          <w:b w:val="0"/>
-          <w:i w:val="0"/>
-          <w:smallCaps w:val="0"/>
-          <w:sz w:val="20"/>
-        </w:rPr>
-        <w:t>How often a visit ends in a sale varies a lot by channel (Table VI). Referral visits converted at 5.1%. Social brought the second-largest stream of visits, 226,117, but converted at only 0.05%. Organic Search brought the most visits and converted at 0.9%.</w:t>
-      </w:r>
-    </w:p>
-    <w:p>
-      <w:pPr>
-        <w:keepNext/>
-        <w:spacing w:after="0" w:before="120" w:line="240" w:lineRule="auto"/>
-        <w:jc w:val="center"/>
-      </w:pPr>
-      <w:r>
-        <w:rPr>
-          <w:rFonts w:ascii="Times New Roman" w:hAnsi="Times New Roman"/>
-          <w:b w:val="0"/>
-          <w:i w:val="0"/>
-          <w:smallCaps/>
-          <w:sz w:val="16"/>
-        </w:rPr>
-        <w:t>Table VII</w:t>
+        <w:t>Table IV</w:t>
       </w:r>
     </w:p>
     <w:p>
@@ -8378,7 +6263,7 @@
           <w:smallCaps w:val="0"/>
           <w:sz w:val="20"/>
         </w:rPr>
-        <w:t>Since so few journeys mix channels, the seven models give similar answers for the store as a whole (Table VII). The biggest spread is for Referral, from 39.9% to 45.5%. The disagreement sits in the 1,189 journeys that did mix channels (Fig. 3). For those, first touch gives Direct 42% of the credit and last touch gives it 1%; Referral goes the other way, from 13% to 60%. The two most common mixed paths were Direct &gt; Referral (134) and Organic Search &gt; Referral (94). For these customers, the model decides which channel looks worth paying for.</w:t>
+        <w:t>Since so few journeys mix channels, the seven models give similar answers for the store as a whole (Table IV). The biggest spread is for Referral, from 39.9% to 45.5%. The disagreement sits in the 1,189 journeys that did mix channels (Fig. 3). For those, first touch gives Direct 42% of the credit and last touch gives it 1%; Referral goes the other way, from 13% to 60%. The two most common mixed paths were Direct &gt; Referral (134) and Organic Search &gt; Referral (94). For these customers, the model decides which channel looks worth paying for.</w:t>
       </w:r>
     </w:p>
     <w:p>
@@ -8390,7 +6275,7 @@
       <w:r>
         <w:drawing>
           <wp:inline xmlns:a="http://schemas.openxmlformats.org/drawingml/2006/main" xmlns:pic="http://schemas.openxmlformats.org/drawingml/2006/picture">
-            <wp:extent cx="3200400" cy="2194560"/>
+            <wp:extent cx="3200400" cy="1920240"/>
             <wp:docPr id="3" name="Picture 3"/>
             <wp:cNvGraphicFramePr>
               <a:graphicFrameLocks noChangeAspect="1"/>
@@ -8411,7 +6296,7 @@
                   <pic:spPr>
                     <a:xfrm>
                       <a:off x="0" y="0"/>
-                      <a:ext cx="3200400" cy="2194560"/>
+                      <a:ext cx="3200400" cy="1920240"/>
                     </a:xfrm>
                     <a:prstGeom prst="rect"/>
                   </pic:spPr>
@@ -8498,7 +6383,7 @@
       <w:r>
         <w:drawing>
           <wp:inline xmlns:a="http://schemas.openxmlformats.org/drawingml/2006/main" xmlns:pic="http://schemas.openxmlformats.org/drawingml/2006/picture">
-            <wp:extent cx="3200400" cy="2103120"/>
+            <wp:extent cx="3200400" cy="1828800"/>
             <wp:docPr id="4" name="Picture 4"/>
             <wp:cNvGraphicFramePr>
               <a:graphicFrameLocks noChangeAspect="1"/>
@@ -8519,7 +6404,7 @@
                   <pic:spPr>
                     <a:xfrm>
                       <a:off x="0" y="0"/>
-                      <a:ext cx="3200400" cy="2103120"/>
+                      <a:ext cx="3200400" cy="1828800"/>
                     </a:xfrm>
                     <a:prstGeom prst="rect"/>
                   </pic:spPr>
@@ -8560,7 +6445,7 @@
           <w:smallCaps/>
           <w:sz w:val="16"/>
         </w:rPr>
-        <w:t>Table VIII</w:t>
+        <w:t>Table V</w:t>
       </w:r>
     </w:p>
     <w:p>
@@ -9462,7 +7347,7 @@
           <w:smallCaps w:val="0"/>
           <w:sz w:val="20"/>
         </w:rPr>
-        <w:t>With ads that work immediately, the smallest error belonged to last touch (4.2 pp), just ahead of time decay (4.7 pp). Once the effect carried over to later visits, the error of last touch climbed to 7.3 pp while its rank correlation slid from 0.66 to 0.37, and time decay and linear tied for the lowest error, 5.7 pp each (Fig. 4, Table VIII). On ranking the channels in the right order, Shapley value did best with immediate effects (0.69) and linear with carry-over (0.60), the Shapley value close behind both times (0.69 and 0.60). Neither scenario was kind to first touch, which had the largest error in both. The Markov model never came out on top in these worlds, so being data-driven did not by itself make it right.</w:t>
+        <w:t>With ads that work immediately, the smallest error belonged to last touch (4.2 pp), just ahead of time decay (4.7 pp). Once the effect carried over to later visits, the error of last touch climbed to 7.3 pp while its rank correlation slid from 0.66 to 0.37, and time decay and linear tied for the lowest error, 5.7 pp each (Fig. 4, Table V). On ranking the channels in the right order, Shapley value did best with immediate effects (0.69) and linear with carry-over (0.60), the Shapley value close behind both times (0.69 and 0.60). Neither scenario was kind to first touch, which had the largest error in both. The Markov model never came out on top in these worlds, so being data-driven did not by itself make it right.</w:t>
       </w:r>
     </w:p>
     <w:p>
@@ -9484,59 +7369,36 @@
     </w:p>
     <w:p>
       <w:pPr>
-        <w:keepNext/>
-        <w:spacing w:before="80"/>
-        <w:jc w:val="center"/>
+        <w:spacing w:after="0" w:before="0" w:line="240" w:lineRule="auto"/>
+        <w:ind w:firstLine="202"/>
+        <w:jc w:val="both"/>
       </w:pPr>
       <w:r>
-        <w:drawing>
-          <wp:inline xmlns:a="http://schemas.openxmlformats.org/drawingml/2006/main" xmlns:pic="http://schemas.openxmlformats.org/drawingml/2006/picture">
-            <wp:extent cx="3200400" cy="2103120"/>
-            <wp:docPr id="5" name="Picture 5"/>
-            <wp:cNvGraphicFramePr>
-              <a:graphicFrameLocks noChangeAspect="1"/>
-            </wp:cNvGraphicFramePr>
-            <a:graphic>
-              <a:graphicData uri="http://schemas.openxmlformats.org/drawingml/2006/picture">
-                <pic:pic>
-                  <pic:nvPicPr>
-                    <pic:cNvPr id="0" name="bootstrap.png"/>
-                    <pic:cNvPicPr/>
-                  </pic:nvPicPr>
-                  <pic:blipFill>
-                    <a:blip r:embed="rId13"/>
-                    <a:stretch>
-                      <a:fillRect/>
-                    </a:stretch>
-                  </pic:blipFill>
-                  <pic:spPr>
-                    <a:xfrm>
-                      <a:off x="0" y="0"/>
-                      <a:ext cx="3200400" cy="2103120"/>
-                    </a:xfrm>
-                    <a:prstGeom prst="rect"/>
-                  </pic:spPr>
-                </pic:pic>
-              </a:graphicData>
-            </a:graphic>
-          </wp:inline>
-        </w:drawing>
+        <w:rPr>
+          <w:rFonts w:ascii="Times New Roman" w:hAnsi="Times New Roman"/>
+          <w:b w:val="0"/>
+          <w:i w:val="0"/>
+          <w:smallCaps w:val="0"/>
+          <w:sz w:val="20"/>
+        </w:rPr>
+        <w:t>In the separate synthetic set where Social and Display open journeys and Email and Paid Search close them, the data-driven models picked up those roles. Under last touch Display received 6%, while Markov gave it 11%; for Email the figures were 27% and 17%. The bootstrap intervals are about one percentage point either side, far smaller than these gaps.</w:t>
       </w:r>
     </w:p>
     <w:p>
       <w:pPr>
-        <w:spacing w:after="120" w:before="0" w:line="240" w:lineRule="auto"/>
-        <w:jc w:val="both"/>
+        <w:keepNext/>
+        <w:spacing w:after="40" w:before="80" w:line="240" w:lineRule="auto"/>
+        <w:jc w:val="left"/>
       </w:pPr>
       <w:r>
         <w:rPr>
           <w:rFonts w:ascii="Times New Roman" w:hAnsi="Times New Roman"/>
           <w:b w:val="0"/>
-          <w:i w:val="0"/>
+          <w:i/>
           <w:smallCaps w:val="0"/>
-          <w:sz w:val="16"/>
-        </w:rPr>
-        <w:t>Fig. 5.  Credit under last touch and under Markov for 4,000 synthetic journeys with built-in channel roles; whiskers are 95% bootstrap intervals.</w:t>
+          <w:sz w:val="20"/>
+        </w:rPr>
+        <w:t>D. Session Behaviour Associated With Purchase (RQ2, RQ4)</w:t>
       </w:r>
     </w:p>
     <w:p>
@@ -9553,98 +7415,7 @@
           <w:smallCaps w:val="0"/>
           <w:sz w:val="20"/>
         </w:rPr>
-        <w:t>In the separate synthetic set where Social and Display open journeys and Email and Paid Search close them, the data-driven models picked up those roles (Fig. 5). Under last touch Display received 6%, while Markov gave it 11%; for Email the figures were 27% and 17%. The bootstrap intervals are about one percentage point either side, far smaller than these gaps.</w:t>
-      </w:r>
-    </w:p>
-    <w:p>
-      <w:pPr>
-        <w:keepNext/>
-        <w:spacing w:after="40" w:before="80" w:line="240" w:lineRule="auto"/>
-        <w:jc w:val="left"/>
-      </w:pPr>
-      <w:r>
-        <w:rPr>
-          <w:rFonts w:ascii="Times New Roman" w:hAnsi="Times New Roman"/>
-          <w:b w:val="0"/>
-          <w:i/>
-          <w:smallCaps w:val="0"/>
-          <w:sz w:val="20"/>
-        </w:rPr>
-        <w:t>D. Session Behaviour Associated With Purchase (RQ2, RQ4)</w:t>
-      </w:r>
-    </w:p>
-    <w:p>
-      <w:pPr>
-        <w:spacing w:after="0" w:before="0" w:line="240" w:lineRule="auto"/>
-        <w:ind w:firstLine="202"/>
-        <w:jc w:val="both"/>
-      </w:pPr>
-      <w:r>
-        <w:rPr>
-          <w:rFonts w:ascii="Times New Roman" w:hAnsi="Times New Roman"/>
-          <w:b w:val="0"/>
-          <w:i w:val="0"/>
-          <w:smallCaps w:val="0"/>
-          <w:sz w:val="20"/>
-        </w:rPr>
-        <w:t>15.6% of UCI sessions ended in a purchase. New visitors bought in 24.9% of sessions and returning visitors in 14.1%, even though returning visitors made up 85% of the traffic (chi-square p &lt; 0.001). The best month was Nov (25.5%) and the worst Feb (1.7%; Fig. 6). Weekend sessions converted slightly more often than weekday ones, 17.5% against 15.1% (chi-square p = 0.002).</w:t>
-      </w:r>
-    </w:p>
-    <w:p>
-      <w:pPr>
-        <w:keepNext/>
-        <w:spacing w:before="80"/>
-        <w:jc w:val="center"/>
-      </w:pPr>
-      <w:r>
-        <w:drawing>
-          <wp:inline xmlns:a="http://schemas.openxmlformats.org/drawingml/2006/main" xmlns:pic="http://schemas.openxmlformats.org/drawingml/2006/picture">
-            <wp:extent cx="3200400" cy="1737360"/>
-            <wp:docPr id="6" name="Picture 6"/>
-            <wp:cNvGraphicFramePr>
-              <a:graphicFrameLocks noChangeAspect="1"/>
-            </wp:cNvGraphicFramePr>
-            <a:graphic>
-              <a:graphicData uri="http://schemas.openxmlformats.org/drawingml/2006/picture">
-                <pic:pic>
-                  <pic:nvPicPr>
-                    <pic:cNvPr id="0" name="month.png"/>
-                    <pic:cNvPicPr/>
-                  </pic:nvPicPr>
-                  <pic:blipFill>
-                    <a:blip r:embed="rId14"/>
-                    <a:stretch>
-                      <a:fillRect/>
-                    </a:stretch>
-                  </pic:blipFill>
-                  <pic:spPr>
-                    <a:xfrm>
-                      <a:off x="0" y="0"/>
-                      <a:ext cx="3200400" cy="1737360"/>
-                    </a:xfrm>
-                    <a:prstGeom prst="rect"/>
-                  </pic:spPr>
-                </pic:pic>
-              </a:graphicData>
-            </a:graphic>
-          </wp:inline>
-        </w:drawing>
-      </w:r>
-    </w:p>
-    <w:p>
-      <w:pPr>
-        <w:spacing w:after="120" w:before="0" w:line="240" w:lineRule="auto"/>
-        <w:jc w:val="both"/>
-      </w:pPr>
-      <w:r>
-        <w:rPr>
-          <w:rFonts w:ascii="Times New Roman" w:hAnsi="Times New Roman"/>
-          <w:b w:val="0"/>
-          <w:i w:val="0"/>
-          <w:smallCaps w:val="0"/>
-          <w:sz w:val="16"/>
-        </w:rPr>
-        <w:t>Fig. 6.  Share of UCI sessions ending in a purchase, by month. The data has no January or April.</w:t>
+        <w:t>15.6% of UCI sessions ended in a purchase. New visitors bought in 24.9% of sessions and returning visitors in 14.1%, even though returning visitors made up 85% of the traffic (chi-square p &lt; 0.001). The best month was Nov (25.5%) and the worst Feb (1.7%). Weekend sessions converted slightly more often than weekday ones, 17.5% against 15.1% (chi-square p = 0.002).</w:t>
       </w:r>
     </w:p>
     <w:p>
@@ -9661,663 +7432,7 @@
           <w:smallCaps/>
           <w:sz w:val="16"/>
         </w:rPr>
-        <w:t>Table IX</w:t>
-      </w:r>
-    </w:p>
-    <w:p>
-      <w:pPr>
-        <w:keepNext/>
-        <w:spacing w:after="60" w:before="0" w:line="240" w:lineRule="auto"/>
-        <w:jc w:val="center"/>
-      </w:pPr>
-      <w:r>
-        <w:rPr>
-          <w:rFonts w:ascii="Times New Roman" w:hAnsi="Times New Roman"/>
-          <w:b w:val="0"/>
-          <w:i w:val="0"/>
-          <w:smallCaps/>
-          <w:sz w:val="16"/>
-        </w:rPr>
-        <w:t>How Buyers and Non-Buyers Browsed (Session Means)</w:t>
-      </w:r>
-    </w:p>
-    <w:tbl>
-      <w:tblPr>
-        <w:tblW w:type="auto" w:w="0"/>
-        <w:jc w:val="center"/>
-        <w:tblLayout w:type="fixed"/>
-        <w:tblLook w:firstColumn="1" w:firstRow="1" w:lastColumn="0" w:lastRow="0" w:noHBand="0" w:noVBand="1" w:val="04A0"/>
-        <w:tblBorders>
-          <w:top w:val="single" w:sz="8" w:color="000000"/>
-          <w:bottom w:val="single" w:sz="8" w:color="000000"/>
-          <w:insideH w:val="single" w:sz="2" w:color="000000"/>
-        </w:tblBorders>
-      </w:tblPr>
-      <w:tblGrid>
-        <w:gridCol w:w="2610"/>
-        <w:gridCol w:w="2610"/>
-        <w:gridCol w:w="2610"/>
-        <w:gridCol w:w="2610"/>
-      </w:tblGrid>
-      <w:tr>
-        <w:trPr>
-          <w:cantSplit/>
-          <w:tblHeader/>
-        </w:trPr>
-        <w:tc>
-          <w:tcPr>
-            <w:tcW w:type="dxa" w:w="2088"/>
-          </w:tcPr>
-          <w:p>
-            <w:pPr>
-              <w:keepNext/>
-              <w:jc w:val="left"/>
-            </w:pPr>
-            <w:r/>
-            <w:r>
-              <w:rPr>
-                <w:rFonts w:ascii="Times New Roman" w:hAnsi="Times New Roman"/>
-                <w:b/>
-                <w:sz w:val="16"/>
-              </w:rPr>
-              <w:t>Measure</w:t>
-            </w:r>
-          </w:p>
-        </w:tc>
-        <w:tc>
-          <w:tcPr>
-            <w:tcW w:type="dxa" w:w="936"/>
-          </w:tcPr>
-          <w:p>
-            <w:pPr>
-              <w:keepNext/>
-              <w:jc w:val="right"/>
-            </w:pPr>
-            <w:r/>
-            <w:r>
-              <w:rPr>
-                <w:rFonts w:ascii="Times New Roman" w:hAnsi="Times New Roman"/>
-                <w:b/>
-                <w:sz w:val="16"/>
-              </w:rPr>
-              <w:t>Buyers</w:t>
-            </w:r>
-          </w:p>
-        </w:tc>
-        <w:tc>
-          <w:tcPr>
-            <w:tcW w:type="dxa" w:w="1008"/>
-          </w:tcPr>
-          <w:p>
-            <w:pPr>
-              <w:keepNext/>
-              <w:jc w:val="right"/>
-            </w:pPr>
-            <w:r/>
-            <w:r>
-              <w:rPr>
-                <w:rFonts w:ascii="Times New Roman" w:hAnsi="Times New Roman"/>
-                <w:b/>
-                <w:sz w:val="16"/>
-              </w:rPr>
-              <w:t>Non-buyers</w:t>
-            </w:r>
-          </w:p>
-        </w:tc>
-        <w:tc>
-          <w:tcPr>
-            <w:tcW w:type="dxa" w:w="936"/>
-          </w:tcPr>
-          <w:p>
-            <w:pPr>
-              <w:keepNext/>
-              <w:jc w:val="right"/>
-            </w:pPr>
-            <w:r/>
-            <w:r>
-              <w:rPr>
-                <w:rFonts w:ascii="Times New Roman" w:hAnsi="Times New Roman"/>
-                <w:b/>
-                <w:sz w:val="16"/>
-              </w:rPr>
-              <w:t>p</w:t>
-            </w:r>
-          </w:p>
-        </w:tc>
-      </w:tr>
-      <w:tr>
-        <w:trPr>
-          <w:cantSplit/>
-        </w:trPr>
-        <w:tc>
-          <w:tcPr>
-            <w:tcW w:type="dxa" w:w="2088"/>
-          </w:tcPr>
-          <w:p>
-            <w:pPr>
-              <w:keepNext/>
-              <w:jc w:val="left"/>
-            </w:pPr>
-            <w:r/>
-            <w:r>
-              <w:rPr>
-                <w:rFonts w:ascii="Times New Roman" w:hAnsi="Times New Roman"/>
-                <w:b w:val="0"/>
-                <w:sz w:val="16"/>
-              </w:rPr>
-              <w:t>Product pages viewed</w:t>
-            </w:r>
-          </w:p>
-        </w:tc>
-        <w:tc>
-          <w:tcPr>
-            <w:tcW w:type="dxa" w:w="936"/>
-          </w:tcPr>
-          <w:p>
-            <w:pPr>
-              <w:keepNext/>
-              <w:jc w:val="right"/>
-            </w:pPr>
-            <w:r/>
-            <w:r>
-              <w:rPr>
-                <w:rFonts w:ascii="Times New Roman" w:hAnsi="Times New Roman"/>
-                <w:b w:val="0"/>
-                <w:sz w:val="16"/>
-              </w:rPr>
-              <w:t>48.2</w:t>
-            </w:r>
-          </w:p>
-        </w:tc>
-        <w:tc>
-          <w:tcPr>
-            <w:tcW w:type="dxa" w:w="1008"/>
-          </w:tcPr>
-          <w:p>
-            <w:pPr>
-              <w:keepNext/>
-              <w:jc w:val="right"/>
-            </w:pPr>
-            <w:r/>
-            <w:r>
-              <w:rPr>
-                <w:rFonts w:ascii="Times New Roman" w:hAnsi="Times New Roman"/>
-                <w:b w:val="0"/>
-                <w:sz w:val="16"/>
-              </w:rPr>
-              <w:t>29.1</w:t>
-            </w:r>
-          </w:p>
-        </w:tc>
-        <w:tc>
-          <w:tcPr>
-            <w:tcW w:type="dxa" w:w="936"/>
-          </w:tcPr>
-          <w:p>
-            <w:pPr>
-              <w:keepNext/>
-              <w:jc w:val="right"/>
-            </w:pPr>
-            <w:r/>
-            <w:r>
-              <w:rPr>
-                <w:rFonts w:ascii="Times New Roman" w:hAnsi="Times New Roman"/>
-                <w:b w:val="0"/>
-                <w:sz w:val="16"/>
-              </w:rPr>
-              <w:t>3.7e-102</w:t>
-            </w:r>
-          </w:p>
-        </w:tc>
-      </w:tr>
-      <w:tr>
-        <w:trPr>
-          <w:cantSplit/>
-        </w:trPr>
-        <w:tc>
-          <w:tcPr>
-            <w:tcW w:type="dxa" w:w="2088"/>
-          </w:tcPr>
-          <w:p>
-            <w:pPr>
-              <w:keepNext/>
-              <w:jc w:val="left"/>
-            </w:pPr>
-            <w:r/>
-            <w:r>
-              <w:rPr>
-                <w:rFonts w:ascii="Times New Roman" w:hAnsi="Times New Roman"/>
-                <w:b w:val="0"/>
-                <w:sz w:val="16"/>
-              </w:rPr>
-              <w:t>Time on product pages</w:t>
-            </w:r>
-          </w:p>
-        </w:tc>
-        <w:tc>
-          <w:tcPr>
-            <w:tcW w:type="dxa" w:w="936"/>
-          </w:tcPr>
-          <w:p>
-            <w:pPr>
-              <w:keepNext/>
-              <w:jc w:val="right"/>
-            </w:pPr>
-            <w:r/>
-            <w:r>
-              <w:rPr>
-                <w:rFonts w:ascii="Times New Roman" w:hAnsi="Times New Roman"/>
-                <w:b w:val="0"/>
-                <w:sz w:val="16"/>
-              </w:rPr>
-              <w:t>31.3 min</w:t>
-            </w:r>
-          </w:p>
-        </w:tc>
-        <w:tc>
-          <w:tcPr>
-            <w:tcW w:type="dxa" w:w="1008"/>
-          </w:tcPr>
-          <w:p>
-            <w:pPr>
-              <w:keepNext/>
-              <w:jc w:val="right"/>
-            </w:pPr>
-            <w:r/>
-            <w:r>
-              <w:rPr>
-                <w:rFonts w:ascii="Times New Roman" w:hAnsi="Times New Roman"/>
-                <w:b w:val="0"/>
-                <w:sz w:val="16"/>
-              </w:rPr>
-              <w:t>18.0 min</w:t>
-            </w:r>
-          </w:p>
-        </w:tc>
-        <w:tc>
-          <w:tcPr>
-            <w:tcW w:type="dxa" w:w="936"/>
-          </w:tcPr>
-          <w:p>
-            <w:pPr>
-              <w:keepNext/>
-              <w:jc w:val="right"/>
-            </w:pPr>
-            <w:r/>
-            <w:r>
-              <w:rPr>
-                <w:rFonts w:ascii="Times New Roman" w:hAnsi="Times New Roman"/>
-                <w:b w:val="0"/>
-                <w:sz w:val="16"/>
-              </w:rPr>
-              <w:t>4.2e-122</w:t>
-            </w:r>
-          </w:p>
-        </w:tc>
-      </w:tr>
-      <w:tr>
-        <w:trPr>
-          <w:cantSplit/>
-        </w:trPr>
-        <w:tc>
-          <w:tcPr>
-            <w:tcW w:type="dxa" w:w="2088"/>
-          </w:tcPr>
-          <w:p>
-            <w:pPr>
-              <w:keepNext/>
-              <w:jc w:val="left"/>
-            </w:pPr>
-            <w:r/>
-            <w:r>
-              <w:rPr>
-                <w:rFonts w:ascii="Times New Roman" w:hAnsi="Times New Roman"/>
-                <w:b w:val="0"/>
-                <w:sz w:val="16"/>
-              </w:rPr>
-              <w:t>Account/admin pages viewed</w:t>
-            </w:r>
-          </w:p>
-        </w:tc>
-        <w:tc>
-          <w:tcPr>
-            <w:tcW w:type="dxa" w:w="936"/>
-          </w:tcPr>
-          <w:p>
-            <w:pPr>
-              <w:keepNext/>
-              <w:jc w:val="right"/>
-            </w:pPr>
-            <w:r/>
-            <w:r>
-              <w:rPr>
-                <w:rFonts w:ascii="Times New Roman" w:hAnsi="Times New Roman"/>
-                <w:b w:val="0"/>
-                <w:sz w:val="16"/>
-              </w:rPr>
-              <w:t>3.4</w:t>
-            </w:r>
-          </w:p>
-        </w:tc>
-        <w:tc>
-          <w:tcPr>
-            <w:tcW w:type="dxa" w:w="1008"/>
-          </w:tcPr>
-          <w:p>
-            <w:pPr>
-              <w:keepNext/>
-              <w:jc w:val="right"/>
-            </w:pPr>
-            <w:r/>
-            <w:r>
-              <w:rPr>
-                <w:rFonts w:ascii="Times New Roman" w:hAnsi="Times New Roman"/>
-                <w:b w:val="0"/>
-                <w:sz w:val="16"/>
-              </w:rPr>
-              <w:t>2.1</w:t>
-            </w:r>
-          </w:p>
-        </w:tc>
-        <w:tc>
-          <w:tcPr>
-            <w:tcW w:type="dxa" w:w="936"/>
-          </w:tcPr>
-          <w:p>
-            <w:pPr>
-              <w:keepNext/>
-              <w:jc w:val="right"/>
-            </w:pPr>
-            <w:r/>
-            <w:r>
-              <w:rPr>
-                <w:rFonts w:ascii="Times New Roman" w:hAnsi="Times New Roman"/>
-                <w:b w:val="0"/>
-                <w:sz w:val="16"/>
-              </w:rPr>
-              <w:t>8.9e-74</w:t>
-            </w:r>
-          </w:p>
-        </w:tc>
-      </w:tr>
-      <w:tr>
-        <w:trPr>
-          <w:cantSplit/>
-        </w:trPr>
-        <w:tc>
-          <w:tcPr>
-            <w:tcW w:type="dxa" w:w="2088"/>
-          </w:tcPr>
-          <w:p>
-            <w:pPr>
-              <w:keepNext/>
-              <w:jc w:val="left"/>
-            </w:pPr>
-            <w:r/>
-            <w:r>
-              <w:rPr>
-                <w:rFonts w:ascii="Times New Roman" w:hAnsi="Times New Roman"/>
-                <w:b w:val="0"/>
-                <w:sz w:val="16"/>
-              </w:rPr>
-              <w:t>Bounce rate</w:t>
-            </w:r>
-          </w:p>
-        </w:tc>
-        <w:tc>
-          <w:tcPr>
-            <w:tcW w:type="dxa" w:w="936"/>
-          </w:tcPr>
-          <w:p>
-            <w:pPr>
-              <w:keepNext/>
-              <w:jc w:val="right"/>
-            </w:pPr>
-            <w:r/>
-            <w:r>
-              <w:rPr>
-                <w:rFonts w:ascii="Times New Roman" w:hAnsi="Times New Roman"/>
-                <w:b w:val="0"/>
-                <w:sz w:val="16"/>
-              </w:rPr>
-              <w:t>0.005</w:t>
-            </w:r>
-          </w:p>
-        </w:tc>
-        <w:tc>
-          <w:tcPr>
-            <w:tcW w:type="dxa" w:w="1008"/>
-          </w:tcPr>
-          <w:p>
-            <w:pPr>
-              <w:keepNext/>
-              <w:jc w:val="right"/>
-            </w:pPr>
-            <w:r/>
-            <w:r>
-              <w:rPr>
-                <w:rFonts w:ascii="Times New Roman" w:hAnsi="Times New Roman"/>
-                <w:b w:val="0"/>
-                <w:sz w:val="16"/>
-              </w:rPr>
-              <w:t>0.023</w:t>
-            </w:r>
-          </w:p>
-        </w:tc>
-        <w:tc>
-          <w:tcPr>
-            <w:tcW w:type="dxa" w:w="936"/>
-          </w:tcPr>
-          <w:p>
-            <w:pPr>
-              <w:keepNext/>
-              <w:jc w:val="right"/>
-            </w:pPr>
-            <w:r/>
-            <w:r>
-              <w:rPr>
-                <w:rFonts w:ascii="Times New Roman" w:hAnsi="Times New Roman"/>
-                <w:b w:val="0"/>
-                <w:sz w:val="16"/>
-              </w:rPr>
-              <w:t>1.1e-56</w:t>
-            </w:r>
-          </w:p>
-        </w:tc>
-      </w:tr>
-      <w:tr>
-        <w:trPr>
-          <w:cantSplit/>
-        </w:trPr>
-        <w:tc>
-          <w:tcPr>
-            <w:tcW w:type="dxa" w:w="2088"/>
-          </w:tcPr>
-          <w:p>
-            <w:pPr>
-              <w:keepNext/>
-              <w:jc w:val="left"/>
-            </w:pPr>
-            <w:r/>
-            <w:r>
-              <w:rPr>
-                <w:rFonts w:ascii="Times New Roman" w:hAnsi="Times New Roman"/>
-                <w:b w:val="0"/>
-                <w:sz w:val="16"/>
-              </w:rPr>
-              <w:t>Exit rate</w:t>
-            </w:r>
-          </w:p>
-        </w:tc>
-        <w:tc>
-          <w:tcPr>
-            <w:tcW w:type="dxa" w:w="936"/>
-          </w:tcPr>
-          <w:p>
-            <w:pPr>
-              <w:keepNext/>
-              <w:jc w:val="right"/>
-            </w:pPr>
-            <w:r/>
-            <w:r>
-              <w:rPr>
-                <w:rFonts w:ascii="Times New Roman" w:hAnsi="Times New Roman"/>
-                <w:b w:val="0"/>
-                <w:sz w:val="16"/>
-              </w:rPr>
-              <w:t>0.020</w:t>
-            </w:r>
-          </w:p>
-        </w:tc>
-        <w:tc>
-          <w:tcPr>
-            <w:tcW w:type="dxa" w:w="1008"/>
-          </w:tcPr>
-          <w:p>
-            <w:pPr>
-              <w:keepNext/>
-              <w:jc w:val="right"/>
-            </w:pPr>
-            <w:r/>
-            <w:r>
-              <w:rPr>
-                <w:rFonts w:ascii="Times New Roman" w:hAnsi="Times New Roman"/>
-                <w:b w:val="0"/>
-                <w:sz w:val="16"/>
-              </w:rPr>
-              <w:t>0.046</w:t>
-            </w:r>
-          </w:p>
-        </w:tc>
-        <w:tc>
-          <w:tcPr>
-            <w:tcW w:type="dxa" w:w="936"/>
-          </w:tcPr>
-          <w:p>
-            <w:pPr>
-              <w:keepNext/>
-              <w:jc w:val="right"/>
-            </w:pPr>
-            <w:r/>
-            <w:r>
-              <w:rPr>
-                <w:rFonts w:ascii="Times New Roman" w:hAnsi="Times New Roman"/>
-                <w:b w:val="0"/>
-                <w:sz w:val="16"/>
-              </w:rPr>
-              <w:t>3.0e-169</w:t>
-            </w:r>
-          </w:p>
-        </w:tc>
-      </w:tr>
-      <w:tr>
-        <w:trPr>
-          <w:cantSplit/>
-        </w:trPr>
-        <w:tc>
-          <w:tcPr>
-            <w:tcW w:type="dxa" w:w="2088"/>
-          </w:tcPr>
-          <w:p>
-            <w:pPr>
-              <w:keepNext w:val="0"/>
-              <w:jc w:val="left"/>
-            </w:pPr>
-            <w:r/>
-            <w:r>
-              <w:rPr>
-                <w:rFonts w:ascii="Times New Roman" w:hAnsi="Times New Roman"/>
-                <w:b w:val="0"/>
-                <w:sz w:val="16"/>
-              </w:rPr>
-              <w:t>Page value</w:t>
-            </w:r>
-          </w:p>
-        </w:tc>
-        <w:tc>
-          <w:tcPr>
-            <w:tcW w:type="dxa" w:w="936"/>
-          </w:tcPr>
-          <w:p>
-            <w:pPr>
-              <w:keepNext w:val="0"/>
-              <w:jc w:val="right"/>
-            </w:pPr>
-            <w:r/>
-            <w:r>
-              <w:rPr>
-                <w:rFonts w:ascii="Times New Roman" w:hAnsi="Times New Roman"/>
-                <w:b w:val="0"/>
-                <w:sz w:val="16"/>
-              </w:rPr>
-              <w:t>27.3</w:t>
-            </w:r>
-          </w:p>
-        </w:tc>
-        <w:tc>
-          <w:tcPr>
-            <w:tcW w:type="dxa" w:w="1008"/>
-          </w:tcPr>
-          <w:p>
-            <w:pPr>
-              <w:keepNext w:val="0"/>
-              <w:jc w:val="right"/>
-            </w:pPr>
-            <w:r/>
-            <w:r>
-              <w:rPr>
-                <w:rFonts w:ascii="Times New Roman" w:hAnsi="Times New Roman"/>
-                <w:b w:val="0"/>
-                <w:sz w:val="16"/>
-              </w:rPr>
-              <w:t>2.0</w:t>
-            </w:r>
-          </w:p>
-        </w:tc>
-        <w:tc>
-          <w:tcPr>
-            <w:tcW w:type="dxa" w:w="936"/>
-          </w:tcPr>
-          <w:p>
-            <w:pPr>
-              <w:keepNext w:val="0"/>
-              <w:jc w:val="right"/>
-            </w:pPr>
-            <w:r/>
-            <w:r>
-              <w:rPr>
-                <w:rFonts w:ascii="Times New Roman" w:hAnsi="Times New Roman"/>
-                <w:b w:val="0"/>
-                <w:sz w:val="16"/>
-              </w:rPr>
-              <w:t>&lt; 1e-300</w:t>
-            </w:r>
-          </w:p>
-        </w:tc>
-      </w:tr>
-    </w:tbl>
-    <w:p>
-      <w:pPr>
-        <w:spacing w:after="80" w:before="0" w:line="240" w:lineRule="auto"/>
-        <w:ind w:firstLine="202"/>
-        <w:jc w:val="both"/>
-      </w:pPr>
-    </w:p>
-    <w:p>
-      <w:pPr>
-        <w:keepNext/>
-        <w:spacing w:after="0" w:before="120" w:line="240" w:lineRule="auto"/>
-        <w:jc w:val="center"/>
-      </w:pPr>
-      <w:r>
-        <w:rPr>
-          <w:rFonts w:ascii="Times New Roman" w:hAnsi="Times New Roman"/>
-          <w:b w:val="0"/>
-          <w:i w:val="0"/>
-          <w:smallCaps/>
-          <w:sz w:val="16"/>
-        </w:rPr>
-        <w:t>Table X</w:t>
+        <w:t>Table VI</w:t>
       </w:r>
     </w:p>
     <w:p>
@@ -10637,7 +7752,7 @@
           <w:smallCaps w:val="0"/>
           <w:sz w:val="20"/>
         </w:rPr>
-        <w:t>All ten behaviour measures differed between buyers and non-buyers. A buyer typically opened 29 product pages, a non-buyer 16, and buyers bounced and left far less often (Table IX). Including PageValues lifted the random forest to an AUC of 0.932; leaving it out brought it down to 0.775, and that is the fair measure of what browsing alone tells a shop (Table X). Without PageValues, the most useful signals by permutation importance (drop in AUC) were time on product pages (0.047); exit rate (0.037); a November visit (0.032); product pages viewed (0.012); account/admin pages viewed (0.010). How long someone stays on product pages says more than how many they open.</w:t>
+        <w:t>All ten behaviour measures differed between buyers and non-buyers. A buyer typically opened 29 product pages, a non-buyer 16, spent 31 minutes on them on average against 18, and had a mean exit rate of 0.020 against 0.046 (Mann-Whitney p &lt; 0.001 for each). Including PageValues lifted the random forest to an AUC of 0.932; leaving it out brought it down to 0.775, and that is the fair measure of what browsing alone tells a shop (Table VI). Without PageValues, the most useful signals by permutation importance (drop in AUC) were time on product pages (0.047); exit rate (0.037); a November visit (0.032); product pages viewed (0.012); account/admin pages viewed (0.010). How long someone stays on product pages says more than how many they open.</w:t>
       </w:r>
     </w:p>
     <w:p>
@@ -10705,7 +7820,7 @@
           <w:smallCaps/>
           <w:sz w:val="16"/>
         </w:rPr>
-        <w:t>Table XI</w:t>
+        <w:t>Table VII</w:t>
       </w:r>
     </w:p>
     <w:p>
@@ -11090,7 +8205,7 @@
           <w:smallCaps w:val="0"/>
           <w:sz w:val="20"/>
         </w:rPr>
-        <w:t>The generative path got 25 of the 26 answerable questions right and declined 8 of the 8 it could not answer (Table XI). None of its 34 replies contained a number that is not in the fact sheet. The automatic check marked “What are the strongest early signals of a purchase?” as wrong. Reading every reply ourselves, we would not change the total: the reply to the signals question was right in substance but used a different wording from the one the check looked for (and called medians averages), while the reply on the Markov model's carry-over error, marked right, gave the correct 7.5 pp after first saying, wrongly, that the facts did not contain it. The built-in retrieval model got 18 of 26 right. It can only quote computed statements, so it never makes up a figure, but it recognised only 7 of the 8 questions outside the data; for the rest it returned the nearest related facts, which a reader could take for an answer. The two paths therefore cover each other's weak spot: the generative model is better at saying what the data cannot show, and the fallback guarantees that every number it shows was computed. The test ran on 2026-10-23 on the free Gemini tier (gemini-3.5-flash-lite, gemini-flash-lite-latest).</w:t>
+        <w:t>The generative path got 25 of the 26 answerable questions right and declined 8 of the 8 it could not answer (Table VII). None of its 34 replies contained a number that is not in the fact sheet. The automatic check marked “What are the strongest early signals of a purchase?” as wrong. Reading every reply ourselves did not change the total: that reply was right but worded differently from the phrase checked, and one reply marked right gave the correct figure only after wrongly saying the facts lacked it. The built-in retrieval model got 18 of 26 right. It can only quote computed statements, so it never makes up a figure, but it recognised only 7 of the 8 questions outside the data; for the rest it returned the nearest related facts. The two paths cover each other's weak spot: the generative model knows what the data cannot show, and the fallback only ever shows computed numbers. The test ran on 2026-10-23 on the free Gemini tier (gemini-3.5-flash-lite, gemini-flash-lite-latest).</w:t>
       </w:r>
     </w:p>
     <w:p>
@@ -11175,7 +8290,7 @@
           <w:smallCaps w:val="0"/>
           <w:sz w:val="20"/>
         </w:rPr>
-        <w:t>The GA360 store shows that the comparison does not always change the answer. Most of its buyers came back through the channel that first brought them, and for them the model barely matters. It matters a lot for the minority who switch: typically people who first arrive by typing the address or searching, then complete the purchase after following a referral link. Any business can check this for itself: if few converting journeys mix channels, last click is roughly good enough; if many do, compare the models before moving money.</w:t>
+        <w:t>The GA360 store shows that the comparison does not always change the answer: most buyers returned through the channel that first brought them, and the models only split over the minority who switched. Any business can check this for itself: if few converting journeys mix channels, last click is roughly good enough; if many do, compare the models before moving money.</w:t>
       </w:r>
     </w:p>
     <w:p>
@@ -11192,7 +8307,24 @@
           <w:smallCaps w:val="0"/>
           <w:sz w:val="20"/>
         </w:rPr>
-        <w:t>The session data points to three things a shop could try. Returning visitors make up the bulk of traffic yet buy least, so they are worth winning back. Budget is best raised in the weeks leading up to the seasonal peak. And paid traffic should land directly on product pages, where time spent is the clearest early sign of intent. These are ideas to test, not proven effects. Where the budget allows, a holdout test [7], [27] is how to confirm them.</w:t>
+        <w:t>The session data points to three things a shop could try. Returning visitors make up the bulk of traffic yet buy least, so they are worth winning back. Budget is best raised in the weeks leading up to the seasonal peak. And paid traffic should land directly on product pages, where time spent is the clearest early sign of intent. These are ideas to test, not proven effects. Where the budget allows, a holdout test [7], [26] is how to confirm them.</w:t>
+      </w:r>
+    </w:p>
+    <w:p>
+      <w:pPr>
+        <w:spacing w:after="0" w:before="0" w:line="240" w:lineRule="auto"/>
+        <w:ind w:firstLine="202"/>
+        <w:jc w:val="both"/>
+      </w:pPr>
+      <w:r>
+        <w:rPr>
+          <w:rFonts w:ascii="Times New Roman" w:hAnsi="Times New Roman"/>
+          <w:b w:val="0"/>
+          <w:i w:val="0"/>
+          <w:smallCaps w:val="0"/>
+          <w:sz w:val="20"/>
+        </w:rPr>
+        <w:t>For research, the simulation is a reminder that predicting a sale and dividing credit for it are different tasks: a model can do the first well and the second badly. Known-answer simulations test the credit directly and are cheap to extend, so we think they belong next to experimental benchmarks.</w:t>
       </w:r>
     </w:p>
     <w:p>
@@ -11209,7 +8341,7 @@
           <w:smallCaps w:val="0"/>
           <w:sz w:val="20"/>
         </w:rPr>
-        <w:t>B. Implications for Research</w:t>
+        <w:t>B. Threats to Validity</w:t>
       </w:r>
     </w:p>
     <w:p>
@@ -11222,28 +8354,118 @@
         <w:rPr>
           <w:rFonts w:ascii="Times New Roman" w:hAnsi="Times New Roman"/>
           <w:b w:val="0"/>
+          <w:i/>
+          <w:smallCaps w:val="0"/>
+          <w:sz w:val="20"/>
+        </w:rPr>
+        <w:t>Construct validity.</w:t>
+      </w:r>
+      <w:r>
+        <w:rPr>
+          <w:rFonts w:ascii="Times New Roman" w:hAnsi="Times New Roman"/>
+          <w:b w:val="0"/>
           <w:i w:val="0"/>
           <w:smallCaps w:val="0"/>
           <w:sz w:val="20"/>
         </w:rPr>
-        <w:t>Attribution models are usually ranked by how well they predict conversion. In our simulation a model could predict reasonably and still hand credit to the wrong channels, because predicting a sale and dividing credit for it are different tasks. Simulations with a known answer are simplified, but they test the credit directly and are cheap to extend, and we think they belong next to experimental benchmarks. Public journey data with named channels is still hard to find. GA360 is one of the few sources, and its relabelling of direct visits shows how much a platform's own definitions can shape the result.</w:t>
+        <w:t xml:space="preserve"> Credit is not the same as causal effect. Every model here, including the data-driven ones, shares out sales that happened; none of them says what would have happened without a channel. That is why we judge the models in a simulation whose true shares are causal by design. </w:t>
+      </w:r>
+      <w:r>
+        <w:rPr>
+          <w:rFonts w:ascii="Times New Roman" w:hAnsi="Times New Roman"/>
+          <w:b w:val="0"/>
+          <w:i/>
+          <w:smallCaps w:val="0"/>
+          <w:sz w:val="20"/>
+        </w:rPr>
+        <w:t>Internal validity.</w:t>
+      </w:r>
+      <w:r>
+        <w:rPr>
+          <w:rFonts w:ascii="Times New Roman" w:hAnsi="Times New Roman"/>
+          <w:b w:val="0"/>
+          <w:i w:val="0"/>
+          <w:smallCaps w:val="0"/>
+          <w:sz w:val="20"/>
+        </w:rPr>
+        <w:t xml:space="preserve"> The Criteo credit flag is the advertiser's own last-click decision, and the competing channels are not in the data, so the recency result describes how credit was given, not why customers bought. GA360 journeys rely on a cookie-based visitor ID and on Google's channel rules, including the relabelling of direct visits. </w:t>
+      </w:r>
+      <w:r>
+        <w:rPr>
+          <w:rFonts w:ascii="Times New Roman" w:hAnsi="Times New Roman"/>
+          <w:b w:val="0"/>
+          <w:i/>
+          <w:smallCaps w:val="0"/>
+          <w:sz w:val="20"/>
+        </w:rPr>
+        <w:t>External validity.</w:t>
+      </w:r>
+      <w:r>
+        <w:rPr>
+          <w:rFonts w:ascii="Times New Roman" w:hAnsi="Times New Roman"/>
+          <w:b w:val="0"/>
+          <w:i w:val="0"/>
+          <w:smallCaps w:val="0"/>
+          <w:sz w:val="20"/>
+        </w:rPr>
+        <w:t xml:space="preserve"> Each dataset comes from a single store, network or advertiser, mostly in mature markets. Indian small businesses may behave differently, and the tool lets them check on their own data. </w:t>
+      </w:r>
+      <w:r>
+        <w:rPr>
+          <w:rFonts w:ascii="Times New Roman" w:hAnsi="Times New Roman"/>
+          <w:b w:val="0"/>
+          <w:i/>
+          <w:smallCaps w:val="0"/>
+          <w:sz w:val="20"/>
+        </w:rPr>
+        <w:t>Statistical conclusion validity.</w:t>
+      </w:r>
+      <w:r>
+        <w:rPr>
+          <w:rFonts w:ascii="Times New Roman" w:hAnsi="Times New Roman"/>
+          <w:b w:val="0"/>
+          <w:i w:val="0"/>
+          <w:smallCaps w:val="0"/>
+          <w:sz w:val="20"/>
+        </w:rPr>
+        <w:t xml:space="preserve"> With so many rows almost any difference is significant, so we report effect sizes next to p-values. </w:t>
+      </w:r>
+      <w:r>
+        <w:rPr>
+          <w:rFonts w:ascii="Times New Roman" w:hAnsi="Times New Roman"/>
+          <w:b w:val="0"/>
+          <w:i/>
+          <w:smallCaps w:val="0"/>
+          <w:sz w:val="20"/>
+        </w:rPr>
+        <w:t>Ethics.</w:t>
+      </w:r>
+      <w:r>
+        <w:rPr>
+          <w:rFonts w:ascii="Times New Roman" w:hAnsi="Times New Roman"/>
+          <w:b w:val="0"/>
+          <w:i w:val="0"/>
+          <w:smallCaps w:val="0"/>
+          <w:sz w:val="20"/>
+        </w:rPr>
+        <w:t xml:space="preserve"> All data is public and anonymised; the tool keeps uploads in the browser and the assistant sees only the summary fact sheet.</w:t>
       </w:r>
     </w:p>
     <w:p>
       <w:pPr>
         <w:keepNext/>
-        <w:spacing w:after="40" w:before="80" w:line="240" w:lineRule="auto"/>
-        <w:jc w:val="left"/>
+        <w:spacing w:after="60" w:before="160" w:line="240" w:lineRule="auto"/>
+        <w:jc w:val="center"/>
       </w:pPr>
       <w:r>
         <w:rPr>
           <w:rFonts w:ascii="Times New Roman" w:hAnsi="Times New Roman"/>
           <w:b w:val="0"/>
-          <w:i/>
-          <w:smallCaps w:val="0"/>
+          <w:i w:val="0"/>
+          <w:smallCaps/>
           <w:sz w:val="20"/>
         </w:rPr>
-        <w:t>C. Threats to Validity</w:t>
+        <w:t>VIII. Limitations and Future Work</w:t>
       </w:r>
     </w:p>
     <w:p>
@@ -11256,98 +8478,11 @@
         <w:rPr>
           <w:rFonts w:ascii="Times New Roman" w:hAnsi="Times New Roman"/>
           <w:b w:val="0"/>
-          <w:i/>
-          <w:smallCaps w:val="0"/>
-          <w:sz w:val="20"/>
-        </w:rPr>
-        <w:t>Construct validity.</w:t>
-      </w:r>
-      <w:r>
-        <w:rPr>
-          <w:rFonts w:ascii="Times New Roman" w:hAnsi="Times New Roman"/>
-          <w:b w:val="0"/>
           <w:i w:val="0"/>
           <w:smallCaps w:val="0"/>
           <w:sz w:val="20"/>
         </w:rPr>
-        <w:t xml:space="preserve"> Credit is not the same as causal effect. Every model here, including the data-driven ones, shares out sales that happened; none of them says what would have happened without a channel. That is why we judge the models in a simulation whose true shares are causal by design. </w:t>
-      </w:r>
-      <w:r>
-        <w:rPr>
-          <w:rFonts w:ascii="Times New Roman" w:hAnsi="Times New Roman"/>
-          <w:b w:val="0"/>
-          <w:i/>
-          <w:smallCaps w:val="0"/>
-          <w:sz w:val="20"/>
-        </w:rPr>
-        <w:t>Internal validity.</w:t>
-      </w:r>
-      <w:r>
-        <w:rPr>
-          <w:rFonts w:ascii="Times New Roman" w:hAnsi="Times New Roman"/>
-          <w:b w:val="0"/>
-          <w:i w:val="0"/>
-          <w:smallCaps w:val="0"/>
-          <w:sz w:val="20"/>
-        </w:rPr>
-        <w:t xml:space="preserve"> The Criteo credit flag is the advertiser's own last-click decision, and the competing channels are not in the data, so the recency result describes how credit was given, not why customers bought. GA360 journeys rely on a cookie-based visitor ID and on Google's channel rules, including the relabelling of direct visits. </w:t>
-      </w:r>
-      <w:r>
-        <w:rPr>
-          <w:rFonts w:ascii="Times New Roman" w:hAnsi="Times New Roman"/>
-          <w:b w:val="0"/>
-          <w:i/>
-          <w:smallCaps w:val="0"/>
-          <w:sz w:val="20"/>
-        </w:rPr>
-        <w:t>External validity.</w:t>
-      </w:r>
-      <w:r>
-        <w:rPr>
-          <w:rFonts w:ascii="Times New Roman" w:hAnsi="Times New Roman"/>
-          <w:b w:val="0"/>
-          <w:i w:val="0"/>
-          <w:smallCaps w:val="0"/>
-          <w:sz w:val="20"/>
-        </w:rPr>
-        <w:t xml:space="preserve"> Each dataset comes from a single store, network or advertiser, mostly in mature markets. Indian small businesses may behave differently, and the tool lets them check on their own data. </w:t>
-      </w:r>
-      <w:r>
-        <w:rPr>
-          <w:rFonts w:ascii="Times New Roman" w:hAnsi="Times New Roman"/>
-          <w:b w:val="0"/>
-          <w:i/>
-          <w:smallCaps w:val="0"/>
-          <w:sz w:val="20"/>
-        </w:rPr>
-        <w:t>Statistical conclusion validity.</w:t>
-      </w:r>
-      <w:r>
-        <w:rPr>
-          <w:rFonts w:ascii="Times New Roman" w:hAnsi="Times New Roman"/>
-          <w:b w:val="0"/>
-          <w:i w:val="0"/>
-          <w:smallCaps w:val="0"/>
-          <w:sz w:val="20"/>
-        </w:rPr>
-        <w:t xml:space="preserve"> With hundreds of thousands of rows almost every difference is significant, so we report sizes (credit shares, odds ratios, AUC, error in percentage points) next to every p-value.</w:t>
-      </w:r>
-    </w:p>
-    <w:p>
-      <w:pPr>
-        <w:keepNext/>
-        <w:spacing w:after="40" w:before="80" w:line="240" w:lineRule="auto"/>
-        <w:jc w:val="left"/>
-      </w:pPr>
-      <w:r>
-        <w:rPr>
-          <w:rFonts w:ascii="Times New Roman" w:hAnsi="Times New Roman"/>
-          <w:b w:val="0"/>
-          <w:i/>
-          <w:smallCaps w:val="0"/>
-          <w:sz w:val="20"/>
-        </w:rPr>
-        <w:t>D. Ethics and Privacy</w:t>
+        <w:t>Everything we report is an association. The Criteo sample covers one channel and keeps only clicked impressions for buyers, which leaves the effect of ads that were seen but not clicked out of reach. In the UCI data the traffic sources are numbered codes without names. The simulation uses two simplified mechanisms with six worlds each, and others, such as diminishing returns or channels that boost each other, could favour different models. GA360 is one store, uses Google's own channel labels and splits a person who switches devices into two journeys. The assistant was tested once, on questions we wrote ourselves, and the free models behind it keep changing.</w:t>
       </w:r>
     </w:p>
     <w:p>
@@ -11364,58 +8499,7 @@
           <w:smallCaps w:val="0"/>
           <w:sz w:val="20"/>
         </w:rPr>
-        <w:t>Every dataset is public and anonymised, and we collected no personal data. ChannelTrace processes uploads in the browser and sends only the summary fact sheet, never raw rows, to the language model. The assistant is told to mark recommendations as suggestions and to say that the data shows associations rather than causes, so that people do not trust its advice more than the data allows.</w:t>
-      </w:r>
-    </w:p>
-    <w:p>
-      <w:pPr>
-        <w:keepNext/>
-        <w:spacing w:after="60" w:before="160" w:line="240" w:lineRule="auto"/>
-        <w:jc w:val="center"/>
-      </w:pPr>
-      <w:r>
-        <w:rPr>
-          <w:rFonts w:ascii="Times New Roman" w:hAnsi="Times New Roman"/>
-          <w:b w:val="0"/>
-          <w:i w:val="0"/>
-          <w:smallCaps/>
-          <w:sz w:val="20"/>
-        </w:rPr>
-        <w:t>VIII. Limitations and Future Work</w:t>
-      </w:r>
-    </w:p>
-    <w:p>
-      <w:pPr>
-        <w:spacing w:after="0" w:before="0" w:line="240" w:lineRule="auto"/>
-        <w:ind w:firstLine="202"/>
-        <w:jc w:val="both"/>
-      </w:pPr>
-      <w:r>
-        <w:rPr>
-          <w:rFonts w:ascii="Times New Roman" w:hAnsi="Times New Roman"/>
-          <w:b w:val="0"/>
-          <w:i w:val="0"/>
-          <w:smallCaps w:val="0"/>
-          <w:sz w:val="20"/>
-        </w:rPr>
-        <w:t>Everything we report is an association. The Criteo sample covers one channel and keeps only clicked impressions for buyers, which leaves the effect of ads that were seen but not clicked out of reach. In the UCI data the traffic sources are numbered codes without names. The simulation uses two simplified mechanisms with six worlds each, and others, such as diminishing returns or channels that boost each other, could favour different models. GA360 is one store, uses Google's own channel labels and splits a person who switches devices into two journeys. The assistant was tested once, on questions we wrote ourselves, and the free models behind it keep changing.</w:t>
-      </w:r>
-    </w:p>
-    <w:p>
-      <w:pPr>
-        <w:spacing w:after="0" w:before="0" w:line="240" w:lineRule="auto"/>
-        <w:ind w:firstLine="202"/>
-        <w:jc w:val="both"/>
-      </w:pPr>
-      <w:r>
-        <w:rPr>
-          <w:rFonts w:ascii="Times New Roman" w:hAnsi="Times New Roman"/>
-          <w:b w:val="0"/>
-          <w:i w:val="0"/>
-          <w:smallCaps w:val="0"/>
-          <w:sz w:val="20"/>
-        </w:rPr>
-        <w:t>We see four next steps: a usability study with small-business owners using the System Usability Scale [46]; a Power BI or Looker Studio dashboard on the same data; more simulated mechanisms and a comparison with the neural models of Section II-D [23], [25]; and, with a partner business, a holdout experiment to compare attribution credit with measured lift.</w:t>
+        <w:t>We see four next steps: a usability study with small-business owners using the System Usability Scale [45]; a Power BI or Looker Studio dashboard on the same data; more simulated mechanisms and a comparison with the neural models of Section II-D [22], [24]; and, with a partner business, a holdout experiment to compare attribution credit with measured lift.</w:t>
       </w:r>
     </w:p>
     <w:p>
@@ -12511,27 +9595,7 @@
           <w:smallCaps w:val="0"/>
           <w:sz w:val="16"/>
         </w:rPr>
-        <w:t xml:space="preserve">S. M. Lundberg and S.-I. Lee, "A unified approach to interpreting model predictions," in </w:t>
-      </w:r>
-      <w:r>
-        <w:rPr>
-          <w:rFonts w:ascii="Times New Roman" w:hAnsi="Times New Roman"/>
-          <w:b w:val="0"/>
-          <w:i/>
-          <w:smallCaps w:val="0"/>
-          <w:sz w:val="16"/>
-        </w:rPr>
-        <w:t>Advances in Neural Information Processing Systems 30</w:t>
-      </w:r>
-      <w:r>
-        <w:rPr>
-          <w:rFonts w:ascii="Times New Roman" w:hAnsi="Times New Roman"/>
-          <w:b w:val="0"/>
-          <w:i w:val="0"/>
-          <w:smallCaps w:val="0"/>
-          <w:sz w:val="16"/>
-        </w:rPr>
-        <w:t>, 2017, pp. 4765-4774.</w:t>
+        <w:t>N. Li, S. K. Arava, C. Dong, Z. Yan, and A. Pani, "Deep neural net with attention for multi-channel multi-touch attribution," arXiv:1809.02230, 2018.</w:t>
       </w:r>
     </w:p>
     <w:p>
@@ -12562,7 +9626,27 @@
           <w:smallCaps w:val="0"/>
           <w:sz w:val="16"/>
         </w:rPr>
-        <w:t>N. Li, S. K. Arava, C. Dong, Z. Yan, and A. Pani, "Deep neural net with attention for multi-channel multi-touch attribution," arXiv:1809.02230, 2018.</w:t>
+        <w:t xml:space="preserve">K. Ren, Y. Fang, W. Zhang, S. Liu, J. Li, Y. Zhang, Y. Yu, and J. Wang, "Learning multi-touch conversion attribution with dual-attention mechanisms for online advertising," in </w:t>
+      </w:r>
+      <w:r>
+        <w:rPr>
+          <w:rFonts w:ascii="Times New Roman" w:hAnsi="Times New Roman"/>
+          <w:b w:val="0"/>
+          <w:i/>
+          <w:smallCaps w:val="0"/>
+          <w:sz w:val="16"/>
+        </w:rPr>
+        <w:t>Proc. 27th ACM Int. Conf. Information and Knowledge Management (CIKM)</w:t>
+      </w:r>
+      <w:r>
+        <w:rPr>
+          <w:rFonts w:ascii="Times New Roman" w:hAnsi="Times New Roman"/>
+          <w:b w:val="0"/>
+          <w:i w:val="0"/>
+          <w:smallCaps w:val="0"/>
+          <w:sz w:val="16"/>
+        </w:rPr>
+        <w:t>, 2018, pp. 1433-1442.</w:t>
       </w:r>
     </w:p>
     <w:p>
@@ -12593,27 +9677,7 @@
           <w:smallCaps w:val="0"/>
           <w:sz w:val="16"/>
         </w:rPr>
-        <w:t xml:space="preserve">K. Ren, Y. Fang, W. Zhang, S. Liu, J. Li, Y. Zhang, Y. Yu, and J. Wang, "Learning multi-touch conversion attribution with dual-attention mechanisms for online advertising," in </w:t>
-      </w:r>
-      <w:r>
-        <w:rPr>
-          <w:rFonts w:ascii="Times New Roman" w:hAnsi="Times New Roman"/>
-          <w:b w:val="0"/>
-          <w:i/>
-          <w:smallCaps w:val="0"/>
-          <w:sz w:val="16"/>
-        </w:rPr>
-        <w:t>Proc. 27th ACM Int. Conf. Information and Knowledge Management (CIKM)</w:t>
-      </w:r>
-      <w:r>
-        <w:rPr>
-          <w:rFonts w:ascii="Times New Roman" w:hAnsi="Times New Roman"/>
-          <w:b w:val="0"/>
-          <w:i w:val="0"/>
-          <w:smallCaps w:val="0"/>
-          <w:sz w:val="16"/>
-        </w:rPr>
-        <w:t>, 2018, pp. 1433-1442.</w:t>
+        <w:t>R. Du, Y. Zhong, H. S. Nair, B. Cui, and R. Shou, "Causally driven incremental multi touch attribution using a recurrent neural network," arXiv:1902.00215, 2019.</w:t>
       </w:r>
     </w:p>
     <w:p>
@@ -12644,7 +9708,27 @@
           <w:smallCaps w:val="0"/>
           <w:sz w:val="16"/>
         </w:rPr>
-        <w:t>R. Du, Y. Zhong, H. S. Nair, B. Cui, and R. Shou, "Causally driven incremental multi touch attribution using a recurrent neural network," arXiv:1902.00215, 2019.</w:t>
+        <w:t xml:space="preserve">S. Kumar, G. Gupta, R. Prasad, A. Chatterjee, L. Vig, and G. Shroff, "CAMTA: Causal attention model for multi-touch attribution," in </w:t>
+      </w:r>
+      <w:r>
+        <w:rPr>
+          <w:rFonts w:ascii="Times New Roman" w:hAnsi="Times New Roman"/>
+          <w:b w:val="0"/>
+          <w:i/>
+          <w:smallCaps w:val="0"/>
+          <w:sz w:val="16"/>
+        </w:rPr>
+        <w:t>Proc. IEEE Int. Conf. Data Mining Workshops (ICDMW)</w:t>
+      </w:r>
+      <w:r>
+        <w:rPr>
+          <w:rFonts w:ascii="Times New Roman" w:hAnsi="Times New Roman"/>
+          <w:b w:val="0"/>
+          <w:i w:val="0"/>
+          <w:smallCaps w:val="0"/>
+          <w:sz w:val="16"/>
+        </w:rPr>
+        <w:t>, 2020, pp. 79-86.</w:t>
       </w:r>
     </w:p>
     <w:p>
@@ -12675,7 +9759,7 @@
           <w:smallCaps w:val="0"/>
           <w:sz w:val="16"/>
         </w:rPr>
-        <w:t xml:space="preserve">S. Kumar, G. Gupta, R. Prasad, A. Chatterjee, L. Vig, and G. Shroff, "CAMTA: Causal attention model for multi-touch attribution," in </w:t>
+        <w:t xml:space="preserve">T. Blake, C. Nosko, and S. Tadelis, "Consumer heterogeneity and paid search effectiveness: A large-scale field experiment," </w:t>
       </w:r>
       <w:r>
         <w:rPr>
@@ -12685,7 +9769,7 @@
           <w:smallCaps w:val="0"/>
           <w:sz w:val="16"/>
         </w:rPr>
-        <w:t>Proc. IEEE Int. Conf. Data Mining Workshops (ICDMW)</w:t>
+        <w:t>Econometrica</w:t>
       </w:r>
       <w:r>
         <w:rPr>
@@ -12695,7 +9779,7 @@
           <w:smallCaps w:val="0"/>
           <w:sz w:val="16"/>
         </w:rPr>
-        <w:t>, 2020, pp. 79-86.</w:t>
+        <w:t>, vol. 83, no. 1, pp. 155-174, 2015.</w:t>
       </w:r>
     </w:p>
     <w:p>
@@ -12726,7 +9810,7 @@
           <w:smallCaps w:val="0"/>
           <w:sz w:val="16"/>
         </w:rPr>
-        <w:t xml:space="preserve">T. Blake, C. Nosko, and S. Tadelis, "Consumer heterogeneity and paid search effectiveness: A large-scale field experiment," </w:t>
+        <w:t xml:space="preserve">G. A. Johnson, R. A. Lewis, and E. I. Nubbemeyer, "Ghost ads: Improving the economics of measuring online ad effectiveness," </w:t>
       </w:r>
       <w:r>
         <w:rPr>
@@ -12736,7 +9820,7 @@
           <w:smallCaps w:val="0"/>
           <w:sz w:val="16"/>
         </w:rPr>
-        <w:t>Econometrica</w:t>
+        <w:t>Journal of Marketing Research</w:t>
       </w:r>
       <w:r>
         <w:rPr>
@@ -12746,7 +9830,7 @@
           <w:smallCaps w:val="0"/>
           <w:sz w:val="16"/>
         </w:rPr>
-        <w:t>, vol. 83, no. 1, pp. 155-174, 2015.</w:t>
+        <w:t>, vol. 54, no. 6, pp. 867-884, 2017.</w:t>
       </w:r>
     </w:p>
     <w:p>
@@ -12777,7 +9861,7 @@
           <w:smallCaps w:val="0"/>
           <w:sz w:val="16"/>
         </w:rPr>
-        <w:t xml:space="preserve">G. A. Johnson, R. A. Lewis, and E. I. Nubbemeyer, "Ghost ads: Improving the economics of measuring online ad effectiveness," </w:t>
+        <w:t xml:space="preserve">W. W. Moe and P. S. Fader, "Dynamic conversion behavior at e-commerce sites," </w:t>
       </w:r>
       <w:r>
         <w:rPr>
@@ -12787,7 +9871,7 @@
           <w:smallCaps w:val="0"/>
           <w:sz w:val="16"/>
         </w:rPr>
-        <w:t>Journal of Marketing Research</w:t>
+        <w:t>Management Science</w:t>
       </w:r>
       <w:r>
         <w:rPr>
@@ -12797,7 +9881,7 @@
           <w:smallCaps w:val="0"/>
           <w:sz w:val="16"/>
         </w:rPr>
-        <w:t>, vol. 54, no. 6, pp. 867-884, 2017.</w:t>
+        <w:t>, vol. 50, no. 3, pp. 326-335, 2004.</w:t>
       </w:r>
     </w:p>
     <w:p>
@@ -12828,7 +9912,7 @@
           <w:smallCaps w:val="0"/>
           <w:sz w:val="16"/>
         </w:rPr>
-        <w:t xml:space="preserve">W. W. Moe and P. S. Fader, "Dynamic conversion behavior at e-commerce sites," </w:t>
+        <w:t xml:space="preserve">A. L. Montgomery, S. Li, K. Srinivasan, and J. C. Liechty, "Modeling online browsing and path analysis using clickstream data," </w:t>
       </w:r>
       <w:r>
         <w:rPr>
@@ -12838,7 +9922,7 @@
           <w:smallCaps w:val="0"/>
           <w:sz w:val="16"/>
         </w:rPr>
-        <w:t>Management Science</w:t>
+        <w:t>Marketing Science</w:t>
       </w:r>
       <w:r>
         <w:rPr>
@@ -12848,7 +9932,7 @@
           <w:smallCaps w:val="0"/>
           <w:sz w:val="16"/>
         </w:rPr>
-        <w:t>, vol. 50, no. 3, pp. 326-335, 2004.</w:t>
+        <w:t>, vol. 23, no. 4, pp. 579-595, 2004.</w:t>
       </w:r>
     </w:p>
     <w:p>
@@ -12879,7 +9963,7 @@
           <w:smallCaps w:val="0"/>
           <w:sz w:val="16"/>
         </w:rPr>
-        <w:t xml:space="preserve">A. L. Montgomery, S. Li, K. Srinivasan, and J. C. Liechty, "Modeling online browsing and path analysis using clickstream data," </w:t>
+        <w:t xml:space="preserve">R. E. Bucklin and C. Sismeiro, "Click here for Internet insight: Advances in clickstream data analysis in marketing," </w:t>
       </w:r>
       <w:r>
         <w:rPr>
@@ -12889,7 +9973,7 @@
           <w:smallCaps w:val="0"/>
           <w:sz w:val="16"/>
         </w:rPr>
-        <w:t>Marketing Science</w:t>
+        <w:t>Journal of Interactive Marketing</w:t>
       </w:r>
       <w:r>
         <w:rPr>
@@ -12899,7 +9983,7 @@
           <w:smallCaps w:val="0"/>
           <w:sz w:val="16"/>
         </w:rPr>
-        <w:t>, vol. 23, no. 4, pp. 579-595, 2004.</w:t>
+        <w:t>, vol. 23, no. 1, pp. 35-48, 2009.</w:t>
       </w:r>
     </w:p>
     <w:p>
@@ -12930,7 +10014,7 @@
           <w:smallCaps w:val="0"/>
           <w:sz w:val="16"/>
         </w:rPr>
-        <w:t xml:space="preserve">R. E. Bucklin and C. Sismeiro, "Click here for Internet insight: Advances in clickstream data analysis in marketing," </w:t>
+        <w:t xml:space="preserve">C. O. Sakar, S. O. Polat, M. Katircioglu, and Y. Kastro, "Real-time prediction of online shoppers' purchasing intention using multilayer perceptron and LSTM recurrent neural networks," </w:t>
       </w:r>
       <w:r>
         <w:rPr>
@@ -12940,7 +10024,7 @@
           <w:smallCaps w:val="0"/>
           <w:sz w:val="16"/>
         </w:rPr>
-        <w:t>Journal of Interactive Marketing</w:t>
+        <w:t>Neural Computing and Applications</w:t>
       </w:r>
       <w:r>
         <w:rPr>
@@ -12950,7 +10034,7 @@
           <w:smallCaps w:val="0"/>
           <w:sz w:val="16"/>
         </w:rPr>
-        <w:t>, vol. 23, no. 1, pp. 35-48, 2009.</w:t>
+        <w:t>, vol. 31, pp. 6893-6908, 2019.</w:t>
       </w:r>
     </w:p>
     <w:p>
@@ -12981,27 +10065,7 @@
           <w:smallCaps w:val="0"/>
           <w:sz w:val="16"/>
         </w:rPr>
-        <w:t xml:space="preserve">C. O. Sakar, S. O. Polat, M. Katircioglu, and Y. Kastro, "Real-time prediction of online shoppers' purchasing intention using multilayer perceptron and LSTM recurrent neural networks," </w:t>
-      </w:r>
-      <w:r>
-        <w:rPr>
-          <w:rFonts w:ascii="Times New Roman" w:hAnsi="Times New Roman"/>
-          <w:b w:val="0"/>
-          <w:i/>
-          <w:smallCaps w:val="0"/>
-          <w:sz w:val="16"/>
-        </w:rPr>
-        <w:t>Neural Computing and Applications</w:t>
-      </w:r>
-      <w:r>
-        <w:rPr>
-          <w:rFonts w:ascii="Times New Roman" w:hAnsi="Times New Roman"/>
-          <w:b w:val="0"/>
-          <w:i w:val="0"/>
-          <w:smallCaps w:val="0"/>
-          <w:sz w:val="16"/>
-        </w:rPr>
-        <w:t>, vol. 31, pp. 6893-6908, 2019.</w:t>
+        <w:t>Google, "BigQuery sample dataset for Google Analytics 360," Google Analytics Help. [Online]. Available: https://support.google.com/analytics/answer/7586738</w:t>
       </w:r>
     </w:p>
     <w:p>
@@ -13032,7 +10096,7 @@
           <w:smallCaps w:val="0"/>
           <w:sz w:val="16"/>
         </w:rPr>
-        <w:t>Google, "BigQuery sample dataset for Google Analytics 360," Google Analytics Help. [Online]. Available: https://support.google.com/analytics/answer/7586738</w:t>
+        <w:t>Kaggle, "Sales conversion optimization (Facebook ad campaign data)," Kaggle Datasets. [Online]. Available: https://www.kaggle.com/datasets/loveall/clicks-conversion-tracking</w:t>
       </w:r>
     </w:p>
     <w:p>
@@ -13063,7 +10127,27 @@
           <w:smallCaps w:val="0"/>
           <w:sz w:val="16"/>
         </w:rPr>
-        <w:t>Kaggle, "Sales conversion optimization (Facebook ad campaign data)," Kaggle Datasets. [Online]. Available: https://www.kaggle.com/datasets/loveall/clicks-conversion-tracking</w:t>
+        <w:t xml:space="preserve">J. R. Norris, </w:t>
+      </w:r>
+      <w:r>
+        <w:rPr>
+          <w:rFonts w:ascii="Times New Roman" w:hAnsi="Times New Roman"/>
+          <w:b w:val="0"/>
+          <w:i/>
+          <w:smallCaps w:val="0"/>
+          <w:sz w:val="16"/>
+        </w:rPr>
+        <w:t>Markov Chains</w:t>
+      </w:r>
+      <w:r>
+        <w:rPr>
+          <w:rFonts w:ascii="Times New Roman" w:hAnsi="Times New Roman"/>
+          <w:b w:val="0"/>
+          <w:i w:val="0"/>
+          <w:smallCaps w:val="0"/>
+          <w:sz w:val="16"/>
+        </w:rPr>
+        <w:t>. Cambridge, U.K.: Cambridge Univ. Press, 1997.</w:t>
       </w:r>
     </w:p>
     <w:p>
@@ -13094,7 +10178,7 @@
           <w:smallCaps w:val="0"/>
           <w:sz w:val="16"/>
         </w:rPr>
-        <w:t xml:space="preserve">J. R. Norris, </w:t>
+        <w:t xml:space="preserve">C. Spearman, "The proof and measurement of association between two things," </w:t>
       </w:r>
       <w:r>
         <w:rPr>
@@ -13104,7 +10188,7 @@
           <w:smallCaps w:val="0"/>
           <w:sz w:val="16"/>
         </w:rPr>
-        <w:t>Markov Chains</w:t>
+        <w:t>American Journal of Psychology</w:t>
       </w:r>
       <w:r>
         <w:rPr>
@@ -13114,7 +10198,7 @@
           <w:smallCaps w:val="0"/>
           <w:sz w:val="16"/>
         </w:rPr>
-        <w:t>. Cambridge, U.K.: Cambridge Univ. Press, 1997.</w:t>
+        <w:t>, vol. 15, no. 1, pp. 72-101, 1904.</w:t>
       </w:r>
     </w:p>
     <w:p>
@@ -13145,7 +10229,7 @@
           <w:smallCaps w:val="0"/>
           <w:sz w:val="16"/>
         </w:rPr>
-        <w:t xml:space="preserve">C. Spearman, "The proof and measurement of association between two things," </w:t>
+        <w:t xml:space="preserve">B. Efron and R. J. Tibshirani, </w:t>
       </w:r>
       <w:r>
         <w:rPr>
@@ -13155,7 +10239,7 @@
           <w:smallCaps w:val="0"/>
           <w:sz w:val="16"/>
         </w:rPr>
-        <w:t>American Journal of Psychology</w:t>
+        <w:t>An Introduction to the Bootstrap</w:t>
       </w:r>
       <w:r>
         <w:rPr>
@@ -13165,7 +10249,7 @@
           <w:smallCaps w:val="0"/>
           <w:sz w:val="16"/>
         </w:rPr>
-        <w:t>, vol. 15, no. 1, pp. 72-101, 1904.</w:t>
+        <w:t>. New York, NY, USA: Chapman &amp; Hall, 1993.</w:t>
       </w:r>
     </w:p>
     <w:p>
@@ -13196,7 +10280,7 @@
           <w:smallCaps w:val="0"/>
           <w:sz w:val="16"/>
         </w:rPr>
-        <w:t xml:space="preserve">B. Efron and R. J. Tibshirani, </w:t>
+        <w:t xml:space="preserve">K. Pearson, "On the criterion that a given system of deviations from the probable in the case of a correlated system of variables is such that it can be reasonably supposed to have arisen from random sampling," </w:t>
       </w:r>
       <w:r>
         <w:rPr>
@@ -13206,7 +10290,7 @@
           <w:smallCaps w:val="0"/>
           <w:sz w:val="16"/>
         </w:rPr>
-        <w:t>An Introduction to the Bootstrap</w:t>
+        <w:t>Philosophical Magazine</w:t>
       </w:r>
       <w:r>
         <w:rPr>
@@ -13216,7 +10300,7 @@
           <w:smallCaps w:val="0"/>
           <w:sz w:val="16"/>
         </w:rPr>
-        <w:t>. New York, NY, USA: Chapman &amp; Hall, 1993.</w:t>
+        <w:t>, ser. 5, vol. 50, no. 302, pp. 157-175, 1900.</w:t>
       </w:r>
     </w:p>
     <w:p>
@@ -13247,7 +10331,7 @@
           <w:smallCaps w:val="0"/>
           <w:sz w:val="16"/>
         </w:rPr>
-        <w:t xml:space="preserve">K. Pearson, "On the criterion that a given system of deviations from the probable in the case of a correlated system of variables is such that it can be reasonably supposed to have arisen from random sampling," </w:t>
+        <w:t xml:space="preserve">H. B. Mann and D. R. Whitney, "On a test of whether one of two random variables is stochastically larger than the other," </w:t>
       </w:r>
       <w:r>
         <w:rPr>
@@ -13257,7 +10341,7 @@
           <w:smallCaps w:val="0"/>
           <w:sz w:val="16"/>
         </w:rPr>
-        <w:t>Philosophical Magazine</w:t>
+        <w:t>Annals of Mathematical Statistics</w:t>
       </w:r>
       <w:r>
         <w:rPr>
@@ -13267,7 +10351,7 @@
           <w:smallCaps w:val="0"/>
           <w:sz w:val="16"/>
         </w:rPr>
-        <w:t>, ser. 5, vol. 50, no. 302, pp. 157-175, 1900.</w:t>
+        <w:t>, vol. 18, no. 1, pp. 50-60, 1947.</w:t>
       </w:r>
     </w:p>
     <w:p>
@@ -13298,7 +10382,7 @@
           <w:smallCaps w:val="0"/>
           <w:sz w:val="16"/>
         </w:rPr>
-        <w:t xml:space="preserve">H. B. Mann and D. R. Whitney, "On a test of whether one of two random variables is stochastically larger than the other," </w:t>
+        <w:t xml:space="preserve">L. Breiman, "Random forests," </w:t>
       </w:r>
       <w:r>
         <w:rPr>
@@ -13308,7 +10392,7 @@
           <w:smallCaps w:val="0"/>
           <w:sz w:val="16"/>
         </w:rPr>
-        <w:t>Annals of Mathematical Statistics</w:t>
+        <w:t>Machine Learning</w:t>
       </w:r>
       <w:r>
         <w:rPr>
@@ -13318,7 +10402,7 @@
           <w:smallCaps w:val="0"/>
           <w:sz w:val="16"/>
         </w:rPr>
-        <w:t>, vol. 18, no. 1, pp. 50-60, 1947.</w:t>
+        <w:t>, vol. 45, no. 1, pp. 5-32, 2001.</w:t>
       </w:r>
     </w:p>
     <w:p>
@@ -13349,7 +10433,7 @@
           <w:smallCaps w:val="0"/>
           <w:sz w:val="16"/>
         </w:rPr>
-        <w:t xml:space="preserve">L. Breiman, "Random forests," </w:t>
+        <w:t xml:space="preserve">J. H. Friedman, "Greedy function approximation: A gradient boosting machine," </w:t>
       </w:r>
       <w:r>
         <w:rPr>
@@ -13359,7 +10443,7 @@
           <w:smallCaps w:val="0"/>
           <w:sz w:val="16"/>
         </w:rPr>
-        <w:t>Machine Learning</w:t>
+        <w:t>Annals of Statistics</w:t>
       </w:r>
       <w:r>
         <w:rPr>
@@ -13369,7 +10453,7 @@
           <w:smallCaps w:val="0"/>
           <w:sz w:val="16"/>
         </w:rPr>
-        <w:t>, vol. 45, no. 1, pp. 5-32, 2001.</w:t>
+        <w:t>, vol. 29, no. 5, pp. 1189-1232, 2001.</w:t>
       </w:r>
     </w:p>
     <w:p>
@@ -13400,7 +10484,7 @@
           <w:smallCaps w:val="0"/>
           <w:sz w:val="16"/>
         </w:rPr>
-        <w:t xml:space="preserve">J. H. Friedman, "Greedy function approximation: A gradient boosting machine," </w:t>
+        <w:t xml:space="preserve">F. Pedregosa et al., "Scikit-learn: Machine learning in Python," </w:t>
       </w:r>
       <w:r>
         <w:rPr>
@@ -13410,7 +10494,7 @@
           <w:smallCaps w:val="0"/>
           <w:sz w:val="16"/>
         </w:rPr>
-        <w:t>Annals of Statistics</w:t>
+        <w:t>Journal of Machine Learning Research</w:t>
       </w:r>
       <w:r>
         <w:rPr>
@@ -13420,7 +10504,7 @@
           <w:smallCaps w:val="0"/>
           <w:sz w:val="16"/>
         </w:rPr>
-        <w:t>, vol. 29, no. 5, pp. 1189-1232, 2001.</w:t>
+        <w:t>, vol. 12, pp. 2825-2830, 2011.</w:t>
       </w:r>
     </w:p>
     <w:p>
@@ -13451,7 +10535,7 @@
           <w:smallCaps w:val="0"/>
           <w:sz w:val="16"/>
         </w:rPr>
-        <w:t xml:space="preserve">F. Pedregosa et al., "Scikit-learn: Machine learning in Python," </w:t>
+        <w:t xml:space="preserve">T. Fawcett, "An introduction to ROC analysis," </w:t>
       </w:r>
       <w:r>
         <w:rPr>
@@ -13461,7 +10545,7 @@
           <w:smallCaps w:val="0"/>
           <w:sz w:val="16"/>
         </w:rPr>
-        <w:t>Journal of Machine Learning Research</w:t>
+        <w:t>Pattern Recognition Letters</w:t>
       </w:r>
       <w:r>
         <w:rPr>
@@ -13471,7 +10555,7 @@
           <w:smallCaps w:val="0"/>
           <w:sz w:val="16"/>
         </w:rPr>
-        <w:t>, vol. 12, pp. 2825-2830, 2011.</w:t>
+        <w:t>, vol. 27, no. 8, pp. 861-874, 2006.</w:t>
       </w:r>
     </w:p>
     <w:p>
@@ -13502,7 +10586,7 @@
           <w:smallCaps w:val="0"/>
           <w:sz w:val="16"/>
         </w:rPr>
-        <w:t xml:space="preserve">T. Fawcett, "An introduction to ROC analysis," </w:t>
+        <w:t xml:space="preserve">P. Lewis et al., "Retrieval-augmented generation for knowledge-intensive NLP tasks," in </w:t>
       </w:r>
       <w:r>
         <w:rPr>
@@ -13512,7 +10596,7 @@
           <w:smallCaps w:val="0"/>
           <w:sz w:val="16"/>
         </w:rPr>
-        <w:t>Pattern Recognition Letters</w:t>
+        <w:t>Advances in Neural Information Processing Systems 33</w:t>
       </w:r>
       <w:r>
         <w:rPr>
@@ -13522,7 +10606,7 @@
           <w:smallCaps w:val="0"/>
           <w:sz w:val="16"/>
         </w:rPr>
-        <w:t>, vol. 27, no. 8, pp. 861-874, 2006.</w:t>
+        <w:t>, 2020, pp. 9459-9474.</w:t>
       </w:r>
     </w:p>
     <w:p>
@@ -13553,7 +10637,7 @@
           <w:smallCaps w:val="0"/>
           <w:sz w:val="16"/>
         </w:rPr>
-        <w:t xml:space="preserve">P. Lewis et al., "Retrieval-augmented generation for knowledge-intensive NLP tasks," in </w:t>
+        <w:t xml:space="preserve">Z. Ji et al., "Survey of hallucination in natural language generation," </w:t>
       </w:r>
       <w:r>
         <w:rPr>
@@ -13563,7 +10647,7 @@
           <w:smallCaps w:val="0"/>
           <w:sz w:val="16"/>
         </w:rPr>
-        <w:t>Advances in Neural Information Processing Systems 33</w:t>
+        <w:t>ACM Computing Surveys</w:t>
       </w:r>
       <w:r>
         <w:rPr>
@@ -13573,7 +10657,7 @@
           <w:smallCaps w:val="0"/>
           <w:sz w:val="16"/>
         </w:rPr>
-        <w:t>, 2020, pp. 9459-9474.</w:t>
+        <w:t>, vol. 55, no. 12, pp. 1-38, 2023.</w:t>
       </w:r>
     </w:p>
     <w:p>
@@ -13604,7 +10688,7 @@
           <w:smallCaps w:val="0"/>
           <w:sz w:val="16"/>
         </w:rPr>
-        <w:t xml:space="preserve">Z. Ji et al., "Survey of hallucination in natural language generation," </w:t>
+        <w:t xml:space="preserve">G. Salton and C. Buckley, "Term-weighting approaches in automatic text retrieval," </w:t>
       </w:r>
       <w:r>
         <w:rPr>
@@ -13614,7 +10698,7 @@
           <w:smallCaps w:val="0"/>
           <w:sz w:val="16"/>
         </w:rPr>
-        <w:t>ACM Computing Surveys</w:t>
+        <w:t>Information Processing &amp; Management</w:t>
       </w:r>
       <w:r>
         <w:rPr>
@@ -13624,7 +10708,7 @@
           <w:smallCaps w:val="0"/>
           <w:sz w:val="16"/>
         </w:rPr>
-        <w:t>, vol. 55, no. 12, pp. 1-38, 2023.</w:t>
+        <w:t>, vol. 24, no. 5, pp. 513-523, 1988.</w:t>
       </w:r>
     </w:p>
     <w:p>
@@ -13645,57 +10729,6 @@
           <w:sz w:val="16"/>
         </w:rPr>
         <w:t>[45]</w:t>
-        <w:tab/>
-      </w:r>
-      <w:r>
-        <w:rPr>
-          <w:rFonts w:ascii="Times New Roman" w:hAnsi="Times New Roman"/>
-          <w:b w:val="0"/>
-          <w:i w:val="0"/>
-          <w:smallCaps w:val="0"/>
-          <w:sz w:val="16"/>
-        </w:rPr>
-        <w:t xml:space="preserve">G. Salton and C. Buckley, "Term-weighting approaches in automatic text retrieval," </w:t>
-      </w:r>
-      <w:r>
-        <w:rPr>
-          <w:rFonts w:ascii="Times New Roman" w:hAnsi="Times New Roman"/>
-          <w:b w:val="0"/>
-          <w:i/>
-          <w:smallCaps w:val="0"/>
-          <w:sz w:val="16"/>
-        </w:rPr>
-        <w:t>Information Processing &amp; Management</w:t>
-      </w:r>
-      <w:r>
-        <w:rPr>
-          <w:rFonts w:ascii="Times New Roman" w:hAnsi="Times New Roman"/>
-          <w:b w:val="0"/>
-          <w:i w:val="0"/>
-          <w:smallCaps w:val="0"/>
-          <w:sz w:val="16"/>
-        </w:rPr>
-        <w:t>, vol. 24, no. 5, pp. 513-523, 1988.</w:t>
-      </w:r>
-    </w:p>
-    <w:p>
-      <w:pPr>
-        <w:tabs>
-          <w:tab w:pos="432" w:val="left"/>
-        </w:tabs>
-        <w:spacing w:after="40" w:before="0" w:line="240" w:lineRule="auto"/>
-        <w:ind w:left="432" w:hanging="432"/>
-        <w:jc w:val="left"/>
-      </w:pPr>
-      <w:r>
-        <w:rPr>
-          <w:rFonts w:ascii="Times New Roman" w:hAnsi="Times New Roman"/>
-          <w:b w:val="0"/>
-          <w:i w:val="0"/>
-          <w:smallCaps w:val="0"/>
-          <w:sz w:val="16"/>
-        </w:rPr>
-        <w:t>[46]</w:t>
         <w:tab/>
       </w:r>
       <w:r>

</xml_diff>